<commit_message>
docs(proposal): rapikan judul kolom tabel (hindari tanda / dan kurung)
Judul kolom Tabel 1-4 dibersihkan dari tanda garis miring dan tanda
kurung agar lebih ringkas dan konsisten:
- Metode / Pendekatan -> Pendekatan
- Karya / Judul -> Judul
- Peneliti (Tahun) -> Peneliti dan Tahun; Keterbatasan (Gap) -> Keterbatasan
- Penelitian / Implementasi -> Karya
- (Multi-sumber), (Satu Kanal), (On-premise) dilebur ke judul tanpa kurung
- Dua Kelas Ancaman (Malware & Phishing) -> Malware dan Phishing
- Hasil Verifikasi (VirusTotal) / (GSB / URLScan) dibersihkan
</commit_message>
<xml_diff>
--- a/proposal/Usulan Ide_2305551076_Ravi Arnan Irianto.docx
+++ b/proposal/Usulan Ide_2305551076_Ravi Arnan Irianto.docx
@@ -1029,7 +1029,7 @@
                 <w:i w:val="0"/>
                 <w:sz w:val="20"/>
               </w:rPr>
-              <w:t>Hasil Verifikasi (VirusTotal)</w:t>
+              <w:t>Hasil Verifikasi VirusTotal</w:t>
             </w:r>
           </w:p>
         </w:tc>
@@ -1407,7 +1407,7 @@
                 <w:i w:val="0"/>
                 <w:sz w:val="20"/>
               </w:rPr>
-              <w:t>Hasil Verifikasi (GSB / URLScan)</w:t>
+              <w:t>Hasil Verifikasi GSB dan URLScan</w:t>
             </w:r>
           </w:p>
         </w:tc>
@@ -2071,7 +2071,7 @@
                 <w:i w:val="0"/>
                 <w:sz w:val="20"/>
               </w:rPr>
-              <w:t>Peneliti (Tahun)</w:t>
+              <w:t>Peneliti dan Tahun</w:t>
             </w:r>
           </w:p>
         </w:tc>
@@ -2098,7 +2098,7 @@
                 <w:i w:val="0"/>
                 <w:sz w:val="20"/>
               </w:rPr>
-              <w:t>Karya / Judul</w:t>
+              <w:t>Judul</w:t>
             </w:r>
           </w:p>
         </w:tc>
@@ -2125,7 +2125,7 @@
                 <w:i w:val="0"/>
                 <w:sz w:val="20"/>
               </w:rPr>
-              <w:t>Metode / Pendekatan</w:t>
+              <w:t>Pendekatan</w:t>
             </w:r>
           </w:p>
         </w:tc>
@@ -2152,7 +2152,7 @@
                 <w:i w:val="0"/>
                 <w:sz w:val="20"/>
               </w:rPr>
-              <w:t>Keterbatasan (Gap)</w:t>
+              <w:t>Keterbatasan</w:t>
             </w:r>
           </w:p>
         </w:tc>
@@ -3310,7 +3310,7 @@
                 <w:i w:val="0"/>
                 <w:sz w:val="20"/>
               </w:rPr>
-              <w:t>Penelitian / Implementasi</w:t>
+              <w:t>Karya</w:t>
             </w:r>
           </w:p>
         </w:tc>
@@ -3337,7 +3337,7 @@
                 <w:i w:val="0"/>
                 <w:sz w:val="20"/>
               </w:rPr>
-              <w:t>Respons Berjenjang (Multi-sumber)</w:t>
+              <w:t>Respons Berjenjang Multi-sumber</w:t>
             </w:r>
           </w:p>
         </w:tc>
@@ -3364,7 +3364,7 @@
                 <w:i w:val="0"/>
                 <w:sz w:val="20"/>
               </w:rPr>
-              <w:t>HITL Dua Arah (Satu Kanal)</w:t>
+              <w:t>HITL Dua Arah Satu Kanal</w:t>
             </w:r>
           </w:p>
         </w:tc>
@@ -3391,7 +3391,7 @@
                 <w:i w:val="0"/>
                 <w:sz w:val="20"/>
               </w:rPr>
-              <w:t>Dua Kelas Ancaman (Malware &amp; Phishing)</w:t>
+              <w:t>Malware dan Phishing</w:t>
             </w:r>
           </w:p>
         </w:tc>
@@ -3418,7 +3418,7 @@
                 <w:i w:val="0"/>
                 <w:sz w:val="20"/>
               </w:rPr>
-              <w:t>AI Lokal (On-premise)</w:t>
+              <w:t>AI Lokal On-premise</w:t>
             </w:r>
           </w:p>
         </w:tc>

</xml_diff>

<commit_message>
docs(proposal): caption Gambar 1 & 2 jadi font 10pt (konsisten dengan tabel)
</commit_message>
<xml_diff>
--- a/proposal/Usulan Ide_2305551076_Ravi Arnan Irianto.docx
+++ b/proposal/Usulan Ide_2305551076_Ravi Arnan Irianto.docx
@@ -935,7 +935,7 @@
           <w:rFonts w:ascii="Times New Roman" w:hAnsi="Times New Roman" w:eastAsia="Times New Roman"/>
           <w:b/>
           <w:i w:val="0"/>
-          <w:sz w:val="24"/>
+          <w:sz w:val="20"/>
         </w:rPr>
         <w:t xml:space="preserve">Gambar 1 </w:t>
       </w:r>
@@ -944,7 +944,7 @@
           <w:rFonts w:ascii="Times New Roman" w:hAnsi="Times New Roman" w:eastAsia="Times New Roman"/>
           <w:b w:val="0"/>
           <w:i w:val="0"/>
-          <w:sz w:val="24"/>
+          <w:sz w:val="20"/>
         </w:rPr>
         <w:t>Arsitektur Sistem SOAR Open-Source Berbasis n8n.</w:t>
       </w:r>
@@ -1900,7 +1900,7 @@
           <w:rFonts w:ascii="Times New Roman" w:hAnsi="Times New Roman" w:eastAsia="Times New Roman"/>
           <w:b/>
           <w:i w:val="0"/>
-          <w:sz w:val="24"/>
+          <w:sz w:val="20"/>
         </w:rPr>
         <w:t xml:space="preserve">Gambar 2 </w:t>
       </w:r>
@@ -1909,7 +1909,7 @@
           <w:rFonts w:ascii="Times New Roman" w:hAnsi="Times New Roman" w:eastAsia="Times New Roman"/>
           <w:b w:val="0"/>
           <w:i w:val="0"/>
-          <w:sz w:val="24"/>
+          <w:sz w:val="20"/>
         </w:rPr>
         <w:t>Sequence Diagram Mitigasi Aktif Human-in-the-Loop.</w:t>
       </w:r>

</xml_diff>

<commit_message>
docs(proposal): ganti legenda Tabel 4 dengan paragraf penjelasan singkat
</commit_message>
<xml_diff>
--- a/proposal/Usulan Ide_2305551076_Ravi Arnan Irianto.docx
+++ b/proposal/Usulan Ide_2305551076_Ravi Arnan Irianto.docx
@@ -4947,7 +4947,13 @@
     </w:tbl>
     <w:p>
       <w:pPr>
-        <w:spacing w:line="360" w:lineRule="auto" w:before="80" w:after="240"/>
+        <w:spacing w:after="120"/>
+      </w:pPr>
+    </w:p>
+    <w:p>
+      <w:pPr>
+        <w:spacing w:line="360" w:lineRule="auto" w:before="0" w:after="0"/>
+        <w:ind w:firstLine="850"/>
         <w:jc w:val="both"/>
       </w:pPr>
       <w:r>
@@ -4955,9 +4961,9 @@
           <w:rFonts w:ascii="Times New Roman" w:hAnsi="Times New Roman" w:eastAsia="Times New Roman"/>
           <w:b w:val="0"/>
           <w:i w:val="0"/>
-          <w:sz w:val="20"/>
+          <w:sz w:val="24"/>
         </w:rPr>
-        <w:t>Keterangan: “Ya” = aspek tersedia; “Parsial” = tersedia sebagian atau dengan keterbatasan (misalnya AI berbasis cloud atau respons otomatis tanpa tingkat keyakinan multi-sumber); “Tidak” = aspek belum tersedia. Baris Usulan (2026) merupakan satu-satunya pendekatan yang memenuhi kelima aspek secara bersamaan.</w:t>
+        <w:t>Tabel 4 merupakan rangkuman posisi kebaruan usulan dibandingkan penelitian dan implementasi terdahulu pada lima aspek pembeda. Baris Usulan (2026) merupakan satu-satunya pendekatan yang memenuhi kelima aspek tersebut secara bersamaan, sedangkan pendekatan lain hanya memenuhinya sebagian atau belum sama sekali.</w:t>
       </w:r>
     </w:p>
     <w:p>

</xml_diff>

<commit_message>
docs(proposal): gabung jadi satu tabel perbandingan + kolom Proyek Saya
Ganti Tabel 3 (5 kolom) & Tabel 4 (matriks) dengan satu tabel terpadu:
Sumber, Fokus Utama, Metode, Fitur Respons dan Alert, Kesenjangan,
Proyek Saya. Kolom Proyek Saya menunjukkan kontribusi usulan yang
menutup gap tiap penelitian terdahulu (portrait, sesuai format).
</commit_message>
<xml_diff>
--- a/proposal/Usulan Ide_2305551076_Ravi Arnan Irianto.docx
+++ b/proposal/Usulan Ide_2305551076_Ravi Arnan Irianto.docx
@@ -1975,7 +1975,7 @@
           <w:i w:val="0"/>
           <w:sz w:val="24"/>
         </w:rPr>
-        <w:t>Dibandingkan penelitian maupun implementasi sejenis, kebaruan yang diusulkan bersifat integratif, yaitu menggabungkan (1) respons berjenjang berbasis keyakinan hasil verifikasi multi-sumber, (2) mitigasi aktif human-in-the-loop dua arah melalui satu kanal chat, (3) cakupan dua kelas ancaman sekaligus (malware dan phishing) dengan jenis Active Response berbeda, (4) analisis AI on-premise untuk menjaga kedaulatan data, dan (5) arsitektur multi-agent lintas distribusi Linux yang resilien terhadap perpindahan jaringan. Kombinasi kelima aspek tersebut belum ditemukan secara bersamaan pada penelitian maupun implementasi Wazuh berbasis SOAR yang ada saat ini (Thakker, More, &amp; Kumar, 2025; Nadig &amp; Vignesh, 2026; Alves, Loureiro, &amp; Pedrosa, 2026). Untuk memperjelas hal tersebut, Tabel 3 memetakan penelitian terkait beserta keterbatasan (gap) masing-masing, sedangkan Tabel 4 menegaskan posisi kebaruan usulan yang menutup celah tersebut pada kelima aspek pembeda.</w:t>
+        <w:t>Dibandingkan penelitian maupun implementasi sejenis, kebaruan yang diusulkan bersifat integratif, yaitu menggabungkan (1) respons berjenjang berbasis keyakinan hasil verifikasi multi-sumber, (2) mitigasi aktif human-in-the-loop dua arah melalui satu kanal chat, (3) cakupan dua kelas ancaman sekaligus (malware dan phishing) dengan jenis Active Response berbeda, (4) analisis AI on-premise untuk menjaga kedaulatan data, dan (5) arsitektur multi-agent lintas distribusi Linux yang resilien terhadap perpindahan jaringan. Kombinasi kelima aspek tersebut belum ditemukan secara bersamaan pada penelitian maupun implementasi Wazuh berbasis SOAR yang ada saat ini (Thakker, More, &amp; Kumar, 2025; Nadig &amp; Vignesh, 2026; Alves, Loureiro, &amp; Pedrosa, 2026). Untuk memperjelas hal tersebut, Tabel 3 merangkum penelitian dan implementasi terdahulu, kesenjangan (gap) masing-masing, serta kontribusi yang ditawarkan proyek ini untuk menutup setiap kesenjangan tersebut.</w:t>
       </w:r>
     </w:p>
     <w:p>
@@ -1999,7 +1999,7 @@
           <w:i w:val="0"/>
           <w:sz w:val="20"/>
         </w:rPr>
-        <w:t>Penelitian Terkait dan Keterbatasannya (Gap).</w:t>
+        <w:t>Perbandingan Penelitian Terdahulu, Kesenjangan, dan Kontribusi Proyek.</w:t>
       </w:r>
     </w:p>
     <w:tbl>
@@ -2010,11 +2010,12 @@
         <w:tblLook w:firstColumn="1" w:firstRow="1" w:lastColumn="0" w:lastRow="0" w:noHBand="0" w:noVBand="1" w:val="04A0"/>
       </w:tblPr>
       <w:tblGrid>
-        <w:gridCol w:w="576"/>
-        <w:gridCol w:w="1440"/>
-        <w:gridCol w:w="2160"/>
-        <w:gridCol w:w="1872"/>
-        <w:gridCol w:w="2217"/>
+        <w:gridCol w:w="1584"/>
+        <w:gridCol w:w="1267"/>
+        <w:gridCol w:w="1267"/>
+        <w:gridCol w:w="1324"/>
+        <w:gridCol w:w="1353"/>
+        <w:gridCol w:w="1468"/>
       </w:tblGrid>
       <w:tr>
         <w:trPr>
@@ -2023,7 +2024,7 @@
         </w:trPr>
         <w:tc>
           <w:tcPr>
-            <w:tcW w:type="dxa" w:w="576"/>
+            <w:tcW w:type="dxa" w:w="1584"/>
             <w:tcBorders>
               <w:top w:sz="4" w:val="single" w:color="000000"/>
               <w:left w:sz="4" w:val="single" w:color="000000"/>
@@ -2044,1273 +2045,7 @@
                 <w:i w:val="0"/>
                 <w:sz w:val="20"/>
               </w:rPr>
-              <w:t>No</w:t>
-            </w:r>
-          </w:p>
-        </w:tc>
-        <w:tc>
-          <w:tcPr>
-            <w:tcW w:type="dxa" w:w="1440"/>
-            <w:tcBorders>
-              <w:top w:sz="4" w:val="single" w:color="000000"/>
-              <w:left w:sz="4" w:val="single" w:color="000000"/>
-              <w:bottom w:sz="4" w:val="single" w:color="000000"/>
-              <w:right w:sz="4" w:val="single" w:color="000000"/>
-            </w:tcBorders>
-          </w:tcPr>
-          <w:p>
-            <w:pPr>
-              <w:spacing w:line="360" w:lineRule="auto" w:before="0" w:after="0"/>
-              <w:jc w:val="center"/>
-            </w:pPr>
-            <w:r/>
-            <w:r>
-              <w:rPr>
-                <w:rFonts w:ascii="Times New Roman" w:hAnsi="Times New Roman" w:eastAsia="Times New Roman"/>
-                <w:b/>
-                <w:i w:val="0"/>
-                <w:sz w:val="20"/>
-              </w:rPr>
-              <w:t>Peneliti dan Tahun</w:t>
-            </w:r>
-          </w:p>
-        </w:tc>
-        <w:tc>
-          <w:tcPr>
-            <w:tcW w:type="dxa" w:w="2160"/>
-            <w:tcBorders>
-              <w:top w:sz="4" w:val="single" w:color="000000"/>
-              <w:left w:sz="4" w:val="single" w:color="000000"/>
-              <w:bottom w:sz="4" w:val="single" w:color="000000"/>
-              <w:right w:sz="4" w:val="single" w:color="000000"/>
-            </w:tcBorders>
-          </w:tcPr>
-          <w:p>
-            <w:pPr>
-              <w:spacing w:line="360" w:lineRule="auto" w:before="0" w:after="0"/>
-              <w:jc w:val="center"/>
-            </w:pPr>
-            <w:r/>
-            <w:r>
-              <w:rPr>
-                <w:rFonts w:ascii="Times New Roman" w:hAnsi="Times New Roman" w:eastAsia="Times New Roman"/>
-                <w:b/>
-                <w:i w:val="0"/>
-                <w:sz w:val="20"/>
-              </w:rPr>
-              <w:t>Judul</w:t>
-            </w:r>
-          </w:p>
-        </w:tc>
-        <w:tc>
-          <w:tcPr>
-            <w:tcW w:type="dxa" w:w="1872"/>
-            <w:tcBorders>
-              <w:top w:sz="4" w:val="single" w:color="000000"/>
-              <w:left w:sz="4" w:val="single" w:color="000000"/>
-              <w:bottom w:sz="4" w:val="single" w:color="000000"/>
-              <w:right w:sz="4" w:val="single" w:color="000000"/>
-            </w:tcBorders>
-          </w:tcPr>
-          <w:p>
-            <w:pPr>
-              <w:spacing w:line="360" w:lineRule="auto" w:before="0" w:after="0"/>
-              <w:jc w:val="center"/>
-            </w:pPr>
-            <w:r/>
-            <w:r>
-              <w:rPr>
-                <w:rFonts w:ascii="Times New Roman" w:hAnsi="Times New Roman" w:eastAsia="Times New Roman"/>
-                <w:b/>
-                <w:i w:val="0"/>
-                <w:sz w:val="20"/>
-              </w:rPr>
-              <w:t>Pendekatan</w:t>
-            </w:r>
-          </w:p>
-        </w:tc>
-        <w:tc>
-          <w:tcPr>
-            <w:tcW w:type="dxa" w:w="2218"/>
-            <w:tcBorders>
-              <w:top w:sz="4" w:val="single" w:color="000000"/>
-              <w:left w:sz="4" w:val="single" w:color="000000"/>
-              <w:bottom w:sz="4" w:val="single" w:color="000000"/>
-              <w:right w:sz="4" w:val="single" w:color="000000"/>
-            </w:tcBorders>
-          </w:tcPr>
-          <w:p>
-            <w:pPr>
-              <w:spacing w:line="360" w:lineRule="auto" w:before="0" w:after="0"/>
-              <w:jc w:val="center"/>
-            </w:pPr>
-            <w:r/>
-            <w:r>
-              <w:rPr>
-                <w:rFonts w:ascii="Times New Roman" w:hAnsi="Times New Roman" w:eastAsia="Times New Roman"/>
-                <w:b/>
-                <w:i w:val="0"/>
-                <w:sz w:val="20"/>
-              </w:rPr>
-              <w:t>Keterbatasan</w:t>
-            </w:r>
-          </w:p>
-        </w:tc>
-      </w:tr>
-      <w:tr>
-        <w:trPr>
-          <w:cantSplit/>
-        </w:trPr>
-        <w:tc>
-          <w:tcPr>
-            <w:tcW w:type="dxa" w:w="576"/>
-            <w:tcBorders>
-              <w:top w:sz="4" w:val="single" w:color="000000"/>
-              <w:left w:sz="4" w:val="single" w:color="000000"/>
-              <w:bottom w:sz="4" w:val="single" w:color="000000"/>
-              <w:right w:sz="4" w:val="single" w:color="000000"/>
-            </w:tcBorders>
-          </w:tcPr>
-          <w:p>
-            <w:pPr>
-              <w:spacing w:line="360" w:lineRule="auto" w:before="0" w:after="0"/>
-            </w:pPr>
-            <w:r/>
-            <w:r>
-              <w:rPr>
-                <w:rFonts w:ascii="Times New Roman" w:hAnsi="Times New Roman" w:eastAsia="Times New Roman"/>
-                <w:b w:val="0"/>
-                <w:i w:val="0"/>
-                <w:sz w:val="20"/>
-              </w:rPr>
-              <w:t>1</w:t>
-            </w:r>
-          </w:p>
-        </w:tc>
-        <w:tc>
-          <w:tcPr>
-            <w:tcW w:type="dxa" w:w="1440"/>
-            <w:tcBorders>
-              <w:top w:sz="4" w:val="single" w:color="000000"/>
-              <w:left w:sz="4" w:val="single" w:color="000000"/>
-              <w:bottom w:sz="4" w:val="single" w:color="000000"/>
-              <w:right w:sz="4" w:val="single" w:color="000000"/>
-            </w:tcBorders>
-          </w:tcPr>
-          <w:p>
-            <w:pPr>
-              <w:spacing w:line="360" w:lineRule="auto" w:before="0" w:after="0"/>
-            </w:pPr>
-            <w:r/>
-            <w:r>
-              <w:rPr>
-                <w:rFonts w:ascii="Times New Roman" w:hAnsi="Times New Roman" w:eastAsia="Times New Roman"/>
-                <w:b w:val="0"/>
-                <w:i w:val="0"/>
-                <w:sz w:val="20"/>
-              </w:rPr>
-              <w:t>Thakker dkk. (2025)</w:t>
-            </w:r>
-          </w:p>
-        </w:tc>
-        <w:tc>
-          <w:tcPr>
-            <w:tcW w:type="dxa" w:w="2160"/>
-            <w:tcBorders>
-              <w:top w:sz="4" w:val="single" w:color="000000"/>
-              <w:left w:sz="4" w:val="single" w:color="000000"/>
-              <w:bottom w:sz="4" w:val="single" w:color="000000"/>
-              <w:right w:sz="4" w:val="single" w:color="000000"/>
-            </w:tcBorders>
-          </w:tcPr>
-          <w:p>
-            <w:pPr>
-              <w:spacing w:line="360" w:lineRule="auto" w:before="0" w:after="0"/>
-            </w:pPr>
-            <w:r/>
-            <w:r>
-              <w:rPr>
-                <w:rFonts w:ascii="Times New Roman" w:hAnsi="Times New Roman" w:eastAsia="Times New Roman"/>
-                <w:b w:val="0"/>
-                <w:i w:val="0"/>
-                <w:sz w:val="20"/>
-              </w:rPr>
-              <w:t>Pertahanan otomatis terhadap serangan application-layer pada sistem Windows</w:t>
-            </w:r>
-          </w:p>
-        </w:tc>
-        <w:tc>
-          <w:tcPr>
-            <w:tcW w:type="dxa" w:w="1872"/>
-            <w:tcBorders>
-              <w:top w:sz="4" w:val="single" w:color="000000"/>
-              <w:left w:sz="4" w:val="single" w:color="000000"/>
-              <w:bottom w:sz="4" w:val="single" w:color="000000"/>
-              <w:right w:sz="4" w:val="single" w:color="000000"/>
-            </w:tcBorders>
-          </w:tcPr>
-          <w:p>
-            <w:pPr>
-              <w:spacing w:line="360" w:lineRule="auto" w:before="0" w:after="0"/>
-            </w:pPr>
-            <w:r/>
-            <w:r>
-              <w:rPr>
-                <w:rFonts w:ascii="Times New Roman" w:hAnsi="Times New Roman" w:eastAsia="Times New Roman"/>
-                <w:b w:val="0"/>
-                <w:i w:val="0"/>
-                <w:sz w:val="20"/>
-              </w:rPr>
-              <w:t>Integrasi Wazuh + Shuffle; pemblokiran otomatis</w:t>
-            </w:r>
-          </w:p>
-        </w:tc>
-        <w:tc>
-          <w:tcPr>
-            <w:tcW w:type="dxa" w:w="2218"/>
-            <w:tcBorders>
-              <w:top w:sz="4" w:val="single" w:color="000000"/>
-              <w:left w:sz="4" w:val="single" w:color="000000"/>
-              <w:bottom w:sz="4" w:val="single" w:color="000000"/>
-              <w:right w:sz="4" w:val="single" w:color="000000"/>
-            </w:tcBorders>
-          </w:tcPr>
-          <w:p>
-            <w:pPr>
-              <w:spacing w:line="360" w:lineRule="auto" w:before="0" w:after="0"/>
-            </w:pPr>
-            <w:r/>
-            <w:r>
-              <w:rPr>
-                <w:rFonts w:ascii="Times New Roman" w:hAnsi="Times New Roman" w:eastAsia="Times New Roman"/>
-                <w:b w:val="0"/>
-                <w:i w:val="0"/>
-                <w:sz w:val="20"/>
-              </w:rPr>
-              <w:t>Otomatisasi penuh tanpa human-in-the-loop (false-positive dieksekusi “buta”); satu kelas ancaman; tanpa AI lokal</w:t>
-            </w:r>
-          </w:p>
-        </w:tc>
-      </w:tr>
-      <w:tr>
-        <w:trPr>
-          <w:cantSplit/>
-        </w:trPr>
-        <w:tc>
-          <w:tcPr>
-            <w:tcW w:type="dxa" w:w="576"/>
-            <w:tcBorders>
-              <w:top w:sz="4" w:val="single" w:color="000000"/>
-              <w:left w:sz="4" w:val="single" w:color="000000"/>
-              <w:bottom w:sz="4" w:val="single" w:color="000000"/>
-              <w:right w:sz="4" w:val="single" w:color="000000"/>
-            </w:tcBorders>
-          </w:tcPr>
-          <w:p>
-            <w:pPr>
-              <w:spacing w:line="360" w:lineRule="auto" w:before="0" w:after="0"/>
-            </w:pPr>
-            <w:r/>
-            <w:r>
-              <w:rPr>
-                <w:rFonts w:ascii="Times New Roman" w:hAnsi="Times New Roman" w:eastAsia="Times New Roman"/>
-                <w:b w:val="0"/>
-                <w:i w:val="0"/>
-                <w:sz w:val="20"/>
-              </w:rPr>
-              <w:t>2</w:t>
-            </w:r>
-          </w:p>
-        </w:tc>
-        <w:tc>
-          <w:tcPr>
-            <w:tcW w:type="dxa" w:w="1440"/>
-            <w:tcBorders>
-              <w:top w:sz="4" w:val="single" w:color="000000"/>
-              <w:left w:sz="4" w:val="single" w:color="000000"/>
-              <w:bottom w:sz="4" w:val="single" w:color="000000"/>
-              <w:right w:sz="4" w:val="single" w:color="000000"/>
-            </w:tcBorders>
-          </w:tcPr>
-          <w:p>
-            <w:pPr>
-              <w:spacing w:line="360" w:lineRule="auto" w:before="0" w:after="0"/>
-            </w:pPr>
-            <w:r/>
-            <w:r>
-              <w:rPr>
-                <w:rFonts w:ascii="Times New Roman" w:hAnsi="Times New Roman" w:eastAsia="Times New Roman"/>
-                <w:b w:val="0"/>
-                <w:i w:val="0"/>
-                <w:sz w:val="20"/>
-              </w:rPr>
-              <w:t>Farrel (2024)</w:t>
-            </w:r>
-          </w:p>
-        </w:tc>
-        <w:tc>
-          <w:tcPr>
-            <w:tcW w:type="dxa" w:w="2160"/>
-            <w:tcBorders>
-              <w:top w:sz="4" w:val="single" w:color="000000"/>
-              <w:left w:sz="4" w:val="single" w:color="000000"/>
-              <w:bottom w:sz="4" w:val="single" w:color="000000"/>
-              <w:right w:sz="4" w:val="single" w:color="000000"/>
-            </w:tcBorders>
-          </w:tcPr>
-          <w:p>
-            <w:pPr>
-              <w:spacing w:line="360" w:lineRule="auto" w:before="0" w:after="0"/>
-            </w:pPr>
-            <w:r/>
-            <w:r>
-              <w:rPr>
-                <w:rFonts w:ascii="Times New Roman" w:hAnsi="Times New Roman" w:eastAsia="Times New Roman"/>
-                <w:b w:val="0"/>
-                <w:i w:val="0"/>
-                <w:sz w:val="20"/>
-              </w:rPr>
-              <w:t>SIEM Wazuh dengan Active Response dan notifikasi Telegram untuk mitigasi brute force</w:t>
-            </w:r>
-          </w:p>
-        </w:tc>
-        <w:tc>
-          <w:tcPr>
-            <w:tcW w:type="dxa" w:w="1872"/>
-            <w:tcBorders>
-              <w:top w:sz="4" w:val="single" w:color="000000"/>
-              <w:left w:sz="4" w:val="single" w:color="000000"/>
-              <w:bottom w:sz="4" w:val="single" w:color="000000"/>
-              <w:right w:sz="4" w:val="single" w:color="000000"/>
-            </w:tcBorders>
-          </w:tcPr>
-          <w:p>
-            <w:pPr>
-              <w:spacing w:line="360" w:lineRule="auto" w:before="0" w:after="0"/>
-            </w:pPr>
-            <w:r/>
-            <w:r>
-              <w:rPr>
-                <w:rFonts w:ascii="Times New Roman" w:hAnsi="Times New Roman" w:eastAsia="Times New Roman"/>
-                <w:b w:val="0"/>
-                <w:i w:val="0"/>
-                <w:sz w:val="20"/>
-              </w:rPr>
-              <w:t>Wazuh Active Response + notifikasi Telegram (satu arah)</w:t>
-            </w:r>
-          </w:p>
-        </w:tc>
-        <w:tc>
-          <w:tcPr>
-            <w:tcW w:type="dxa" w:w="2218"/>
-            <w:tcBorders>
-              <w:top w:sz="4" w:val="single" w:color="000000"/>
-              <w:left w:sz="4" w:val="single" w:color="000000"/>
-              <w:bottom w:sz="4" w:val="single" w:color="000000"/>
-              <w:right w:sz="4" w:val="single" w:color="000000"/>
-            </w:tcBorders>
-          </w:tcPr>
-          <w:p>
-            <w:pPr>
-              <w:spacing w:line="360" w:lineRule="auto" w:before="0" w:after="0"/>
-            </w:pPr>
-            <w:r/>
-            <w:r>
-              <w:rPr>
-                <w:rFonts w:ascii="Times New Roman" w:hAnsi="Times New Roman" w:eastAsia="Times New Roman"/>
-                <w:b w:val="0"/>
-                <w:i w:val="0"/>
-                <w:sz w:val="20"/>
-              </w:rPr>
-              <w:t>Notifikasi satu arah sehingga analis harus pindah ke dasbor; mitigasi otomatis; hanya serangan brute force</w:t>
-            </w:r>
-          </w:p>
-        </w:tc>
-      </w:tr>
-      <w:tr>
-        <w:trPr>
-          <w:cantSplit/>
-        </w:trPr>
-        <w:tc>
-          <w:tcPr>
-            <w:tcW w:type="dxa" w:w="576"/>
-            <w:tcBorders>
-              <w:top w:sz="4" w:val="single" w:color="000000"/>
-              <w:left w:sz="4" w:val="single" w:color="000000"/>
-              <w:bottom w:sz="4" w:val="single" w:color="000000"/>
-              <w:right w:sz="4" w:val="single" w:color="000000"/>
-            </w:tcBorders>
-          </w:tcPr>
-          <w:p>
-            <w:pPr>
-              <w:spacing w:line="360" w:lineRule="auto" w:before="0" w:after="0"/>
-            </w:pPr>
-            <w:r/>
-            <w:r>
-              <w:rPr>
-                <w:rFonts w:ascii="Times New Roman" w:hAnsi="Times New Roman" w:eastAsia="Times New Roman"/>
-                <w:b w:val="0"/>
-                <w:i w:val="0"/>
-                <w:sz w:val="20"/>
-              </w:rPr>
-              <w:t>3</w:t>
-            </w:r>
-          </w:p>
-        </w:tc>
-        <w:tc>
-          <w:tcPr>
-            <w:tcW w:type="dxa" w:w="1440"/>
-            <w:tcBorders>
-              <w:top w:sz="4" w:val="single" w:color="000000"/>
-              <w:left w:sz="4" w:val="single" w:color="000000"/>
-              <w:bottom w:sz="4" w:val="single" w:color="000000"/>
-              <w:right w:sz="4" w:val="single" w:color="000000"/>
-            </w:tcBorders>
-          </w:tcPr>
-          <w:p>
-            <w:pPr>
-              <w:spacing w:line="360" w:lineRule="auto" w:before="0" w:after="0"/>
-            </w:pPr>
-            <w:r/>
-            <w:r>
-              <w:rPr>
-                <w:rFonts w:ascii="Times New Roman" w:hAnsi="Times New Roman" w:eastAsia="Times New Roman"/>
-                <w:b w:val="0"/>
-                <w:i w:val="0"/>
-                <w:sz w:val="20"/>
-              </w:rPr>
-              <w:t>Sarker (2025)</w:t>
-            </w:r>
-          </w:p>
-        </w:tc>
-        <w:tc>
-          <w:tcPr>
-            <w:tcW w:type="dxa" w:w="2160"/>
-            <w:tcBorders>
-              <w:top w:sz="4" w:val="single" w:color="000000"/>
-              <w:left w:sz="4" w:val="single" w:color="000000"/>
-              <w:bottom w:sz="4" w:val="single" w:color="000000"/>
-              <w:right w:sz="4" w:val="single" w:color="000000"/>
-            </w:tcBorders>
-          </w:tcPr>
-          <w:p>
-            <w:pPr>
-              <w:spacing w:line="360" w:lineRule="auto" w:before="0" w:after="0"/>
-            </w:pPr>
-            <w:r/>
-            <w:r>
-              <w:rPr>
-                <w:rFonts w:ascii="Times New Roman" w:hAnsi="Times New Roman" w:eastAsia="Times New Roman"/>
-                <w:b w:val="0"/>
-                <w:i w:val="0"/>
-                <w:sz w:val="20"/>
-              </w:rPr>
-              <w:t>Otomasi SOC: integrasi Wazuh, n8n, VirusTotal, dan Gmail untuk deteksi file berbahaya</w:t>
-            </w:r>
-          </w:p>
-        </w:tc>
-        <w:tc>
-          <w:tcPr>
-            <w:tcW w:type="dxa" w:w="1872"/>
-            <w:tcBorders>
-              <w:top w:sz="4" w:val="single" w:color="000000"/>
-              <w:left w:sz="4" w:val="single" w:color="000000"/>
-              <w:bottom w:sz="4" w:val="single" w:color="000000"/>
-              <w:right w:sz="4" w:val="single" w:color="000000"/>
-            </w:tcBorders>
-          </w:tcPr>
-          <w:p>
-            <w:pPr>
-              <w:spacing w:line="360" w:lineRule="auto" w:before="0" w:after="0"/>
-            </w:pPr>
-            <w:r/>
-            <w:r>
-              <w:rPr>
-                <w:rFonts w:ascii="Times New Roman" w:hAnsi="Times New Roman" w:eastAsia="Times New Roman"/>
-                <w:b w:val="0"/>
-                <w:i w:val="0"/>
-                <w:sz w:val="20"/>
-              </w:rPr>
-              <w:t>Orkestrasi n8n + VirusTotal + notifikasi Gmail</w:t>
-            </w:r>
-          </w:p>
-        </w:tc>
-        <w:tc>
-          <w:tcPr>
-            <w:tcW w:type="dxa" w:w="2218"/>
-            <w:tcBorders>
-              <w:top w:sz="4" w:val="single" w:color="000000"/>
-              <w:left w:sz="4" w:val="single" w:color="000000"/>
-              <w:bottom w:sz="4" w:val="single" w:color="000000"/>
-              <w:right w:sz="4" w:val="single" w:color="000000"/>
-            </w:tcBorders>
-          </w:tcPr>
-          <w:p>
-            <w:pPr>
-              <w:spacing w:line="360" w:lineRule="auto" w:before="0" w:after="0"/>
-            </w:pPr>
-            <w:r/>
-            <w:r>
-              <w:rPr>
-                <w:rFonts w:ascii="Times New Roman" w:hAnsi="Times New Roman" w:eastAsia="Times New Roman"/>
-                <w:b w:val="0"/>
-                <w:i w:val="0"/>
-                <w:sz w:val="20"/>
-              </w:rPr>
-              <w:t>Notifikasi satu arah (email) tanpa kanal keputusan interaktif; fokus malware saja; tanpa AI lokal</w:t>
-            </w:r>
-          </w:p>
-        </w:tc>
-      </w:tr>
-      <w:tr>
-        <w:trPr>
-          <w:cantSplit/>
-        </w:trPr>
-        <w:tc>
-          <w:tcPr>
-            <w:tcW w:type="dxa" w:w="576"/>
-            <w:tcBorders>
-              <w:top w:sz="4" w:val="single" w:color="000000"/>
-              <w:left w:sz="4" w:val="single" w:color="000000"/>
-              <w:bottom w:sz="4" w:val="single" w:color="000000"/>
-              <w:right w:sz="4" w:val="single" w:color="000000"/>
-            </w:tcBorders>
-          </w:tcPr>
-          <w:p>
-            <w:pPr>
-              <w:spacing w:line="360" w:lineRule="auto" w:before="0" w:after="0"/>
-            </w:pPr>
-            <w:r/>
-            <w:r>
-              <w:rPr>
-                <w:rFonts w:ascii="Times New Roman" w:hAnsi="Times New Roman" w:eastAsia="Times New Roman"/>
-                <w:b w:val="0"/>
-                <w:i w:val="0"/>
-                <w:sz w:val="20"/>
-              </w:rPr>
-              <w:t>4</w:t>
-            </w:r>
-          </w:p>
-        </w:tc>
-        <w:tc>
-          <w:tcPr>
-            <w:tcW w:type="dxa" w:w="1440"/>
-            <w:tcBorders>
-              <w:top w:sz="4" w:val="single" w:color="000000"/>
-              <w:left w:sz="4" w:val="single" w:color="000000"/>
-              <w:bottom w:sz="4" w:val="single" w:color="000000"/>
-              <w:right w:sz="4" w:val="single" w:color="000000"/>
-            </w:tcBorders>
-          </w:tcPr>
-          <w:p>
-            <w:pPr>
-              <w:spacing w:line="360" w:lineRule="auto" w:before="0" w:after="0"/>
-            </w:pPr>
-            <w:r/>
-            <w:r>
-              <w:rPr>
-                <w:rFonts w:ascii="Times New Roman" w:hAnsi="Times New Roman" w:eastAsia="Times New Roman"/>
-                <w:b w:val="0"/>
-                <w:i w:val="0"/>
-                <w:sz w:val="20"/>
-              </w:rPr>
-              <w:t>n8n (n.d.)</w:t>
-            </w:r>
-          </w:p>
-        </w:tc>
-        <w:tc>
-          <w:tcPr>
-            <w:tcW w:type="dxa" w:w="2160"/>
-            <w:tcBorders>
-              <w:top w:sz="4" w:val="single" w:color="000000"/>
-              <w:left w:sz="4" w:val="single" w:color="000000"/>
-              <w:bottom w:sz="4" w:val="single" w:color="000000"/>
-              <w:right w:sz="4" w:val="single" w:color="000000"/>
-            </w:tcBorders>
-          </w:tcPr>
-          <w:p>
-            <w:pPr>
-              <w:spacing w:line="360" w:lineRule="auto" w:before="0" w:after="0"/>
-            </w:pPr>
-            <w:r/>
-            <w:r>
-              <w:rPr>
-                <w:rFonts w:ascii="Times New Roman" w:hAnsi="Times New Roman" w:eastAsia="Times New Roman"/>
-                <w:b w:val="0"/>
-                <w:i w:val="0"/>
-                <w:sz w:val="20"/>
-              </w:rPr>
-              <w:t>Template workflow deteksi file berbahaya: Wazuh ke VirusTotal dengan alert Slack</w:t>
-            </w:r>
-          </w:p>
-        </w:tc>
-        <w:tc>
-          <w:tcPr>
-            <w:tcW w:type="dxa" w:w="1872"/>
-            <w:tcBorders>
-              <w:top w:sz="4" w:val="single" w:color="000000"/>
-              <w:left w:sz="4" w:val="single" w:color="000000"/>
-              <w:bottom w:sz="4" w:val="single" w:color="000000"/>
-              <w:right w:sz="4" w:val="single" w:color="000000"/>
-            </w:tcBorders>
-          </w:tcPr>
-          <w:p>
-            <w:pPr>
-              <w:spacing w:line="360" w:lineRule="auto" w:before="0" w:after="0"/>
-            </w:pPr>
-            <w:r/>
-            <w:r>
-              <w:rPr>
-                <w:rFonts w:ascii="Times New Roman" w:hAnsi="Times New Roman" w:eastAsia="Times New Roman"/>
-                <w:b w:val="0"/>
-                <w:i w:val="0"/>
-                <w:sz w:val="20"/>
-              </w:rPr>
-              <w:t>Workflow n8n + VirusTotal + notifikasi Slack</w:t>
-            </w:r>
-          </w:p>
-        </w:tc>
-        <w:tc>
-          <w:tcPr>
-            <w:tcW w:type="dxa" w:w="2218"/>
-            <w:tcBorders>
-              <w:top w:sz="4" w:val="single" w:color="000000"/>
-              <w:left w:sz="4" w:val="single" w:color="000000"/>
-              <w:bottom w:sz="4" w:val="single" w:color="000000"/>
-              <w:right w:sz="4" w:val="single" w:color="000000"/>
-            </w:tcBorders>
-          </w:tcPr>
-          <w:p>
-            <w:pPr>
-              <w:spacing w:line="360" w:lineRule="auto" w:before="0" w:after="0"/>
-            </w:pPr>
-            <w:r/>
-            <w:r>
-              <w:rPr>
-                <w:rFonts w:ascii="Times New Roman" w:hAnsi="Times New Roman" w:eastAsia="Times New Roman"/>
-                <w:b w:val="0"/>
-                <w:i w:val="0"/>
-                <w:sz w:val="20"/>
-              </w:rPr>
-              <w:t>Hanya notifikasi Slack satu arah; malware saja; tanpa mitigasi aktif dua arah maupun AI lokal</w:t>
-            </w:r>
-          </w:p>
-        </w:tc>
-      </w:tr>
-      <w:tr>
-        <w:trPr>
-          <w:cantSplit/>
-        </w:trPr>
-        <w:tc>
-          <w:tcPr>
-            <w:tcW w:type="dxa" w:w="576"/>
-            <w:tcBorders>
-              <w:top w:sz="4" w:val="single" w:color="000000"/>
-              <w:left w:sz="4" w:val="single" w:color="000000"/>
-              <w:bottom w:sz="4" w:val="single" w:color="000000"/>
-              <w:right w:sz="4" w:val="single" w:color="000000"/>
-            </w:tcBorders>
-          </w:tcPr>
-          <w:p>
-            <w:pPr>
-              <w:spacing w:line="360" w:lineRule="auto" w:before="0" w:after="0"/>
-            </w:pPr>
-            <w:r/>
-            <w:r>
-              <w:rPr>
-                <w:rFonts w:ascii="Times New Roman" w:hAnsi="Times New Roman" w:eastAsia="Times New Roman"/>
-                <w:b w:val="0"/>
-                <w:i w:val="0"/>
-                <w:sz w:val="20"/>
-              </w:rPr>
-              <w:t>5</w:t>
-            </w:r>
-          </w:p>
-        </w:tc>
-        <w:tc>
-          <w:tcPr>
-            <w:tcW w:type="dxa" w:w="1440"/>
-            <w:tcBorders>
-              <w:top w:sz="4" w:val="single" w:color="000000"/>
-              <w:left w:sz="4" w:val="single" w:color="000000"/>
-              <w:bottom w:sz="4" w:val="single" w:color="000000"/>
-              <w:right w:sz="4" w:val="single" w:color="000000"/>
-            </w:tcBorders>
-          </w:tcPr>
-          <w:p>
-            <w:pPr>
-              <w:spacing w:line="360" w:lineRule="auto" w:before="0" w:after="0"/>
-            </w:pPr>
-            <w:r/>
-            <w:r>
-              <w:rPr>
-                <w:rFonts w:ascii="Times New Roman" w:hAnsi="Times New Roman" w:eastAsia="Times New Roman"/>
-                <w:b w:val="0"/>
-                <w:i w:val="0"/>
-                <w:sz w:val="20"/>
-              </w:rPr>
-              <w:t>Nadig &amp; Vignesh (2026)</w:t>
-            </w:r>
-          </w:p>
-        </w:tc>
-        <w:tc>
-          <w:tcPr>
-            <w:tcW w:type="dxa" w:w="2160"/>
-            <w:tcBorders>
-              <w:top w:sz="4" w:val="single" w:color="000000"/>
-              <w:left w:sz="4" w:val="single" w:color="000000"/>
-              <w:bottom w:sz="4" w:val="single" w:color="000000"/>
-              <w:right w:sz="4" w:val="single" w:color="000000"/>
-            </w:tcBorders>
-          </w:tcPr>
-          <w:p>
-            <w:pPr>
-              <w:spacing w:line="360" w:lineRule="auto" w:before="0" w:after="0"/>
-            </w:pPr>
-            <w:r/>
-            <w:r>
-              <w:rPr>
-                <w:rFonts w:ascii="Times New Roman" w:hAnsi="Times New Roman" w:eastAsia="Times New Roman"/>
-                <w:b w:val="0"/>
-                <w:i w:val="0"/>
-                <w:sz w:val="20"/>
-              </w:rPr>
-              <w:t>Peningkatan kapabilitas Wazuh SIEM melalui integrasi SOAR untuk respons ancaman otomatis</w:t>
-            </w:r>
-          </w:p>
-        </w:tc>
-        <w:tc>
-          <w:tcPr>
-            <w:tcW w:type="dxa" w:w="1872"/>
-            <w:tcBorders>
-              <w:top w:sz="4" w:val="single" w:color="000000"/>
-              <w:left w:sz="4" w:val="single" w:color="000000"/>
-              <w:bottom w:sz="4" w:val="single" w:color="000000"/>
-              <w:right w:sz="4" w:val="single" w:color="000000"/>
-            </w:tcBorders>
-          </w:tcPr>
-          <w:p>
-            <w:pPr>
-              <w:spacing w:line="360" w:lineRule="auto" w:before="0" w:after="0"/>
-            </w:pPr>
-            <w:r/>
-            <w:r>
-              <w:rPr>
-                <w:rFonts w:ascii="Times New Roman" w:hAnsi="Times New Roman" w:eastAsia="Times New Roman"/>
-                <w:b w:val="0"/>
-                <w:i w:val="0"/>
-                <w:sz w:val="20"/>
-              </w:rPr>
-              <w:t>Integrasi Wazuh + SOAR; respons otomatis</w:t>
-            </w:r>
-          </w:p>
-        </w:tc>
-        <w:tc>
-          <w:tcPr>
-            <w:tcW w:type="dxa" w:w="2218"/>
-            <w:tcBorders>
-              <w:top w:sz="4" w:val="single" w:color="000000"/>
-              <w:left w:sz="4" w:val="single" w:color="000000"/>
-              <w:bottom w:sz="4" w:val="single" w:color="000000"/>
-              <w:right w:sz="4" w:val="single" w:color="000000"/>
-            </w:tcBorders>
-          </w:tcPr>
-          <w:p>
-            <w:pPr>
-              <w:spacing w:line="360" w:lineRule="auto" w:before="0" w:after="0"/>
-            </w:pPr>
-            <w:r/>
-            <w:r>
-              <w:rPr>
-                <w:rFonts w:ascii="Times New Roman" w:hAnsi="Times New Roman" w:eastAsia="Times New Roman"/>
-                <w:b w:val="0"/>
-                <w:i w:val="0"/>
-                <w:sz w:val="20"/>
-              </w:rPr>
-              <w:t>Respons otomatis tanpa human-in-the-loop; belum berjenjang berbasis verifikasi multi-sumber; tanpa AI lokal</w:t>
-            </w:r>
-          </w:p>
-        </w:tc>
-      </w:tr>
-      <w:tr>
-        <w:trPr>
-          <w:cantSplit/>
-        </w:trPr>
-        <w:tc>
-          <w:tcPr>
-            <w:tcW w:type="dxa" w:w="576"/>
-            <w:tcBorders>
-              <w:top w:sz="4" w:val="single" w:color="000000"/>
-              <w:left w:sz="4" w:val="single" w:color="000000"/>
-              <w:bottom w:sz="4" w:val="single" w:color="000000"/>
-              <w:right w:sz="4" w:val="single" w:color="000000"/>
-            </w:tcBorders>
-          </w:tcPr>
-          <w:p>
-            <w:pPr>
-              <w:spacing w:line="360" w:lineRule="auto" w:before="0" w:after="0"/>
-            </w:pPr>
-            <w:r/>
-            <w:r>
-              <w:rPr>
-                <w:rFonts w:ascii="Times New Roman" w:hAnsi="Times New Roman" w:eastAsia="Times New Roman"/>
-                <w:b w:val="0"/>
-                <w:i w:val="0"/>
-                <w:sz w:val="20"/>
-              </w:rPr>
-              <w:t>6</w:t>
-            </w:r>
-          </w:p>
-        </w:tc>
-        <w:tc>
-          <w:tcPr>
-            <w:tcW w:type="dxa" w:w="1440"/>
-            <w:tcBorders>
-              <w:top w:sz="4" w:val="single" w:color="000000"/>
-              <w:left w:sz="4" w:val="single" w:color="000000"/>
-              <w:bottom w:sz="4" w:val="single" w:color="000000"/>
-              <w:right w:sz="4" w:val="single" w:color="000000"/>
-            </w:tcBorders>
-          </w:tcPr>
-          <w:p>
-            <w:pPr>
-              <w:spacing w:line="360" w:lineRule="auto" w:before="0" w:after="0"/>
-            </w:pPr>
-            <w:r/>
-            <w:r>
-              <w:rPr>
-                <w:rFonts w:ascii="Times New Roman" w:hAnsi="Times New Roman" w:eastAsia="Times New Roman"/>
-                <w:b w:val="0"/>
-                <w:i w:val="0"/>
-                <w:sz w:val="20"/>
-              </w:rPr>
-              <w:t>Alves dkk. (2026)</w:t>
-            </w:r>
-          </w:p>
-        </w:tc>
-        <w:tc>
-          <w:tcPr>
-            <w:tcW w:type="dxa" w:w="2160"/>
-            <w:tcBorders>
-              <w:top w:sz="4" w:val="single" w:color="000000"/>
-              <w:left w:sz="4" w:val="single" w:color="000000"/>
-              <w:bottom w:sz="4" w:val="single" w:color="000000"/>
-              <w:right w:sz="4" w:val="single" w:color="000000"/>
-            </w:tcBorders>
-          </w:tcPr>
-          <w:p>
-            <w:pPr>
-              <w:spacing w:line="360" w:lineRule="auto" w:before="0" w:after="0"/>
-            </w:pPr>
-            <w:r/>
-            <w:r>
-              <w:rPr>
-                <w:rFonts w:ascii="Times New Roman" w:hAnsi="Times New Roman" w:eastAsia="Times New Roman"/>
-                <w:b w:val="0"/>
-                <w:i w:val="0"/>
-                <w:sz w:val="20"/>
-              </w:rPr>
-              <w:t>Wazuh untuk deteksi insiden: perancangan dan implementasi</w:t>
-            </w:r>
-          </w:p>
-        </w:tc>
-        <w:tc>
-          <w:tcPr>
-            <w:tcW w:type="dxa" w:w="1872"/>
-            <w:tcBorders>
-              <w:top w:sz="4" w:val="single" w:color="000000"/>
-              <w:left w:sz="4" w:val="single" w:color="000000"/>
-              <w:bottom w:sz="4" w:val="single" w:color="000000"/>
-              <w:right w:sz="4" w:val="single" w:color="000000"/>
-            </w:tcBorders>
-          </w:tcPr>
-          <w:p>
-            <w:pPr>
-              <w:spacing w:line="360" w:lineRule="auto" w:before="0" w:after="0"/>
-            </w:pPr>
-            <w:r/>
-            <w:r>
-              <w:rPr>
-                <w:rFonts w:ascii="Times New Roman" w:hAnsi="Times New Roman" w:eastAsia="Times New Roman"/>
-                <w:b w:val="0"/>
-                <w:i w:val="0"/>
-                <w:sz w:val="20"/>
-              </w:rPr>
-              <w:t>Perancangan dan implementasi deteksi insiden berbasis Wazuh</w:t>
-            </w:r>
-          </w:p>
-        </w:tc>
-        <w:tc>
-          <w:tcPr>
-            <w:tcW w:type="dxa" w:w="2218"/>
-            <w:tcBorders>
-              <w:top w:sz="4" w:val="single" w:color="000000"/>
-              <w:left w:sz="4" w:val="single" w:color="000000"/>
-              <w:bottom w:sz="4" w:val="single" w:color="000000"/>
-              <w:right w:sz="4" w:val="single" w:color="000000"/>
-            </w:tcBorders>
-          </w:tcPr>
-          <w:p>
-            <w:pPr>
-              <w:spacing w:line="360" w:lineRule="auto" w:before="0" w:after="0"/>
-            </w:pPr>
-            <w:r/>
-            <w:r>
-              <w:rPr>
-                <w:rFonts w:ascii="Times New Roman" w:hAnsi="Times New Roman" w:eastAsia="Times New Roman"/>
-                <w:b w:val="0"/>
-                <w:i w:val="0"/>
-                <w:sz w:val="20"/>
-              </w:rPr>
-              <w:t>Berfokus pada deteksi; minim orkestrasi mitigasi, kanal human-in-the-loop, dan analisis AI</w:t>
-            </w:r>
-          </w:p>
-        </w:tc>
-      </w:tr>
-      <w:tr>
-        <w:trPr>
-          <w:cantSplit/>
-        </w:trPr>
-        <w:tc>
-          <w:tcPr>
-            <w:tcW w:type="dxa" w:w="576"/>
-            <w:tcBorders>
-              <w:top w:sz="4" w:val="single" w:color="000000"/>
-              <w:left w:sz="4" w:val="single" w:color="000000"/>
-              <w:bottom w:sz="4" w:val="single" w:color="000000"/>
-              <w:right w:sz="4" w:val="single" w:color="000000"/>
-            </w:tcBorders>
-          </w:tcPr>
-          <w:p>
-            <w:pPr>
-              <w:spacing w:line="360" w:lineRule="auto" w:before="0" w:after="0"/>
-            </w:pPr>
-            <w:r/>
-            <w:r>
-              <w:rPr>
-                <w:rFonts w:ascii="Times New Roman" w:hAnsi="Times New Roman" w:eastAsia="Times New Roman"/>
-                <w:b w:val="0"/>
-                <w:i w:val="0"/>
-                <w:sz w:val="20"/>
-              </w:rPr>
-              <w:t>7</w:t>
-            </w:r>
-          </w:p>
-        </w:tc>
-        <w:tc>
-          <w:tcPr>
-            <w:tcW w:type="dxa" w:w="1440"/>
-            <w:tcBorders>
-              <w:top w:sz="4" w:val="single" w:color="000000"/>
-              <w:left w:sz="4" w:val="single" w:color="000000"/>
-              <w:bottom w:sz="4" w:val="single" w:color="000000"/>
-              <w:right w:sz="4" w:val="single" w:color="000000"/>
-            </w:tcBorders>
-          </w:tcPr>
-          <w:p>
-            <w:pPr>
-              <w:spacing w:line="360" w:lineRule="auto" w:before="0" w:after="0"/>
-            </w:pPr>
-            <w:r/>
-            <w:r>
-              <w:rPr>
-                <w:rFonts w:ascii="Times New Roman" w:hAnsi="Times New Roman" w:eastAsia="Times New Roman"/>
-                <w:b w:val="0"/>
-                <w:i w:val="0"/>
-                <w:sz w:val="20"/>
-              </w:rPr>
-              <w:t>Raed (2025)</w:t>
-            </w:r>
-          </w:p>
-        </w:tc>
-        <w:tc>
-          <w:tcPr>
-            <w:tcW w:type="dxa" w:w="2160"/>
-            <w:tcBorders>
-              <w:top w:sz="4" w:val="single" w:color="000000"/>
-              <w:left w:sz="4" w:val="single" w:color="000000"/>
-              <w:bottom w:sz="4" w:val="single" w:color="000000"/>
-              <w:right w:sz="4" w:val="single" w:color="000000"/>
-            </w:tcBorders>
-          </w:tcPr>
-          <w:p>
-            <w:pPr>
-              <w:spacing w:line="360" w:lineRule="auto" w:before="0" w:after="0"/>
-            </w:pPr>
-            <w:r/>
-            <w:r>
-              <w:rPr>
-                <w:rFonts w:ascii="Times New Roman" w:hAnsi="Times New Roman" w:eastAsia="Times New Roman"/>
-                <w:b w:val="0"/>
-                <w:i w:val="0"/>
-                <w:sz w:val="20"/>
-              </w:rPr>
-              <w:t>SOC bertenaga AI: dari deteksi hingga respons otomatis dengan Wazuh, n8n, Claude AI, dan MCP</w:t>
-            </w:r>
-          </w:p>
-        </w:tc>
-        <w:tc>
-          <w:tcPr>
-            <w:tcW w:type="dxa" w:w="1872"/>
-            <w:tcBorders>
-              <w:top w:sz="4" w:val="single" w:color="000000"/>
-              <w:left w:sz="4" w:val="single" w:color="000000"/>
-              <w:bottom w:sz="4" w:val="single" w:color="000000"/>
-              <w:right w:sz="4" w:val="single" w:color="000000"/>
-            </w:tcBorders>
-          </w:tcPr>
-          <w:p>
-            <w:pPr>
-              <w:spacing w:line="360" w:lineRule="auto" w:before="0" w:after="0"/>
-            </w:pPr>
-            <w:r/>
-            <w:r>
-              <w:rPr>
-                <w:rFonts w:ascii="Times New Roman" w:hAnsi="Times New Roman" w:eastAsia="Times New Roman"/>
-                <w:b w:val="0"/>
-                <w:i w:val="0"/>
-                <w:sz w:val="20"/>
-              </w:rPr>
-              <w:t>Orkestrasi n8n + LLM Claude berbasis cloud (via MCP)</w:t>
-            </w:r>
-          </w:p>
-        </w:tc>
-        <w:tc>
-          <w:tcPr>
-            <w:tcW w:type="dxa" w:w="2218"/>
-            <w:tcBorders>
-              <w:top w:sz="4" w:val="single" w:color="000000"/>
-              <w:left w:sz="4" w:val="single" w:color="000000"/>
-              <w:bottom w:sz="4" w:val="single" w:color="000000"/>
-              <w:right w:sz="4" w:val="single" w:color="000000"/>
-            </w:tcBorders>
-          </w:tcPr>
-          <w:p>
-            <w:pPr>
-              <w:spacing w:line="360" w:lineRule="auto" w:before="0" w:after="0"/>
-            </w:pPr>
-            <w:r/>
-            <w:r>
-              <w:rPr>
-                <w:rFonts w:ascii="Times New Roman" w:hAnsi="Times New Roman" w:eastAsia="Times New Roman"/>
-                <w:b w:val="0"/>
-                <w:i w:val="0"/>
-                <w:sz w:val="20"/>
-              </w:rPr>
-              <w:t>AI berbasis cloud sehingga berisiko pada kedaulatan data dan biaya API; tanpa kanal keputusan interaktif dua arah</w:t>
-            </w:r>
-          </w:p>
-        </w:tc>
-      </w:tr>
-      <w:tr>
-        <w:trPr>
-          <w:cantSplit/>
-        </w:trPr>
-        <w:tc>
-          <w:tcPr>
-            <w:tcW w:type="dxa" w:w="576"/>
-            <w:tcBorders>
-              <w:top w:sz="4" w:val="single" w:color="000000"/>
-              <w:left w:sz="4" w:val="single" w:color="000000"/>
-              <w:bottom w:sz="4" w:val="single" w:color="000000"/>
-              <w:right w:sz="4" w:val="single" w:color="000000"/>
-            </w:tcBorders>
-          </w:tcPr>
-          <w:p>
-            <w:pPr>
-              <w:spacing w:line="360" w:lineRule="auto" w:before="0" w:after="0"/>
-            </w:pPr>
-            <w:r/>
-            <w:r>
-              <w:rPr>
-                <w:rFonts w:ascii="Times New Roman" w:hAnsi="Times New Roman" w:eastAsia="Times New Roman"/>
-                <w:b w:val="0"/>
-                <w:i w:val="0"/>
-                <w:sz w:val="20"/>
-              </w:rPr>
-              <w:t>8</w:t>
-            </w:r>
-          </w:p>
-        </w:tc>
-        <w:tc>
-          <w:tcPr>
-            <w:tcW w:type="dxa" w:w="1440"/>
-            <w:tcBorders>
-              <w:top w:sz="4" w:val="single" w:color="000000"/>
-              <w:left w:sz="4" w:val="single" w:color="000000"/>
-              <w:bottom w:sz="4" w:val="single" w:color="000000"/>
-              <w:right w:sz="4" w:val="single" w:color="000000"/>
-            </w:tcBorders>
-          </w:tcPr>
-          <w:p>
-            <w:pPr>
-              <w:spacing w:line="360" w:lineRule="auto" w:before="0" w:after="0"/>
-            </w:pPr>
-            <w:r/>
-            <w:r>
-              <w:rPr>
-                <w:rFonts w:ascii="Times New Roman" w:hAnsi="Times New Roman" w:eastAsia="Times New Roman"/>
-                <w:b w:val="0"/>
-                <w:i w:val="0"/>
-                <w:sz w:val="20"/>
-              </w:rPr>
-              <w:t>zhadyz (2025)</w:t>
-            </w:r>
-          </w:p>
-        </w:tc>
-        <w:tc>
-          <w:tcPr>
-            <w:tcW w:type="dxa" w:w="2160"/>
-            <w:tcBorders>
-              <w:top w:sz="4" w:val="single" w:color="000000"/>
-              <w:left w:sz="4" w:val="single" w:color="000000"/>
-              <w:bottom w:sz="4" w:val="single" w:color="000000"/>
-              <w:right w:sz="4" w:val="single" w:color="000000"/>
-            </w:tcBorders>
-          </w:tcPr>
-          <w:p>
-            <w:pPr>
-              <w:spacing w:line="360" w:lineRule="auto" w:before="0" w:after="0"/>
-            </w:pPr>
-            <w:r/>
-            <w:r>
-              <w:rPr>
-                <w:rFonts w:ascii="Times New Roman" w:hAnsi="Times New Roman" w:eastAsia="Times New Roman"/>
-                <w:b w:val="0"/>
-                <w:i w:val="0"/>
-                <w:sz w:val="20"/>
-              </w:rPr>
-              <w:t>AI_SOC: SOC open-source berbasis LLM multi-agent (Ollama, Wazuh, TheHive, RAG)</w:t>
-            </w:r>
-          </w:p>
-        </w:tc>
-        <w:tc>
-          <w:tcPr>
-            <w:tcW w:type="dxa" w:w="1872"/>
-            <w:tcBorders>
-              <w:top w:sz="4" w:val="single" w:color="000000"/>
-              <w:left w:sz="4" w:val="single" w:color="000000"/>
-              <w:bottom w:sz="4" w:val="single" w:color="000000"/>
-              <w:right w:sz="4" w:val="single" w:color="000000"/>
-            </w:tcBorders>
-          </w:tcPr>
-          <w:p>
-            <w:pPr>
-              <w:spacing w:line="360" w:lineRule="auto" w:before="0" w:after="0"/>
-            </w:pPr>
-            <w:r/>
-            <w:r>
-              <w:rPr>
-                <w:rFonts w:ascii="Times New Roman" w:hAnsi="Times New Roman" w:eastAsia="Times New Roman"/>
-                <w:b w:val="0"/>
-                <w:i w:val="0"/>
-                <w:sz w:val="20"/>
-              </w:rPr>
-              <w:t>LLM multi-agent + Ollama (AI lokal) + Wazuh + TheHive</w:t>
-            </w:r>
-          </w:p>
-        </w:tc>
-        <w:tc>
-          <w:tcPr>
-            <w:tcW w:type="dxa" w:w="2218"/>
-            <w:tcBorders>
-              <w:top w:sz="4" w:val="single" w:color="000000"/>
-              <w:left w:sz="4" w:val="single" w:color="000000"/>
-              <w:bottom w:sz="4" w:val="single" w:color="000000"/>
-              <w:right w:sz="4" w:val="single" w:color="000000"/>
-            </w:tcBorders>
-          </w:tcPr>
-          <w:p>
-            <w:pPr>
-              <w:spacing w:line="360" w:lineRule="auto" w:before="0" w:after="0"/>
-            </w:pPr>
-            <w:r/>
-            <w:r>
-              <w:rPr>
-                <w:rFonts w:ascii="Times New Roman" w:hAnsi="Times New Roman" w:eastAsia="Times New Roman"/>
-                <w:b w:val="0"/>
-                <w:i w:val="0"/>
-                <w:sz w:val="20"/>
-              </w:rPr>
-              <w:t>Tanpa mitigasi aktif human-in-the-loop dua arah melalui chat; belum berjenjang multi-sumber; multi-agent bukan lintas-distribusi endpoint</w:t>
-            </w:r>
-          </w:p>
-        </w:tc>
-      </w:tr>
-    </w:tbl>
-    <w:p>
-      <w:pPr>
-        <w:spacing w:after="240"/>
-      </w:pPr>
-    </w:p>
-    <w:p>
-      <w:pPr>
-        <w:keepNext/>
-        <w:spacing w:line="360" w:lineRule="auto" w:before="0" w:after="120"/>
-      </w:pPr>
-      <w:r>
-        <w:rPr>
-          <w:rFonts w:ascii="Times New Roman" w:hAnsi="Times New Roman" w:eastAsia="Times New Roman"/>
-          <w:b/>
-          <w:i w:val="0"/>
-          <w:sz w:val="20"/>
-        </w:rPr>
-        <w:t xml:space="preserve">Tabel 4 </w:t>
-      </w:r>
-      <w:r>
-        <w:rPr>
-          <w:rFonts w:ascii="Times New Roman" w:hAnsi="Times New Roman" w:eastAsia="Times New Roman"/>
-          <w:b w:val="0"/>
-          <w:i w:val="0"/>
-          <w:sz w:val="20"/>
-        </w:rPr>
-        <w:t>Posisi Kebaruan Usulan terhadap Penelitian Terdahulu.</w:t>
-      </w:r>
-    </w:p>
-    <w:tbl>
-      <w:tblPr>
-        <w:tblW w:type="auto" w:w="0"/>
-        <w:jc w:val="center"/>
-        <w:tblLayout w:type="fixed"/>
-        <w:tblLook w:firstColumn="1" w:firstRow="1" w:lastColumn="0" w:lastRow="0" w:noHBand="0" w:noVBand="1" w:val="04A0"/>
-      </w:tblPr>
-      <w:tblGrid>
-        <w:gridCol w:w="1929"/>
-        <w:gridCol w:w="1267"/>
-        <w:gridCol w:w="1267"/>
-        <w:gridCol w:w="1267"/>
-        <w:gridCol w:w="1267"/>
-        <w:gridCol w:w="1267"/>
-      </w:tblGrid>
-      <w:tr>
-        <w:trPr>
-          <w:cantSplit/>
-          <w:tblHeader w:val="true"/>
-        </w:trPr>
-        <w:tc>
-          <w:tcPr>
-            <w:tcW w:type="dxa" w:w="1930"/>
-            <w:tcBorders>
-              <w:top w:sz="4" w:val="single" w:color="000000"/>
-              <w:left w:sz="4" w:val="single" w:color="000000"/>
-              <w:bottom w:sz="4" w:val="single" w:color="000000"/>
-              <w:right w:sz="4" w:val="single" w:color="000000"/>
-            </w:tcBorders>
-          </w:tcPr>
-          <w:p>
-            <w:pPr>
-              <w:spacing w:line="360" w:lineRule="auto" w:before="0" w:after="0"/>
-              <w:jc w:val="center"/>
-            </w:pPr>
-            <w:r/>
-            <w:r>
-              <w:rPr>
-                <w:rFonts w:ascii="Times New Roman" w:hAnsi="Times New Roman" w:eastAsia="Times New Roman"/>
-                <w:b/>
-                <w:i w:val="0"/>
-                <w:sz w:val="20"/>
-              </w:rPr>
-              <w:t>Karya</w:t>
+              <w:t>Sumber</w:t>
             </w:r>
           </w:p>
         </w:tc>
@@ -3337,7 +2072,7 @@
                 <w:i w:val="0"/>
                 <w:sz w:val="20"/>
               </w:rPr>
-              <w:t>Respons Berjenjang Multi-sumber</w:t>
+              <w:t>Fokus Utama</w:t>
             </w:r>
           </w:p>
         </w:tc>
@@ -3364,13 +2099,13 @@
                 <w:i w:val="0"/>
                 <w:sz w:val="20"/>
               </w:rPr>
-              <w:t>HITL Dua Arah Satu Kanal</w:t>
+              <w:t>Metode</w:t>
             </w:r>
           </w:p>
         </w:tc>
         <w:tc>
           <w:tcPr>
-            <w:tcW w:type="dxa" w:w="1267"/>
+            <w:tcW w:type="dxa" w:w="1325"/>
             <w:tcBorders>
               <w:top w:sz="4" w:val="single" w:color="000000"/>
               <w:left w:sz="4" w:val="single" w:color="000000"/>
@@ -3391,13 +2126,13 @@
                 <w:i w:val="0"/>
                 <w:sz w:val="20"/>
               </w:rPr>
-              <w:t>Malware dan Phishing</w:t>
+              <w:t>Fitur Respons dan Alert</w:t>
             </w:r>
           </w:p>
         </w:tc>
         <w:tc>
           <w:tcPr>
-            <w:tcW w:type="dxa" w:w="1267"/>
+            <w:tcW w:type="dxa" w:w="1354"/>
             <w:tcBorders>
               <w:top w:sz="4" w:val="single" w:color="000000"/>
               <w:left w:sz="4" w:val="single" w:color="000000"/>
@@ -3418,13 +2153,13 @@
                 <w:i w:val="0"/>
                 <w:sz w:val="20"/>
               </w:rPr>
-              <w:t>AI Lokal On-premise</w:t>
+              <w:t>Kesenjangan</w:t>
             </w:r>
           </w:p>
         </w:tc>
         <w:tc>
           <w:tcPr>
-            <w:tcW w:type="dxa" w:w="1267"/>
+            <w:tcW w:type="dxa" w:w="1469"/>
             <w:tcBorders>
               <w:top w:sz="4" w:val="single" w:color="000000"/>
               <w:left w:sz="4" w:val="single" w:color="000000"/>
@@ -3445,7 +2180,7 @@
                 <w:i w:val="0"/>
                 <w:sz w:val="20"/>
               </w:rPr>
-              <w:t>Multi-agent Lintas-Distribusi</w:t>
+              <w:t>Proyek Saya</w:t>
             </w:r>
           </w:p>
         </w:tc>
@@ -3456,7 +2191,7 @@
         </w:trPr>
         <w:tc>
           <w:tcPr>
-            <w:tcW w:type="dxa" w:w="1930"/>
+            <w:tcW w:type="dxa" w:w="1584"/>
             <w:tcBorders>
               <w:top w:sz="4" w:val="single" w:color="000000"/>
               <w:left w:sz="4" w:val="single" w:color="000000"/>
@@ -3476,153 +2211,13 @@
                 <w:i w:val="0"/>
                 <w:sz w:val="20"/>
               </w:rPr>
-              <w:t>Thakker dkk. (2025)</w:t>
+              <w:t>Thakker dkk. (2025) — pertahanan otomatis serangan application-layer pada Windows (Wazuh dan Shuffle)</w:t>
             </w:r>
           </w:p>
         </w:tc>
         <w:tc>
           <w:tcPr>
             <w:tcW w:type="dxa" w:w="1267"/>
-            <w:tcBorders>
-              <w:top w:sz="4" w:val="single" w:color="000000"/>
-              <w:left w:sz="4" w:val="single" w:color="000000"/>
-              <w:bottom w:sz="4" w:val="single" w:color="000000"/>
-              <w:right w:sz="4" w:val="single" w:color="000000"/>
-            </w:tcBorders>
-          </w:tcPr>
-          <w:p>
-            <w:pPr>
-              <w:spacing w:line="360" w:lineRule="auto" w:before="0" w:after="0"/>
-              <w:jc w:val="center"/>
-            </w:pPr>
-            <w:r/>
-            <w:r>
-              <w:rPr>
-                <w:rFonts w:ascii="Times New Roman" w:hAnsi="Times New Roman" w:eastAsia="Times New Roman"/>
-                <w:b w:val="0"/>
-                <w:i w:val="0"/>
-                <w:sz w:val="20"/>
-              </w:rPr>
-              <w:t>Tidak</w:t>
-            </w:r>
-          </w:p>
-        </w:tc>
-        <w:tc>
-          <w:tcPr>
-            <w:tcW w:type="dxa" w:w="1267"/>
-            <w:tcBorders>
-              <w:top w:sz="4" w:val="single" w:color="000000"/>
-              <w:left w:sz="4" w:val="single" w:color="000000"/>
-              <w:bottom w:sz="4" w:val="single" w:color="000000"/>
-              <w:right w:sz="4" w:val="single" w:color="000000"/>
-            </w:tcBorders>
-          </w:tcPr>
-          <w:p>
-            <w:pPr>
-              <w:spacing w:line="360" w:lineRule="auto" w:before="0" w:after="0"/>
-              <w:jc w:val="center"/>
-            </w:pPr>
-            <w:r/>
-            <w:r>
-              <w:rPr>
-                <w:rFonts w:ascii="Times New Roman" w:hAnsi="Times New Roman" w:eastAsia="Times New Roman"/>
-                <w:b w:val="0"/>
-                <w:i w:val="0"/>
-                <w:sz w:val="20"/>
-              </w:rPr>
-              <w:t>Tidak</w:t>
-            </w:r>
-          </w:p>
-        </w:tc>
-        <w:tc>
-          <w:tcPr>
-            <w:tcW w:type="dxa" w:w="1267"/>
-            <w:tcBorders>
-              <w:top w:sz="4" w:val="single" w:color="000000"/>
-              <w:left w:sz="4" w:val="single" w:color="000000"/>
-              <w:bottom w:sz="4" w:val="single" w:color="000000"/>
-              <w:right w:sz="4" w:val="single" w:color="000000"/>
-            </w:tcBorders>
-          </w:tcPr>
-          <w:p>
-            <w:pPr>
-              <w:spacing w:line="360" w:lineRule="auto" w:before="0" w:after="0"/>
-              <w:jc w:val="center"/>
-            </w:pPr>
-            <w:r/>
-            <w:r>
-              <w:rPr>
-                <w:rFonts w:ascii="Times New Roman" w:hAnsi="Times New Roman" w:eastAsia="Times New Roman"/>
-                <w:b w:val="0"/>
-                <w:i w:val="0"/>
-                <w:sz w:val="20"/>
-              </w:rPr>
-              <w:t>Tidak</w:t>
-            </w:r>
-          </w:p>
-        </w:tc>
-        <w:tc>
-          <w:tcPr>
-            <w:tcW w:type="dxa" w:w="1267"/>
-            <w:tcBorders>
-              <w:top w:sz="4" w:val="single" w:color="000000"/>
-              <w:left w:sz="4" w:val="single" w:color="000000"/>
-              <w:bottom w:sz="4" w:val="single" w:color="000000"/>
-              <w:right w:sz="4" w:val="single" w:color="000000"/>
-            </w:tcBorders>
-          </w:tcPr>
-          <w:p>
-            <w:pPr>
-              <w:spacing w:line="360" w:lineRule="auto" w:before="0" w:after="0"/>
-              <w:jc w:val="center"/>
-            </w:pPr>
-            <w:r/>
-            <w:r>
-              <w:rPr>
-                <w:rFonts w:ascii="Times New Roman" w:hAnsi="Times New Roman" w:eastAsia="Times New Roman"/>
-                <w:b w:val="0"/>
-                <w:i w:val="0"/>
-                <w:sz w:val="20"/>
-              </w:rPr>
-              <w:t>Tidak</w:t>
-            </w:r>
-          </w:p>
-        </w:tc>
-        <w:tc>
-          <w:tcPr>
-            <w:tcW w:type="dxa" w:w="1267"/>
-            <w:tcBorders>
-              <w:top w:sz="4" w:val="single" w:color="000000"/>
-              <w:left w:sz="4" w:val="single" w:color="000000"/>
-              <w:bottom w:sz="4" w:val="single" w:color="000000"/>
-              <w:right w:sz="4" w:val="single" w:color="000000"/>
-            </w:tcBorders>
-          </w:tcPr>
-          <w:p>
-            <w:pPr>
-              <w:spacing w:line="360" w:lineRule="auto" w:before="0" w:after="0"/>
-              <w:jc w:val="center"/>
-            </w:pPr>
-            <w:r/>
-            <w:r>
-              <w:rPr>
-                <w:rFonts w:ascii="Times New Roman" w:hAnsi="Times New Roman" w:eastAsia="Times New Roman"/>
-                <w:b w:val="0"/>
-                <w:i w:val="0"/>
-                <w:sz w:val="20"/>
-              </w:rPr>
-              <w:t>Tidak</w:t>
-            </w:r>
-          </w:p>
-        </w:tc>
-      </w:tr>
-      <w:tr>
-        <w:trPr>
-          <w:cantSplit/>
-        </w:trPr>
-        <w:tc>
-          <w:tcPr>
-            <w:tcW w:type="dxa" w:w="1930"/>
             <w:tcBorders>
               <w:top w:sz="4" w:val="single" w:color="000000"/>
               <w:left w:sz="4" w:val="single" w:color="000000"/>
@@ -3642,153 +2237,13 @@
                 <w:i w:val="0"/>
                 <w:sz w:val="20"/>
               </w:rPr>
-              <w:t>Farrel (2024)</w:t>
+              <w:t>Mitigasi otomatis serangan application-layer pada endpoint Windows</w:t>
             </w:r>
           </w:p>
         </w:tc>
         <w:tc>
           <w:tcPr>
             <w:tcW w:type="dxa" w:w="1267"/>
-            <w:tcBorders>
-              <w:top w:sz="4" w:val="single" w:color="000000"/>
-              <w:left w:sz="4" w:val="single" w:color="000000"/>
-              <w:bottom w:sz="4" w:val="single" w:color="000000"/>
-              <w:right w:sz="4" w:val="single" w:color="000000"/>
-            </w:tcBorders>
-          </w:tcPr>
-          <w:p>
-            <w:pPr>
-              <w:spacing w:line="360" w:lineRule="auto" w:before="0" w:after="0"/>
-              <w:jc w:val="center"/>
-            </w:pPr>
-            <w:r/>
-            <w:r>
-              <w:rPr>
-                <w:rFonts w:ascii="Times New Roman" w:hAnsi="Times New Roman" w:eastAsia="Times New Roman"/>
-                <w:b w:val="0"/>
-                <w:i w:val="0"/>
-                <w:sz w:val="20"/>
-              </w:rPr>
-              <w:t>Tidak</w:t>
-            </w:r>
-          </w:p>
-        </w:tc>
-        <w:tc>
-          <w:tcPr>
-            <w:tcW w:type="dxa" w:w="1267"/>
-            <w:tcBorders>
-              <w:top w:sz="4" w:val="single" w:color="000000"/>
-              <w:left w:sz="4" w:val="single" w:color="000000"/>
-              <w:bottom w:sz="4" w:val="single" w:color="000000"/>
-              <w:right w:sz="4" w:val="single" w:color="000000"/>
-            </w:tcBorders>
-          </w:tcPr>
-          <w:p>
-            <w:pPr>
-              <w:spacing w:line="360" w:lineRule="auto" w:before="0" w:after="0"/>
-              <w:jc w:val="center"/>
-            </w:pPr>
-            <w:r/>
-            <w:r>
-              <w:rPr>
-                <w:rFonts w:ascii="Times New Roman" w:hAnsi="Times New Roman" w:eastAsia="Times New Roman"/>
-                <w:b w:val="0"/>
-                <w:i w:val="0"/>
-                <w:sz w:val="20"/>
-              </w:rPr>
-              <w:t>Tidak</w:t>
-            </w:r>
-          </w:p>
-        </w:tc>
-        <w:tc>
-          <w:tcPr>
-            <w:tcW w:type="dxa" w:w="1267"/>
-            <w:tcBorders>
-              <w:top w:sz="4" w:val="single" w:color="000000"/>
-              <w:left w:sz="4" w:val="single" w:color="000000"/>
-              <w:bottom w:sz="4" w:val="single" w:color="000000"/>
-              <w:right w:sz="4" w:val="single" w:color="000000"/>
-            </w:tcBorders>
-          </w:tcPr>
-          <w:p>
-            <w:pPr>
-              <w:spacing w:line="360" w:lineRule="auto" w:before="0" w:after="0"/>
-              <w:jc w:val="center"/>
-            </w:pPr>
-            <w:r/>
-            <w:r>
-              <w:rPr>
-                <w:rFonts w:ascii="Times New Roman" w:hAnsi="Times New Roman" w:eastAsia="Times New Roman"/>
-                <w:b w:val="0"/>
-                <w:i w:val="0"/>
-                <w:sz w:val="20"/>
-              </w:rPr>
-              <w:t>Tidak</w:t>
-            </w:r>
-          </w:p>
-        </w:tc>
-        <w:tc>
-          <w:tcPr>
-            <w:tcW w:type="dxa" w:w="1267"/>
-            <w:tcBorders>
-              <w:top w:sz="4" w:val="single" w:color="000000"/>
-              <w:left w:sz="4" w:val="single" w:color="000000"/>
-              <w:bottom w:sz="4" w:val="single" w:color="000000"/>
-              <w:right w:sz="4" w:val="single" w:color="000000"/>
-            </w:tcBorders>
-          </w:tcPr>
-          <w:p>
-            <w:pPr>
-              <w:spacing w:line="360" w:lineRule="auto" w:before="0" w:after="0"/>
-              <w:jc w:val="center"/>
-            </w:pPr>
-            <w:r/>
-            <w:r>
-              <w:rPr>
-                <w:rFonts w:ascii="Times New Roman" w:hAnsi="Times New Roman" w:eastAsia="Times New Roman"/>
-                <w:b w:val="0"/>
-                <w:i w:val="0"/>
-                <w:sz w:val="20"/>
-              </w:rPr>
-              <w:t>Tidak</w:t>
-            </w:r>
-          </w:p>
-        </w:tc>
-        <w:tc>
-          <w:tcPr>
-            <w:tcW w:type="dxa" w:w="1267"/>
-            <w:tcBorders>
-              <w:top w:sz="4" w:val="single" w:color="000000"/>
-              <w:left w:sz="4" w:val="single" w:color="000000"/>
-              <w:bottom w:sz="4" w:val="single" w:color="000000"/>
-              <w:right w:sz="4" w:val="single" w:color="000000"/>
-            </w:tcBorders>
-          </w:tcPr>
-          <w:p>
-            <w:pPr>
-              <w:spacing w:line="360" w:lineRule="auto" w:before="0" w:after="0"/>
-              <w:jc w:val="center"/>
-            </w:pPr>
-            <w:r/>
-            <w:r>
-              <w:rPr>
-                <w:rFonts w:ascii="Times New Roman" w:hAnsi="Times New Roman" w:eastAsia="Times New Roman"/>
-                <w:b w:val="0"/>
-                <w:i w:val="0"/>
-                <w:sz w:val="20"/>
-              </w:rPr>
-              <w:t>Tidak</w:t>
-            </w:r>
-          </w:p>
-        </w:tc>
-      </w:tr>
-      <w:tr>
-        <w:trPr>
-          <w:cantSplit/>
-        </w:trPr>
-        <w:tc>
-          <w:tcPr>
-            <w:tcW w:type="dxa" w:w="1930"/>
             <w:tcBorders>
               <w:top w:sz="4" w:val="single" w:color="000000"/>
               <w:left w:sz="4" w:val="single" w:color="000000"/>
@@ -3808,153 +2263,13 @@
                 <w:i w:val="0"/>
                 <w:sz w:val="20"/>
               </w:rPr>
-              <w:t>Sarker (2025)</w:t>
+              <w:t>Integrasi Wazuh dan Shuffle; pemblokiran otomatis berbasis aturan</w:t>
             </w:r>
           </w:p>
         </w:tc>
         <w:tc>
           <w:tcPr>
-            <w:tcW w:type="dxa" w:w="1267"/>
-            <w:tcBorders>
-              <w:top w:sz="4" w:val="single" w:color="000000"/>
-              <w:left w:sz="4" w:val="single" w:color="000000"/>
-              <w:bottom w:sz="4" w:val="single" w:color="000000"/>
-              <w:right w:sz="4" w:val="single" w:color="000000"/>
-            </w:tcBorders>
-          </w:tcPr>
-          <w:p>
-            <w:pPr>
-              <w:spacing w:line="360" w:lineRule="auto" w:before="0" w:after="0"/>
-              <w:jc w:val="center"/>
-            </w:pPr>
-            <w:r/>
-            <w:r>
-              <w:rPr>
-                <w:rFonts w:ascii="Times New Roman" w:hAnsi="Times New Roman" w:eastAsia="Times New Roman"/>
-                <w:b w:val="0"/>
-                <w:i w:val="0"/>
-                <w:sz w:val="20"/>
-              </w:rPr>
-              <w:t>Tidak</w:t>
-            </w:r>
-          </w:p>
-        </w:tc>
-        <w:tc>
-          <w:tcPr>
-            <w:tcW w:type="dxa" w:w="1267"/>
-            <w:tcBorders>
-              <w:top w:sz="4" w:val="single" w:color="000000"/>
-              <w:left w:sz="4" w:val="single" w:color="000000"/>
-              <w:bottom w:sz="4" w:val="single" w:color="000000"/>
-              <w:right w:sz="4" w:val="single" w:color="000000"/>
-            </w:tcBorders>
-          </w:tcPr>
-          <w:p>
-            <w:pPr>
-              <w:spacing w:line="360" w:lineRule="auto" w:before="0" w:after="0"/>
-              <w:jc w:val="center"/>
-            </w:pPr>
-            <w:r/>
-            <w:r>
-              <w:rPr>
-                <w:rFonts w:ascii="Times New Roman" w:hAnsi="Times New Roman" w:eastAsia="Times New Roman"/>
-                <w:b w:val="0"/>
-                <w:i w:val="0"/>
-                <w:sz w:val="20"/>
-              </w:rPr>
-              <w:t>Tidak</w:t>
-            </w:r>
-          </w:p>
-        </w:tc>
-        <w:tc>
-          <w:tcPr>
-            <w:tcW w:type="dxa" w:w="1267"/>
-            <w:tcBorders>
-              <w:top w:sz="4" w:val="single" w:color="000000"/>
-              <w:left w:sz="4" w:val="single" w:color="000000"/>
-              <w:bottom w:sz="4" w:val="single" w:color="000000"/>
-              <w:right w:sz="4" w:val="single" w:color="000000"/>
-            </w:tcBorders>
-          </w:tcPr>
-          <w:p>
-            <w:pPr>
-              <w:spacing w:line="360" w:lineRule="auto" w:before="0" w:after="0"/>
-              <w:jc w:val="center"/>
-            </w:pPr>
-            <w:r/>
-            <w:r>
-              <w:rPr>
-                <w:rFonts w:ascii="Times New Roman" w:hAnsi="Times New Roman" w:eastAsia="Times New Roman"/>
-                <w:b w:val="0"/>
-                <w:i w:val="0"/>
-                <w:sz w:val="20"/>
-              </w:rPr>
-              <w:t>Tidak</w:t>
-            </w:r>
-          </w:p>
-        </w:tc>
-        <w:tc>
-          <w:tcPr>
-            <w:tcW w:type="dxa" w:w="1267"/>
-            <w:tcBorders>
-              <w:top w:sz="4" w:val="single" w:color="000000"/>
-              <w:left w:sz="4" w:val="single" w:color="000000"/>
-              <w:bottom w:sz="4" w:val="single" w:color="000000"/>
-              <w:right w:sz="4" w:val="single" w:color="000000"/>
-            </w:tcBorders>
-          </w:tcPr>
-          <w:p>
-            <w:pPr>
-              <w:spacing w:line="360" w:lineRule="auto" w:before="0" w:after="0"/>
-              <w:jc w:val="center"/>
-            </w:pPr>
-            <w:r/>
-            <w:r>
-              <w:rPr>
-                <w:rFonts w:ascii="Times New Roman" w:hAnsi="Times New Roman" w:eastAsia="Times New Roman"/>
-                <w:b w:val="0"/>
-                <w:i w:val="0"/>
-                <w:sz w:val="20"/>
-              </w:rPr>
-              <w:t>Tidak</w:t>
-            </w:r>
-          </w:p>
-        </w:tc>
-        <w:tc>
-          <w:tcPr>
-            <w:tcW w:type="dxa" w:w="1267"/>
-            <w:tcBorders>
-              <w:top w:sz="4" w:val="single" w:color="000000"/>
-              <w:left w:sz="4" w:val="single" w:color="000000"/>
-              <w:bottom w:sz="4" w:val="single" w:color="000000"/>
-              <w:right w:sz="4" w:val="single" w:color="000000"/>
-            </w:tcBorders>
-          </w:tcPr>
-          <w:p>
-            <w:pPr>
-              <w:spacing w:line="360" w:lineRule="auto" w:before="0" w:after="0"/>
-              <w:jc w:val="center"/>
-            </w:pPr>
-            <w:r/>
-            <w:r>
-              <w:rPr>
-                <w:rFonts w:ascii="Times New Roman" w:hAnsi="Times New Roman" w:eastAsia="Times New Roman"/>
-                <w:b w:val="0"/>
-                <w:i w:val="0"/>
-                <w:sz w:val="20"/>
-              </w:rPr>
-              <w:t>Tidak</w:t>
-            </w:r>
-          </w:p>
-        </w:tc>
-      </w:tr>
-      <w:tr>
-        <w:trPr>
-          <w:cantSplit/>
-        </w:trPr>
-        <w:tc>
-          <w:tcPr>
-            <w:tcW w:type="dxa" w:w="1930"/>
+            <w:tcW w:type="dxa" w:w="1325"/>
             <w:tcBorders>
               <w:top w:sz="4" w:val="single" w:color="000000"/>
               <w:left w:sz="4" w:val="single" w:color="000000"/>
@@ -3974,153 +2289,13 @@
                 <w:i w:val="0"/>
                 <w:sz w:val="20"/>
               </w:rPr>
-              <w:t>n8n (n.d.)</w:t>
+              <w:t>Active Response otomatis penuh; tanpa notifikasi interaktif</w:t>
             </w:r>
           </w:p>
         </w:tc>
         <w:tc>
           <w:tcPr>
-            <w:tcW w:type="dxa" w:w="1267"/>
-            <w:tcBorders>
-              <w:top w:sz="4" w:val="single" w:color="000000"/>
-              <w:left w:sz="4" w:val="single" w:color="000000"/>
-              <w:bottom w:sz="4" w:val="single" w:color="000000"/>
-              <w:right w:sz="4" w:val="single" w:color="000000"/>
-            </w:tcBorders>
-          </w:tcPr>
-          <w:p>
-            <w:pPr>
-              <w:spacing w:line="360" w:lineRule="auto" w:before="0" w:after="0"/>
-              <w:jc w:val="center"/>
-            </w:pPr>
-            <w:r/>
-            <w:r>
-              <w:rPr>
-                <w:rFonts w:ascii="Times New Roman" w:hAnsi="Times New Roman" w:eastAsia="Times New Roman"/>
-                <w:b w:val="0"/>
-                <w:i w:val="0"/>
-                <w:sz w:val="20"/>
-              </w:rPr>
-              <w:t>Tidak</w:t>
-            </w:r>
-          </w:p>
-        </w:tc>
-        <w:tc>
-          <w:tcPr>
-            <w:tcW w:type="dxa" w:w="1267"/>
-            <w:tcBorders>
-              <w:top w:sz="4" w:val="single" w:color="000000"/>
-              <w:left w:sz="4" w:val="single" w:color="000000"/>
-              <w:bottom w:sz="4" w:val="single" w:color="000000"/>
-              <w:right w:sz="4" w:val="single" w:color="000000"/>
-            </w:tcBorders>
-          </w:tcPr>
-          <w:p>
-            <w:pPr>
-              <w:spacing w:line="360" w:lineRule="auto" w:before="0" w:after="0"/>
-              <w:jc w:val="center"/>
-            </w:pPr>
-            <w:r/>
-            <w:r>
-              <w:rPr>
-                <w:rFonts w:ascii="Times New Roman" w:hAnsi="Times New Roman" w:eastAsia="Times New Roman"/>
-                <w:b w:val="0"/>
-                <w:i w:val="0"/>
-                <w:sz w:val="20"/>
-              </w:rPr>
-              <w:t>Tidak</w:t>
-            </w:r>
-          </w:p>
-        </w:tc>
-        <w:tc>
-          <w:tcPr>
-            <w:tcW w:type="dxa" w:w="1267"/>
-            <w:tcBorders>
-              <w:top w:sz="4" w:val="single" w:color="000000"/>
-              <w:left w:sz="4" w:val="single" w:color="000000"/>
-              <w:bottom w:sz="4" w:val="single" w:color="000000"/>
-              <w:right w:sz="4" w:val="single" w:color="000000"/>
-            </w:tcBorders>
-          </w:tcPr>
-          <w:p>
-            <w:pPr>
-              <w:spacing w:line="360" w:lineRule="auto" w:before="0" w:after="0"/>
-              <w:jc w:val="center"/>
-            </w:pPr>
-            <w:r/>
-            <w:r>
-              <w:rPr>
-                <w:rFonts w:ascii="Times New Roman" w:hAnsi="Times New Roman" w:eastAsia="Times New Roman"/>
-                <w:b w:val="0"/>
-                <w:i w:val="0"/>
-                <w:sz w:val="20"/>
-              </w:rPr>
-              <w:t>Tidak</w:t>
-            </w:r>
-          </w:p>
-        </w:tc>
-        <w:tc>
-          <w:tcPr>
-            <w:tcW w:type="dxa" w:w="1267"/>
-            <w:tcBorders>
-              <w:top w:sz="4" w:val="single" w:color="000000"/>
-              <w:left w:sz="4" w:val="single" w:color="000000"/>
-              <w:bottom w:sz="4" w:val="single" w:color="000000"/>
-              <w:right w:sz="4" w:val="single" w:color="000000"/>
-            </w:tcBorders>
-          </w:tcPr>
-          <w:p>
-            <w:pPr>
-              <w:spacing w:line="360" w:lineRule="auto" w:before="0" w:after="0"/>
-              <w:jc w:val="center"/>
-            </w:pPr>
-            <w:r/>
-            <w:r>
-              <w:rPr>
-                <w:rFonts w:ascii="Times New Roman" w:hAnsi="Times New Roman" w:eastAsia="Times New Roman"/>
-                <w:b w:val="0"/>
-                <w:i w:val="0"/>
-                <w:sz w:val="20"/>
-              </w:rPr>
-              <w:t>Tidak</w:t>
-            </w:r>
-          </w:p>
-        </w:tc>
-        <w:tc>
-          <w:tcPr>
-            <w:tcW w:type="dxa" w:w="1267"/>
-            <w:tcBorders>
-              <w:top w:sz="4" w:val="single" w:color="000000"/>
-              <w:left w:sz="4" w:val="single" w:color="000000"/>
-              <w:bottom w:sz="4" w:val="single" w:color="000000"/>
-              <w:right w:sz="4" w:val="single" w:color="000000"/>
-            </w:tcBorders>
-          </w:tcPr>
-          <w:p>
-            <w:pPr>
-              <w:spacing w:line="360" w:lineRule="auto" w:before="0" w:after="0"/>
-              <w:jc w:val="center"/>
-            </w:pPr>
-            <w:r/>
-            <w:r>
-              <w:rPr>
-                <w:rFonts w:ascii="Times New Roman" w:hAnsi="Times New Roman" w:eastAsia="Times New Roman"/>
-                <w:b w:val="0"/>
-                <w:i w:val="0"/>
-                <w:sz w:val="20"/>
-              </w:rPr>
-              <w:t>Tidak</w:t>
-            </w:r>
-          </w:p>
-        </w:tc>
-      </w:tr>
-      <w:tr>
-        <w:trPr>
-          <w:cantSplit/>
-        </w:trPr>
-        <w:tc>
-          <w:tcPr>
-            <w:tcW w:type="dxa" w:w="1930"/>
+            <w:tcW w:type="dxa" w:w="1354"/>
             <w:tcBorders>
               <w:top w:sz="4" w:val="single" w:color="000000"/>
               <w:left w:sz="4" w:val="single" w:color="000000"/>
@@ -4140,153 +2315,13 @@
                 <w:i w:val="0"/>
                 <w:sz w:val="20"/>
               </w:rPr>
-              <w:t>Nadig &amp; Vignesh (2026)</w:t>
+              <w:t>Eksekusi tanpa verifikasi analis (risiko false-positive); hanya satu kelas ancaman</w:t>
             </w:r>
           </w:p>
         </w:tc>
         <w:tc>
           <w:tcPr>
-            <w:tcW w:type="dxa" w:w="1267"/>
-            <w:tcBorders>
-              <w:top w:sz="4" w:val="single" w:color="000000"/>
-              <w:left w:sz="4" w:val="single" w:color="000000"/>
-              <w:bottom w:sz="4" w:val="single" w:color="000000"/>
-              <w:right w:sz="4" w:val="single" w:color="000000"/>
-            </w:tcBorders>
-          </w:tcPr>
-          <w:p>
-            <w:pPr>
-              <w:spacing w:line="360" w:lineRule="auto" w:before="0" w:after="0"/>
-              <w:jc w:val="center"/>
-            </w:pPr>
-            <w:r/>
-            <w:r>
-              <w:rPr>
-                <w:rFonts w:ascii="Times New Roman" w:hAnsi="Times New Roman" w:eastAsia="Times New Roman"/>
-                <w:b w:val="0"/>
-                <w:i w:val="0"/>
-                <w:sz w:val="20"/>
-              </w:rPr>
-              <w:t>Parsial</w:t>
-            </w:r>
-          </w:p>
-        </w:tc>
-        <w:tc>
-          <w:tcPr>
-            <w:tcW w:type="dxa" w:w="1267"/>
-            <w:tcBorders>
-              <w:top w:sz="4" w:val="single" w:color="000000"/>
-              <w:left w:sz="4" w:val="single" w:color="000000"/>
-              <w:bottom w:sz="4" w:val="single" w:color="000000"/>
-              <w:right w:sz="4" w:val="single" w:color="000000"/>
-            </w:tcBorders>
-          </w:tcPr>
-          <w:p>
-            <w:pPr>
-              <w:spacing w:line="360" w:lineRule="auto" w:before="0" w:after="0"/>
-              <w:jc w:val="center"/>
-            </w:pPr>
-            <w:r/>
-            <w:r>
-              <w:rPr>
-                <w:rFonts w:ascii="Times New Roman" w:hAnsi="Times New Roman" w:eastAsia="Times New Roman"/>
-                <w:b w:val="0"/>
-                <w:i w:val="0"/>
-                <w:sz w:val="20"/>
-              </w:rPr>
-              <w:t>Tidak</w:t>
-            </w:r>
-          </w:p>
-        </w:tc>
-        <w:tc>
-          <w:tcPr>
-            <w:tcW w:type="dxa" w:w="1267"/>
-            <w:tcBorders>
-              <w:top w:sz="4" w:val="single" w:color="000000"/>
-              <w:left w:sz="4" w:val="single" w:color="000000"/>
-              <w:bottom w:sz="4" w:val="single" w:color="000000"/>
-              <w:right w:sz="4" w:val="single" w:color="000000"/>
-            </w:tcBorders>
-          </w:tcPr>
-          <w:p>
-            <w:pPr>
-              <w:spacing w:line="360" w:lineRule="auto" w:before="0" w:after="0"/>
-              <w:jc w:val="center"/>
-            </w:pPr>
-            <w:r/>
-            <w:r>
-              <w:rPr>
-                <w:rFonts w:ascii="Times New Roman" w:hAnsi="Times New Roman" w:eastAsia="Times New Roman"/>
-                <w:b w:val="0"/>
-                <w:i w:val="0"/>
-                <w:sz w:val="20"/>
-              </w:rPr>
-              <w:t>Tidak</w:t>
-            </w:r>
-          </w:p>
-        </w:tc>
-        <w:tc>
-          <w:tcPr>
-            <w:tcW w:type="dxa" w:w="1267"/>
-            <w:tcBorders>
-              <w:top w:sz="4" w:val="single" w:color="000000"/>
-              <w:left w:sz="4" w:val="single" w:color="000000"/>
-              <w:bottom w:sz="4" w:val="single" w:color="000000"/>
-              <w:right w:sz="4" w:val="single" w:color="000000"/>
-            </w:tcBorders>
-          </w:tcPr>
-          <w:p>
-            <w:pPr>
-              <w:spacing w:line="360" w:lineRule="auto" w:before="0" w:after="0"/>
-              <w:jc w:val="center"/>
-            </w:pPr>
-            <w:r/>
-            <w:r>
-              <w:rPr>
-                <w:rFonts w:ascii="Times New Roman" w:hAnsi="Times New Roman" w:eastAsia="Times New Roman"/>
-                <w:b w:val="0"/>
-                <w:i w:val="0"/>
-                <w:sz w:val="20"/>
-              </w:rPr>
-              <w:t>Tidak</w:t>
-            </w:r>
-          </w:p>
-        </w:tc>
-        <w:tc>
-          <w:tcPr>
-            <w:tcW w:type="dxa" w:w="1267"/>
-            <w:tcBorders>
-              <w:top w:sz="4" w:val="single" w:color="000000"/>
-              <w:left w:sz="4" w:val="single" w:color="000000"/>
-              <w:bottom w:sz="4" w:val="single" w:color="000000"/>
-              <w:right w:sz="4" w:val="single" w:color="000000"/>
-            </w:tcBorders>
-          </w:tcPr>
-          <w:p>
-            <w:pPr>
-              <w:spacing w:line="360" w:lineRule="auto" w:before="0" w:after="0"/>
-              <w:jc w:val="center"/>
-            </w:pPr>
-            <w:r/>
-            <w:r>
-              <w:rPr>
-                <w:rFonts w:ascii="Times New Roman" w:hAnsi="Times New Roman" w:eastAsia="Times New Roman"/>
-                <w:b w:val="0"/>
-                <w:i w:val="0"/>
-                <w:sz w:val="20"/>
-              </w:rPr>
-              <w:t>Tidak</w:t>
-            </w:r>
-          </w:p>
-        </w:tc>
-      </w:tr>
-      <w:tr>
-        <w:trPr>
-          <w:cantSplit/>
-        </w:trPr>
-        <w:tc>
-          <w:tcPr>
-            <w:tcW w:type="dxa" w:w="1930"/>
+            <w:tcW w:type="dxa" w:w="1469"/>
             <w:tcBorders>
               <w:top w:sz="4" w:val="single" w:color="000000"/>
               <w:left w:sz="4" w:val="single" w:color="000000"/>
@@ -4306,142 +2341,7 @@
                 <w:i w:val="0"/>
                 <w:sz w:val="20"/>
               </w:rPr>
-              <w:t>Alves dkk. (2026)</w:t>
-            </w:r>
-          </w:p>
-        </w:tc>
-        <w:tc>
-          <w:tcPr>
-            <w:tcW w:type="dxa" w:w="1267"/>
-            <w:tcBorders>
-              <w:top w:sz="4" w:val="single" w:color="000000"/>
-              <w:left w:sz="4" w:val="single" w:color="000000"/>
-              <w:bottom w:sz="4" w:val="single" w:color="000000"/>
-              <w:right w:sz="4" w:val="single" w:color="000000"/>
-            </w:tcBorders>
-          </w:tcPr>
-          <w:p>
-            <w:pPr>
-              <w:spacing w:line="360" w:lineRule="auto" w:before="0" w:after="0"/>
-              <w:jc w:val="center"/>
-            </w:pPr>
-            <w:r/>
-            <w:r>
-              <w:rPr>
-                <w:rFonts w:ascii="Times New Roman" w:hAnsi="Times New Roman" w:eastAsia="Times New Roman"/>
-                <w:b w:val="0"/>
-                <w:i w:val="0"/>
-                <w:sz w:val="20"/>
-              </w:rPr>
-              <w:t>Tidak</w:t>
-            </w:r>
-          </w:p>
-        </w:tc>
-        <w:tc>
-          <w:tcPr>
-            <w:tcW w:type="dxa" w:w="1267"/>
-            <w:tcBorders>
-              <w:top w:sz="4" w:val="single" w:color="000000"/>
-              <w:left w:sz="4" w:val="single" w:color="000000"/>
-              <w:bottom w:sz="4" w:val="single" w:color="000000"/>
-              <w:right w:sz="4" w:val="single" w:color="000000"/>
-            </w:tcBorders>
-          </w:tcPr>
-          <w:p>
-            <w:pPr>
-              <w:spacing w:line="360" w:lineRule="auto" w:before="0" w:after="0"/>
-              <w:jc w:val="center"/>
-            </w:pPr>
-            <w:r/>
-            <w:r>
-              <w:rPr>
-                <w:rFonts w:ascii="Times New Roman" w:hAnsi="Times New Roman" w:eastAsia="Times New Roman"/>
-                <w:b w:val="0"/>
-                <w:i w:val="0"/>
-                <w:sz w:val="20"/>
-              </w:rPr>
-              <w:t>Tidak</w:t>
-            </w:r>
-          </w:p>
-        </w:tc>
-        <w:tc>
-          <w:tcPr>
-            <w:tcW w:type="dxa" w:w="1267"/>
-            <w:tcBorders>
-              <w:top w:sz="4" w:val="single" w:color="000000"/>
-              <w:left w:sz="4" w:val="single" w:color="000000"/>
-              <w:bottom w:sz="4" w:val="single" w:color="000000"/>
-              <w:right w:sz="4" w:val="single" w:color="000000"/>
-            </w:tcBorders>
-          </w:tcPr>
-          <w:p>
-            <w:pPr>
-              <w:spacing w:line="360" w:lineRule="auto" w:before="0" w:after="0"/>
-              <w:jc w:val="center"/>
-            </w:pPr>
-            <w:r/>
-            <w:r>
-              <w:rPr>
-                <w:rFonts w:ascii="Times New Roman" w:hAnsi="Times New Roman" w:eastAsia="Times New Roman"/>
-                <w:b w:val="0"/>
-                <w:i w:val="0"/>
-                <w:sz w:val="20"/>
-              </w:rPr>
-              <w:t>Tidak</w:t>
-            </w:r>
-          </w:p>
-        </w:tc>
-        <w:tc>
-          <w:tcPr>
-            <w:tcW w:type="dxa" w:w="1267"/>
-            <w:tcBorders>
-              <w:top w:sz="4" w:val="single" w:color="000000"/>
-              <w:left w:sz="4" w:val="single" w:color="000000"/>
-              <w:bottom w:sz="4" w:val="single" w:color="000000"/>
-              <w:right w:sz="4" w:val="single" w:color="000000"/>
-            </w:tcBorders>
-          </w:tcPr>
-          <w:p>
-            <w:pPr>
-              <w:spacing w:line="360" w:lineRule="auto" w:before="0" w:after="0"/>
-              <w:jc w:val="center"/>
-            </w:pPr>
-            <w:r/>
-            <w:r>
-              <w:rPr>
-                <w:rFonts w:ascii="Times New Roman" w:hAnsi="Times New Roman" w:eastAsia="Times New Roman"/>
-                <w:b w:val="0"/>
-                <w:i w:val="0"/>
-                <w:sz w:val="20"/>
-              </w:rPr>
-              <w:t>Tidak</w:t>
-            </w:r>
-          </w:p>
-        </w:tc>
-        <w:tc>
-          <w:tcPr>
-            <w:tcW w:type="dxa" w:w="1267"/>
-            <w:tcBorders>
-              <w:top w:sz="4" w:val="single" w:color="000000"/>
-              <w:left w:sz="4" w:val="single" w:color="000000"/>
-              <w:bottom w:sz="4" w:val="single" w:color="000000"/>
-              <w:right w:sz="4" w:val="single" w:color="000000"/>
-            </w:tcBorders>
-          </w:tcPr>
-          <w:p>
-            <w:pPr>
-              <w:spacing w:line="360" w:lineRule="auto" w:before="0" w:after="0"/>
-              <w:jc w:val="center"/>
-            </w:pPr>
-            <w:r/>
-            <w:r>
-              <w:rPr>
-                <w:rFonts w:ascii="Times New Roman" w:hAnsi="Times New Roman" w:eastAsia="Times New Roman"/>
-                <w:b w:val="0"/>
-                <w:i w:val="0"/>
-                <w:sz w:val="20"/>
-              </w:rPr>
-              <w:t>Tidak</w:t>
+              <w:t>Respons berjenjang berbasis verifikasi multi-sumber dan mitigasi human-in-the-loop dua arah sebelum eksekusi</w:t>
             </w:r>
           </w:p>
         </w:tc>
@@ -4452,7 +2352,7 @@
         </w:trPr>
         <w:tc>
           <w:tcPr>
-            <w:tcW w:type="dxa" w:w="1930"/>
+            <w:tcW w:type="dxa" w:w="1584"/>
             <w:tcBorders>
               <w:top w:sz="4" w:val="single" w:color="000000"/>
               <w:left w:sz="4" w:val="single" w:color="000000"/>
@@ -4472,153 +2372,13 @@
                 <w:i w:val="0"/>
                 <w:sz w:val="20"/>
               </w:rPr>
-              <w:t>Raed (2025)</w:t>
+              <w:t>Farrel (2024) — SIEM Wazuh dengan Active Response dan notifikasi Telegram untuk brute force</w:t>
             </w:r>
           </w:p>
         </w:tc>
         <w:tc>
           <w:tcPr>
             <w:tcW w:type="dxa" w:w="1267"/>
-            <w:tcBorders>
-              <w:top w:sz="4" w:val="single" w:color="000000"/>
-              <w:left w:sz="4" w:val="single" w:color="000000"/>
-              <w:bottom w:sz="4" w:val="single" w:color="000000"/>
-              <w:right w:sz="4" w:val="single" w:color="000000"/>
-            </w:tcBorders>
-          </w:tcPr>
-          <w:p>
-            <w:pPr>
-              <w:spacing w:line="360" w:lineRule="auto" w:before="0" w:after="0"/>
-              <w:jc w:val="center"/>
-            </w:pPr>
-            <w:r/>
-            <w:r>
-              <w:rPr>
-                <w:rFonts w:ascii="Times New Roman" w:hAnsi="Times New Roman" w:eastAsia="Times New Roman"/>
-                <w:b w:val="0"/>
-                <w:i w:val="0"/>
-                <w:sz w:val="20"/>
-              </w:rPr>
-              <w:t>Parsial</w:t>
-            </w:r>
-          </w:p>
-        </w:tc>
-        <w:tc>
-          <w:tcPr>
-            <w:tcW w:type="dxa" w:w="1267"/>
-            <w:tcBorders>
-              <w:top w:sz="4" w:val="single" w:color="000000"/>
-              <w:left w:sz="4" w:val="single" w:color="000000"/>
-              <w:bottom w:sz="4" w:val="single" w:color="000000"/>
-              <w:right w:sz="4" w:val="single" w:color="000000"/>
-            </w:tcBorders>
-          </w:tcPr>
-          <w:p>
-            <w:pPr>
-              <w:spacing w:line="360" w:lineRule="auto" w:before="0" w:after="0"/>
-              <w:jc w:val="center"/>
-            </w:pPr>
-            <w:r/>
-            <w:r>
-              <w:rPr>
-                <w:rFonts w:ascii="Times New Roman" w:hAnsi="Times New Roman" w:eastAsia="Times New Roman"/>
-                <w:b w:val="0"/>
-                <w:i w:val="0"/>
-                <w:sz w:val="20"/>
-              </w:rPr>
-              <w:t>Tidak</w:t>
-            </w:r>
-          </w:p>
-        </w:tc>
-        <w:tc>
-          <w:tcPr>
-            <w:tcW w:type="dxa" w:w="1267"/>
-            <w:tcBorders>
-              <w:top w:sz="4" w:val="single" w:color="000000"/>
-              <w:left w:sz="4" w:val="single" w:color="000000"/>
-              <w:bottom w:sz="4" w:val="single" w:color="000000"/>
-              <w:right w:sz="4" w:val="single" w:color="000000"/>
-            </w:tcBorders>
-          </w:tcPr>
-          <w:p>
-            <w:pPr>
-              <w:spacing w:line="360" w:lineRule="auto" w:before="0" w:after="0"/>
-              <w:jc w:val="center"/>
-            </w:pPr>
-            <w:r/>
-            <w:r>
-              <w:rPr>
-                <w:rFonts w:ascii="Times New Roman" w:hAnsi="Times New Roman" w:eastAsia="Times New Roman"/>
-                <w:b w:val="0"/>
-                <w:i w:val="0"/>
-                <w:sz w:val="20"/>
-              </w:rPr>
-              <w:t>Parsial</w:t>
-            </w:r>
-          </w:p>
-        </w:tc>
-        <w:tc>
-          <w:tcPr>
-            <w:tcW w:type="dxa" w:w="1267"/>
-            <w:tcBorders>
-              <w:top w:sz="4" w:val="single" w:color="000000"/>
-              <w:left w:sz="4" w:val="single" w:color="000000"/>
-              <w:bottom w:sz="4" w:val="single" w:color="000000"/>
-              <w:right w:sz="4" w:val="single" w:color="000000"/>
-            </w:tcBorders>
-          </w:tcPr>
-          <w:p>
-            <w:pPr>
-              <w:spacing w:line="360" w:lineRule="auto" w:before="0" w:after="0"/>
-              <w:jc w:val="center"/>
-            </w:pPr>
-            <w:r/>
-            <w:r>
-              <w:rPr>
-                <w:rFonts w:ascii="Times New Roman" w:hAnsi="Times New Roman" w:eastAsia="Times New Roman"/>
-                <w:b w:val="0"/>
-                <w:i w:val="0"/>
-                <w:sz w:val="20"/>
-              </w:rPr>
-              <w:t>Tidak</w:t>
-            </w:r>
-          </w:p>
-        </w:tc>
-        <w:tc>
-          <w:tcPr>
-            <w:tcW w:type="dxa" w:w="1267"/>
-            <w:tcBorders>
-              <w:top w:sz="4" w:val="single" w:color="000000"/>
-              <w:left w:sz="4" w:val="single" w:color="000000"/>
-              <w:bottom w:sz="4" w:val="single" w:color="000000"/>
-              <w:right w:sz="4" w:val="single" w:color="000000"/>
-            </w:tcBorders>
-          </w:tcPr>
-          <w:p>
-            <w:pPr>
-              <w:spacing w:line="360" w:lineRule="auto" w:before="0" w:after="0"/>
-              <w:jc w:val="center"/>
-            </w:pPr>
-            <w:r/>
-            <w:r>
-              <w:rPr>
-                <w:rFonts w:ascii="Times New Roman" w:hAnsi="Times New Roman" w:eastAsia="Times New Roman"/>
-                <w:b w:val="0"/>
-                <w:i w:val="0"/>
-                <w:sz w:val="20"/>
-              </w:rPr>
-              <w:t>Tidak</w:t>
-            </w:r>
-          </w:p>
-        </w:tc>
-      </w:tr>
-      <w:tr>
-        <w:trPr>
-          <w:cantSplit/>
-        </w:trPr>
-        <w:tc>
-          <w:tcPr>
-            <w:tcW w:type="dxa" w:w="1930"/>
             <w:tcBorders>
               <w:top w:sz="4" w:val="single" w:color="000000"/>
               <w:left w:sz="4" w:val="single" w:color="000000"/>
@@ -4638,153 +2398,13 @@
                 <w:i w:val="0"/>
                 <w:sz w:val="20"/>
               </w:rPr>
-              <w:t>zhadyz (2025)</w:t>
+              <w:t>Mitigasi serangan brute force pada sistem informasi</w:t>
             </w:r>
           </w:p>
         </w:tc>
         <w:tc>
           <w:tcPr>
             <w:tcW w:type="dxa" w:w="1267"/>
-            <w:tcBorders>
-              <w:top w:sz="4" w:val="single" w:color="000000"/>
-              <w:left w:sz="4" w:val="single" w:color="000000"/>
-              <w:bottom w:sz="4" w:val="single" w:color="000000"/>
-              <w:right w:sz="4" w:val="single" w:color="000000"/>
-            </w:tcBorders>
-          </w:tcPr>
-          <w:p>
-            <w:pPr>
-              <w:spacing w:line="360" w:lineRule="auto" w:before="0" w:after="0"/>
-              <w:jc w:val="center"/>
-            </w:pPr>
-            <w:r/>
-            <w:r>
-              <w:rPr>
-                <w:rFonts w:ascii="Times New Roman" w:hAnsi="Times New Roman" w:eastAsia="Times New Roman"/>
-                <w:b w:val="0"/>
-                <w:i w:val="0"/>
-                <w:sz w:val="20"/>
-              </w:rPr>
-              <w:t>Parsial</w:t>
-            </w:r>
-          </w:p>
-        </w:tc>
-        <w:tc>
-          <w:tcPr>
-            <w:tcW w:type="dxa" w:w="1267"/>
-            <w:tcBorders>
-              <w:top w:sz="4" w:val="single" w:color="000000"/>
-              <w:left w:sz="4" w:val="single" w:color="000000"/>
-              <w:bottom w:sz="4" w:val="single" w:color="000000"/>
-              <w:right w:sz="4" w:val="single" w:color="000000"/>
-            </w:tcBorders>
-          </w:tcPr>
-          <w:p>
-            <w:pPr>
-              <w:spacing w:line="360" w:lineRule="auto" w:before="0" w:after="0"/>
-              <w:jc w:val="center"/>
-            </w:pPr>
-            <w:r/>
-            <w:r>
-              <w:rPr>
-                <w:rFonts w:ascii="Times New Roman" w:hAnsi="Times New Roman" w:eastAsia="Times New Roman"/>
-                <w:b w:val="0"/>
-                <w:i w:val="0"/>
-                <w:sz w:val="20"/>
-              </w:rPr>
-              <w:t>Tidak</w:t>
-            </w:r>
-          </w:p>
-        </w:tc>
-        <w:tc>
-          <w:tcPr>
-            <w:tcW w:type="dxa" w:w="1267"/>
-            <w:tcBorders>
-              <w:top w:sz="4" w:val="single" w:color="000000"/>
-              <w:left w:sz="4" w:val="single" w:color="000000"/>
-              <w:bottom w:sz="4" w:val="single" w:color="000000"/>
-              <w:right w:sz="4" w:val="single" w:color="000000"/>
-            </w:tcBorders>
-          </w:tcPr>
-          <w:p>
-            <w:pPr>
-              <w:spacing w:line="360" w:lineRule="auto" w:before="0" w:after="0"/>
-              <w:jc w:val="center"/>
-            </w:pPr>
-            <w:r/>
-            <w:r>
-              <w:rPr>
-                <w:rFonts w:ascii="Times New Roman" w:hAnsi="Times New Roman" w:eastAsia="Times New Roman"/>
-                <w:b w:val="0"/>
-                <w:i w:val="0"/>
-                <w:sz w:val="20"/>
-              </w:rPr>
-              <w:t>Parsial</w:t>
-            </w:r>
-          </w:p>
-        </w:tc>
-        <w:tc>
-          <w:tcPr>
-            <w:tcW w:type="dxa" w:w="1267"/>
-            <w:tcBorders>
-              <w:top w:sz="4" w:val="single" w:color="000000"/>
-              <w:left w:sz="4" w:val="single" w:color="000000"/>
-              <w:bottom w:sz="4" w:val="single" w:color="000000"/>
-              <w:right w:sz="4" w:val="single" w:color="000000"/>
-            </w:tcBorders>
-          </w:tcPr>
-          <w:p>
-            <w:pPr>
-              <w:spacing w:line="360" w:lineRule="auto" w:before="0" w:after="0"/>
-              <w:jc w:val="center"/>
-            </w:pPr>
-            <w:r/>
-            <w:r>
-              <w:rPr>
-                <w:rFonts w:ascii="Times New Roman" w:hAnsi="Times New Roman" w:eastAsia="Times New Roman"/>
-                <w:b w:val="0"/>
-                <w:i w:val="0"/>
-                <w:sz w:val="20"/>
-              </w:rPr>
-              <w:t>Ya</w:t>
-            </w:r>
-          </w:p>
-        </w:tc>
-        <w:tc>
-          <w:tcPr>
-            <w:tcW w:type="dxa" w:w="1267"/>
-            <w:tcBorders>
-              <w:top w:sz="4" w:val="single" w:color="000000"/>
-              <w:left w:sz="4" w:val="single" w:color="000000"/>
-              <w:bottom w:sz="4" w:val="single" w:color="000000"/>
-              <w:right w:sz="4" w:val="single" w:color="000000"/>
-            </w:tcBorders>
-          </w:tcPr>
-          <w:p>
-            <w:pPr>
-              <w:spacing w:line="360" w:lineRule="auto" w:before="0" w:after="0"/>
-              <w:jc w:val="center"/>
-            </w:pPr>
-            <w:r/>
-            <w:r>
-              <w:rPr>
-                <w:rFonts w:ascii="Times New Roman" w:hAnsi="Times New Roman" w:eastAsia="Times New Roman"/>
-                <w:b w:val="0"/>
-                <w:i w:val="0"/>
-                <w:sz w:val="20"/>
-              </w:rPr>
-              <w:t>Parsial</w:t>
-            </w:r>
-          </w:p>
-        </w:tc>
-      </w:tr>
-      <w:tr>
-        <w:trPr>
-          <w:cantSplit/>
-        </w:trPr>
-        <w:tc>
-          <w:tcPr>
-            <w:tcW w:type="dxa" w:w="1930"/>
             <w:tcBorders>
               <w:top w:sz="4" w:val="single" w:color="000000"/>
               <w:left w:sz="4" w:val="single" w:color="000000"/>
@@ -4804,7 +2424,116 @@
                 <w:i w:val="0"/>
                 <w:sz w:val="20"/>
               </w:rPr>
-              <w:t>Usulan (2026)</w:t>
+              <w:t>Wazuh Active Response dengan notifikasi Telegram</w:t>
+            </w:r>
+          </w:p>
+        </w:tc>
+        <w:tc>
+          <w:tcPr>
+            <w:tcW w:type="dxa" w:w="1325"/>
+            <w:tcBorders>
+              <w:top w:sz="4" w:val="single" w:color="000000"/>
+              <w:left w:sz="4" w:val="single" w:color="000000"/>
+              <w:bottom w:sz="4" w:val="single" w:color="000000"/>
+              <w:right w:sz="4" w:val="single" w:color="000000"/>
+            </w:tcBorders>
+          </w:tcPr>
+          <w:p>
+            <w:pPr>
+              <w:spacing w:line="360" w:lineRule="auto" w:before="0" w:after="0"/>
+            </w:pPr>
+            <w:r/>
+            <w:r>
+              <w:rPr>
+                <w:rFonts w:ascii="Times New Roman" w:hAnsi="Times New Roman" w:eastAsia="Times New Roman"/>
+                <w:b w:val="0"/>
+                <w:i w:val="0"/>
+                <w:sz w:val="20"/>
+              </w:rPr>
+              <w:t>Active Response otomatis; notifikasi Telegram satu arah</w:t>
+            </w:r>
+          </w:p>
+        </w:tc>
+        <w:tc>
+          <w:tcPr>
+            <w:tcW w:type="dxa" w:w="1354"/>
+            <w:tcBorders>
+              <w:top w:sz="4" w:val="single" w:color="000000"/>
+              <w:left w:sz="4" w:val="single" w:color="000000"/>
+              <w:bottom w:sz="4" w:val="single" w:color="000000"/>
+              <w:right w:sz="4" w:val="single" w:color="000000"/>
+            </w:tcBorders>
+          </w:tcPr>
+          <w:p>
+            <w:pPr>
+              <w:spacing w:line="360" w:lineRule="auto" w:before="0" w:after="0"/>
+            </w:pPr>
+            <w:r/>
+            <w:r>
+              <w:rPr>
+                <w:rFonts w:ascii="Times New Roman" w:hAnsi="Times New Roman" w:eastAsia="Times New Roman"/>
+                <w:b w:val="0"/>
+                <w:i w:val="0"/>
+                <w:sz w:val="20"/>
+              </w:rPr>
+              <w:t>Notifikasi satu arah, analis harus pindah ke dasbor; hanya brute force</w:t>
+            </w:r>
+          </w:p>
+        </w:tc>
+        <w:tc>
+          <w:tcPr>
+            <w:tcW w:type="dxa" w:w="1469"/>
+            <w:tcBorders>
+              <w:top w:sz="4" w:val="single" w:color="000000"/>
+              <w:left w:sz="4" w:val="single" w:color="000000"/>
+              <w:bottom w:sz="4" w:val="single" w:color="000000"/>
+              <w:right w:sz="4" w:val="single" w:color="000000"/>
+            </w:tcBorders>
+          </w:tcPr>
+          <w:p>
+            <w:pPr>
+              <w:spacing w:line="360" w:lineRule="auto" w:before="0" w:after="0"/>
+            </w:pPr>
+            <w:r/>
+            <w:r>
+              <w:rPr>
+                <w:rFonts w:ascii="Times New Roman" w:hAnsi="Times New Roman" w:eastAsia="Times New Roman"/>
+                <w:b w:val="0"/>
+                <w:i w:val="0"/>
+                <w:sz w:val="20"/>
+              </w:rPr>
+              <w:t>Notifikasi Telegram interaktif dua arah; analis menyetujui atau menolak mitigasi langsung dari chat</w:t>
+            </w:r>
+          </w:p>
+        </w:tc>
+      </w:tr>
+      <w:tr>
+        <w:trPr>
+          <w:cantSplit/>
+        </w:trPr>
+        <w:tc>
+          <w:tcPr>
+            <w:tcW w:type="dxa" w:w="1584"/>
+            <w:tcBorders>
+              <w:top w:sz="4" w:val="single" w:color="000000"/>
+              <w:left w:sz="4" w:val="single" w:color="000000"/>
+              <w:bottom w:sz="4" w:val="single" w:color="000000"/>
+              <w:right w:sz="4" w:val="single" w:color="000000"/>
+            </w:tcBorders>
+          </w:tcPr>
+          <w:p>
+            <w:pPr>
+              <w:spacing w:line="360" w:lineRule="auto" w:before="0" w:after="0"/>
+            </w:pPr>
+            <w:r/>
+            <w:r>
+              <w:rPr>
+                <w:rFonts w:ascii="Times New Roman" w:hAnsi="Times New Roman" w:eastAsia="Times New Roman"/>
+                <w:b w:val="0"/>
+                <w:i w:val="0"/>
+                <w:sz w:val="20"/>
+              </w:rPr>
+              <w:t>Sarker (2025) — otomasi SOC: Wazuh, n8n, VirusTotal, dan Gmail untuk deteksi file berbahaya</w:t>
             </w:r>
           </w:p>
         </w:tc>
@@ -4821,7 +2550,6 @@
           <w:p>
             <w:pPr>
               <w:spacing w:line="360" w:lineRule="auto" w:before="0" w:after="0"/>
-              <w:jc w:val="center"/>
             </w:pPr>
             <w:r/>
             <w:r>
@@ -4831,7 +2559,7 @@
                 <w:i w:val="0"/>
                 <w:sz w:val="20"/>
               </w:rPr>
-              <w:t>Ya</w:t>
+              <w:t>Deteksi file berbahaya berbasis orkestrasi n8n</w:t>
             </w:r>
           </w:p>
         </w:tc>
@@ -4848,7 +2576,6 @@
           <w:p>
             <w:pPr>
               <w:spacing w:line="360" w:lineRule="auto" w:before="0" w:after="0"/>
-              <w:jc w:val="center"/>
             </w:pPr>
             <w:r/>
             <w:r>
@@ -4858,7 +2585,116 @@
                 <w:i w:val="0"/>
                 <w:sz w:val="20"/>
               </w:rPr>
-              <w:t>Ya</w:t>
+              <w:t>Orkestrasi n8n dengan VirusTotal dan notifikasi Gmail</w:t>
+            </w:r>
+          </w:p>
+        </w:tc>
+        <w:tc>
+          <w:tcPr>
+            <w:tcW w:type="dxa" w:w="1325"/>
+            <w:tcBorders>
+              <w:top w:sz="4" w:val="single" w:color="000000"/>
+              <w:left w:sz="4" w:val="single" w:color="000000"/>
+              <w:bottom w:sz="4" w:val="single" w:color="000000"/>
+              <w:right w:sz="4" w:val="single" w:color="000000"/>
+            </w:tcBorders>
+          </w:tcPr>
+          <w:p>
+            <w:pPr>
+              <w:spacing w:line="360" w:lineRule="auto" w:before="0" w:after="0"/>
+            </w:pPr>
+            <w:r/>
+            <w:r>
+              <w:rPr>
+                <w:rFonts w:ascii="Times New Roman" w:hAnsi="Times New Roman" w:eastAsia="Times New Roman"/>
+                <w:b w:val="0"/>
+                <w:i w:val="0"/>
+                <w:sz w:val="20"/>
+              </w:rPr>
+              <w:t>Notifikasi email satu arah; tanpa mitigasi aktif</w:t>
+            </w:r>
+          </w:p>
+        </w:tc>
+        <w:tc>
+          <w:tcPr>
+            <w:tcW w:type="dxa" w:w="1354"/>
+            <w:tcBorders>
+              <w:top w:sz="4" w:val="single" w:color="000000"/>
+              <w:left w:sz="4" w:val="single" w:color="000000"/>
+              <w:bottom w:sz="4" w:val="single" w:color="000000"/>
+              <w:right w:sz="4" w:val="single" w:color="000000"/>
+            </w:tcBorders>
+          </w:tcPr>
+          <w:p>
+            <w:pPr>
+              <w:spacing w:line="360" w:lineRule="auto" w:before="0" w:after="0"/>
+            </w:pPr>
+            <w:r/>
+            <w:r>
+              <w:rPr>
+                <w:rFonts w:ascii="Times New Roman" w:hAnsi="Times New Roman" w:eastAsia="Times New Roman"/>
+                <w:b w:val="0"/>
+                <w:i w:val="0"/>
+                <w:sz w:val="20"/>
+              </w:rPr>
+              <w:t>Tidak ada kanal keputusan interaktif; fokus malware saja; tanpa AI lokal</w:t>
+            </w:r>
+          </w:p>
+        </w:tc>
+        <w:tc>
+          <w:tcPr>
+            <w:tcW w:type="dxa" w:w="1469"/>
+            <w:tcBorders>
+              <w:top w:sz="4" w:val="single" w:color="000000"/>
+              <w:left w:sz="4" w:val="single" w:color="000000"/>
+              <w:bottom w:sz="4" w:val="single" w:color="000000"/>
+              <w:right w:sz="4" w:val="single" w:color="000000"/>
+            </w:tcBorders>
+          </w:tcPr>
+          <w:p>
+            <w:pPr>
+              <w:spacing w:line="360" w:lineRule="auto" w:before="0" w:after="0"/>
+            </w:pPr>
+            <w:r/>
+            <w:r>
+              <w:rPr>
+                <w:rFonts w:ascii="Times New Roman" w:hAnsi="Times New Roman" w:eastAsia="Times New Roman"/>
+                <w:b w:val="0"/>
+                <w:i w:val="0"/>
+                <w:sz w:val="20"/>
+              </w:rPr>
+              <w:t>Mitigasi aktif (karantina dan sinkhole) melalui keputusan analis serta analisis AI lokal</w:t>
+            </w:r>
+          </w:p>
+        </w:tc>
+      </w:tr>
+      <w:tr>
+        <w:trPr>
+          <w:cantSplit/>
+        </w:trPr>
+        <w:tc>
+          <w:tcPr>
+            <w:tcW w:type="dxa" w:w="1584"/>
+            <w:tcBorders>
+              <w:top w:sz="4" w:val="single" w:color="000000"/>
+              <w:left w:sz="4" w:val="single" w:color="000000"/>
+              <w:bottom w:sz="4" w:val="single" w:color="000000"/>
+              <w:right w:sz="4" w:val="single" w:color="000000"/>
+            </w:tcBorders>
+          </w:tcPr>
+          <w:p>
+            <w:pPr>
+              <w:spacing w:line="360" w:lineRule="auto" w:before="0" w:after="0"/>
+            </w:pPr>
+            <w:r/>
+            <w:r>
+              <w:rPr>
+                <w:rFonts w:ascii="Times New Roman" w:hAnsi="Times New Roman" w:eastAsia="Times New Roman"/>
+                <w:b w:val="0"/>
+                <w:i w:val="0"/>
+                <w:sz w:val="20"/>
+              </w:rPr>
+              <w:t>n8n (n.d.) — template workflow: Wazuh ke VirusTotal dengan alert Slack</w:t>
             </w:r>
           </w:p>
         </w:tc>
@@ -4875,7 +2711,6 @@
           <w:p>
             <w:pPr>
               <w:spacing w:line="360" w:lineRule="auto" w:before="0" w:after="0"/>
-              <w:jc w:val="center"/>
             </w:pPr>
             <w:r/>
             <w:r>
@@ -4885,7 +2720,7 @@
                 <w:i w:val="0"/>
                 <w:sz w:val="20"/>
               </w:rPr>
-              <w:t>Ya</w:t>
+              <w:t>Notifikasi deteksi file berbahaya ke Slack</w:t>
             </w:r>
           </w:p>
         </w:tc>
@@ -4902,7 +2737,6 @@
           <w:p>
             <w:pPr>
               <w:spacing w:line="360" w:lineRule="auto" w:before="0" w:after="0"/>
-              <w:jc w:val="center"/>
             </w:pPr>
             <w:r/>
             <w:r>
@@ -4912,7 +2746,116 @@
                 <w:i w:val="0"/>
                 <w:sz w:val="20"/>
               </w:rPr>
-              <w:t>Ya</w:t>
+              <w:t>Template workflow n8n dengan VirusTotal</w:t>
+            </w:r>
+          </w:p>
+        </w:tc>
+        <w:tc>
+          <w:tcPr>
+            <w:tcW w:type="dxa" w:w="1325"/>
+            <w:tcBorders>
+              <w:top w:sz="4" w:val="single" w:color="000000"/>
+              <w:left w:sz="4" w:val="single" w:color="000000"/>
+              <w:bottom w:sz="4" w:val="single" w:color="000000"/>
+              <w:right w:sz="4" w:val="single" w:color="000000"/>
+            </w:tcBorders>
+          </w:tcPr>
+          <w:p>
+            <w:pPr>
+              <w:spacing w:line="360" w:lineRule="auto" w:before="0" w:after="0"/>
+            </w:pPr>
+            <w:r/>
+            <w:r>
+              <w:rPr>
+                <w:rFonts w:ascii="Times New Roman" w:hAnsi="Times New Roman" w:eastAsia="Times New Roman"/>
+                <w:b w:val="0"/>
+                <w:i w:val="0"/>
+                <w:sz w:val="20"/>
+              </w:rPr>
+              <w:t>Notifikasi Slack satu arah; tanpa mitigasi</w:t>
+            </w:r>
+          </w:p>
+        </w:tc>
+        <w:tc>
+          <w:tcPr>
+            <w:tcW w:type="dxa" w:w="1354"/>
+            <w:tcBorders>
+              <w:top w:sz="4" w:val="single" w:color="000000"/>
+              <w:left w:sz="4" w:val="single" w:color="000000"/>
+              <w:bottom w:sz="4" w:val="single" w:color="000000"/>
+              <w:right w:sz="4" w:val="single" w:color="000000"/>
+            </w:tcBorders>
+          </w:tcPr>
+          <w:p>
+            <w:pPr>
+              <w:spacing w:line="360" w:lineRule="auto" w:before="0" w:after="0"/>
+            </w:pPr>
+            <w:r/>
+            <w:r>
+              <w:rPr>
+                <w:rFonts w:ascii="Times New Roman" w:hAnsi="Times New Roman" w:eastAsia="Times New Roman"/>
+                <w:b w:val="0"/>
+                <w:i w:val="0"/>
+                <w:sz w:val="20"/>
+              </w:rPr>
+              <w:t>Hanya notifikasi; malware saja; tanpa mitigasi dua arah maupun AI lokal</w:t>
+            </w:r>
+          </w:p>
+        </w:tc>
+        <w:tc>
+          <w:tcPr>
+            <w:tcW w:type="dxa" w:w="1469"/>
+            <w:tcBorders>
+              <w:top w:sz="4" w:val="single" w:color="000000"/>
+              <w:left w:sz="4" w:val="single" w:color="000000"/>
+              <w:bottom w:sz="4" w:val="single" w:color="000000"/>
+              <w:right w:sz="4" w:val="single" w:color="000000"/>
+            </w:tcBorders>
+          </w:tcPr>
+          <w:p>
+            <w:pPr>
+              <w:spacing w:line="360" w:lineRule="auto" w:before="0" w:after="0"/>
+            </w:pPr>
+            <w:r/>
+            <w:r>
+              <w:rPr>
+                <w:rFonts w:ascii="Times New Roman" w:hAnsi="Times New Roman" w:eastAsia="Times New Roman"/>
+                <w:b w:val="0"/>
+                <w:i w:val="0"/>
+                <w:sz w:val="20"/>
+              </w:rPr>
+              <w:t>Playbook lengkap dengan mitigasi aktif dua arah, dua kelas ancaman, dan AI lokal</w:t>
+            </w:r>
+          </w:p>
+        </w:tc>
+      </w:tr>
+      <w:tr>
+        <w:trPr>
+          <w:cantSplit/>
+        </w:trPr>
+        <w:tc>
+          <w:tcPr>
+            <w:tcW w:type="dxa" w:w="1584"/>
+            <w:tcBorders>
+              <w:top w:sz="4" w:val="single" w:color="000000"/>
+              <w:left w:sz="4" w:val="single" w:color="000000"/>
+              <w:bottom w:sz="4" w:val="single" w:color="000000"/>
+              <w:right w:sz="4" w:val="single" w:color="000000"/>
+            </w:tcBorders>
+          </w:tcPr>
+          <w:p>
+            <w:pPr>
+              <w:spacing w:line="360" w:lineRule="auto" w:before="0" w:after="0"/>
+            </w:pPr>
+            <w:r/>
+            <w:r>
+              <w:rPr>
+                <w:rFonts w:ascii="Times New Roman" w:hAnsi="Times New Roman" w:eastAsia="Times New Roman"/>
+                <w:b w:val="0"/>
+                <w:i w:val="0"/>
+                <w:sz w:val="20"/>
+              </w:rPr>
+              <w:t>Nadig &amp; Vignesh (2026) — peningkatan Wazuh SIEM melalui integrasi SOAR untuk respons otomatis</w:t>
             </w:r>
           </w:p>
         </w:tc>
@@ -4929,7 +2872,6 @@
           <w:p>
             <w:pPr>
               <w:spacing w:line="360" w:lineRule="auto" w:before="0" w:after="0"/>
-              <w:jc w:val="center"/>
             </w:pPr>
             <w:r/>
             <w:r>
@@ -4939,7 +2881,594 @@
                 <w:i w:val="0"/>
                 <w:sz w:val="20"/>
               </w:rPr>
-              <w:t>Ya</w:t>
+              <w:t>Respons ancaman otomatis melalui integrasi SOAR</w:t>
+            </w:r>
+          </w:p>
+        </w:tc>
+        <w:tc>
+          <w:tcPr>
+            <w:tcW w:type="dxa" w:w="1267"/>
+            <w:tcBorders>
+              <w:top w:sz="4" w:val="single" w:color="000000"/>
+              <w:left w:sz="4" w:val="single" w:color="000000"/>
+              <w:bottom w:sz="4" w:val="single" w:color="000000"/>
+              <w:right w:sz="4" w:val="single" w:color="000000"/>
+            </w:tcBorders>
+          </w:tcPr>
+          <w:p>
+            <w:pPr>
+              <w:spacing w:line="360" w:lineRule="auto" w:before="0" w:after="0"/>
+            </w:pPr>
+            <w:r/>
+            <w:r>
+              <w:rPr>
+                <w:rFonts w:ascii="Times New Roman" w:hAnsi="Times New Roman" w:eastAsia="Times New Roman"/>
+                <w:b w:val="0"/>
+                <w:i w:val="0"/>
+                <w:sz w:val="20"/>
+              </w:rPr>
+              <w:t>Integrasi Wazuh dengan SOAR; respons otomatis</w:t>
+            </w:r>
+          </w:p>
+        </w:tc>
+        <w:tc>
+          <w:tcPr>
+            <w:tcW w:type="dxa" w:w="1325"/>
+            <w:tcBorders>
+              <w:top w:sz="4" w:val="single" w:color="000000"/>
+              <w:left w:sz="4" w:val="single" w:color="000000"/>
+              <w:bottom w:sz="4" w:val="single" w:color="000000"/>
+              <w:right w:sz="4" w:val="single" w:color="000000"/>
+            </w:tcBorders>
+          </w:tcPr>
+          <w:p>
+            <w:pPr>
+              <w:spacing w:line="360" w:lineRule="auto" w:before="0" w:after="0"/>
+            </w:pPr>
+            <w:r/>
+            <w:r>
+              <w:rPr>
+                <w:rFonts w:ascii="Times New Roman" w:hAnsi="Times New Roman" w:eastAsia="Times New Roman"/>
+                <w:b w:val="0"/>
+                <w:i w:val="0"/>
+                <w:sz w:val="20"/>
+              </w:rPr>
+              <w:t>Respons otomatis; tanpa keterlibatan analis</w:t>
+            </w:r>
+          </w:p>
+        </w:tc>
+        <w:tc>
+          <w:tcPr>
+            <w:tcW w:type="dxa" w:w="1354"/>
+            <w:tcBorders>
+              <w:top w:sz="4" w:val="single" w:color="000000"/>
+              <w:left w:sz="4" w:val="single" w:color="000000"/>
+              <w:bottom w:sz="4" w:val="single" w:color="000000"/>
+              <w:right w:sz="4" w:val="single" w:color="000000"/>
+            </w:tcBorders>
+          </w:tcPr>
+          <w:p>
+            <w:pPr>
+              <w:spacing w:line="360" w:lineRule="auto" w:before="0" w:after="0"/>
+            </w:pPr>
+            <w:r/>
+            <w:r>
+              <w:rPr>
+                <w:rFonts w:ascii="Times New Roman" w:hAnsi="Times New Roman" w:eastAsia="Times New Roman"/>
+                <w:b w:val="0"/>
+                <w:i w:val="0"/>
+                <w:sz w:val="20"/>
+              </w:rPr>
+              <w:t>Tanpa human-in-the-loop; belum berjenjang multi-sumber; tanpa AI lokal</w:t>
+            </w:r>
+          </w:p>
+        </w:tc>
+        <w:tc>
+          <w:tcPr>
+            <w:tcW w:type="dxa" w:w="1469"/>
+            <w:tcBorders>
+              <w:top w:sz="4" w:val="single" w:color="000000"/>
+              <w:left w:sz="4" w:val="single" w:color="000000"/>
+              <w:bottom w:sz="4" w:val="single" w:color="000000"/>
+              <w:right w:sz="4" w:val="single" w:color="000000"/>
+            </w:tcBorders>
+          </w:tcPr>
+          <w:p>
+            <w:pPr>
+              <w:spacing w:line="360" w:lineRule="auto" w:before="0" w:after="0"/>
+            </w:pPr>
+            <w:r/>
+            <w:r>
+              <w:rPr>
+                <w:rFonts w:ascii="Times New Roman" w:hAnsi="Times New Roman" w:eastAsia="Times New Roman"/>
+                <w:b w:val="0"/>
+                <w:i w:val="0"/>
+                <w:sz w:val="20"/>
+              </w:rPr>
+              <w:t>Respons berjenjang berbasis keyakinan dengan kendali analis dan analisis AI lokal</w:t>
+            </w:r>
+          </w:p>
+        </w:tc>
+      </w:tr>
+      <w:tr>
+        <w:trPr>
+          <w:cantSplit/>
+        </w:trPr>
+        <w:tc>
+          <w:tcPr>
+            <w:tcW w:type="dxa" w:w="1584"/>
+            <w:tcBorders>
+              <w:top w:sz="4" w:val="single" w:color="000000"/>
+              <w:left w:sz="4" w:val="single" w:color="000000"/>
+              <w:bottom w:sz="4" w:val="single" w:color="000000"/>
+              <w:right w:sz="4" w:val="single" w:color="000000"/>
+            </w:tcBorders>
+          </w:tcPr>
+          <w:p>
+            <w:pPr>
+              <w:spacing w:line="360" w:lineRule="auto" w:before="0" w:after="0"/>
+            </w:pPr>
+            <w:r/>
+            <w:r>
+              <w:rPr>
+                <w:rFonts w:ascii="Times New Roman" w:hAnsi="Times New Roman" w:eastAsia="Times New Roman"/>
+                <w:b w:val="0"/>
+                <w:i w:val="0"/>
+                <w:sz w:val="20"/>
+              </w:rPr>
+              <w:t>Alves dkk. (2026) — Wazuh untuk deteksi insiden: perancangan dan implementasi</w:t>
+            </w:r>
+          </w:p>
+        </w:tc>
+        <w:tc>
+          <w:tcPr>
+            <w:tcW w:type="dxa" w:w="1267"/>
+            <w:tcBorders>
+              <w:top w:sz="4" w:val="single" w:color="000000"/>
+              <w:left w:sz="4" w:val="single" w:color="000000"/>
+              <w:bottom w:sz="4" w:val="single" w:color="000000"/>
+              <w:right w:sz="4" w:val="single" w:color="000000"/>
+            </w:tcBorders>
+          </w:tcPr>
+          <w:p>
+            <w:pPr>
+              <w:spacing w:line="360" w:lineRule="auto" w:before="0" w:after="0"/>
+            </w:pPr>
+            <w:r/>
+            <w:r>
+              <w:rPr>
+                <w:rFonts w:ascii="Times New Roman" w:hAnsi="Times New Roman" w:eastAsia="Times New Roman"/>
+                <w:b w:val="0"/>
+                <w:i w:val="0"/>
+                <w:sz w:val="20"/>
+              </w:rPr>
+              <w:t>Perancangan dan implementasi deteksi insiden berbasis Wazuh</w:t>
+            </w:r>
+          </w:p>
+        </w:tc>
+        <w:tc>
+          <w:tcPr>
+            <w:tcW w:type="dxa" w:w="1267"/>
+            <w:tcBorders>
+              <w:top w:sz="4" w:val="single" w:color="000000"/>
+              <w:left w:sz="4" w:val="single" w:color="000000"/>
+              <w:bottom w:sz="4" w:val="single" w:color="000000"/>
+              <w:right w:sz="4" w:val="single" w:color="000000"/>
+            </w:tcBorders>
+          </w:tcPr>
+          <w:p>
+            <w:pPr>
+              <w:spacing w:line="360" w:lineRule="auto" w:before="0" w:after="0"/>
+            </w:pPr>
+            <w:r/>
+            <w:r>
+              <w:rPr>
+                <w:rFonts w:ascii="Times New Roman" w:hAnsi="Times New Roman" w:eastAsia="Times New Roman"/>
+                <w:b w:val="0"/>
+                <w:i w:val="0"/>
+                <w:sz w:val="20"/>
+              </w:rPr>
+              <w:t>Deteksi dan korelasi insiden pada Wazuh</w:t>
+            </w:r>
+          </w:p>
+        </w:tc>
+        <w:tc>
+          <w:tcPr>
+            <w:tcW w:type="dxa" w:w="1325"/>
+            <w:tcBorders>
+              <w:top w:sz="4" w:val="single" w:color="000000"/>
+              <w:left w:sz="4" w:val="single" w:color="000000"/>
+              <w:bottom w:sz="4" w:val="single" w:color="000000"/>
+              <w:right w:sz="4" w:val="single" w:color="000000"/>
+            </w:tcBorders>
+          </w:tcPr>
+          <w:p>
+            <w:pPr>
+              <w:spacing w:line="360" w:lineRule="auto" w:before="0" w:after="0"/>
+            </w:pPr>
+            <w:r/>
+            <w:r>
+              <w:rPr>
+                <w:rFonts w:ascii="Times New Roman" w:hAnsi="Times New Roman" w:eastAsia="Times New Roman"/>
+                <w:b w:val="0"/>
+                <w:i w:val="0"/>
+                <w:sz w:val="20"/>
+              </w:rPr>
+              <w:t>Berorientasi deteksi; minim otomatisasi respons</w:t>
+            </w:r>
+          </w:p>
+        </w:tc>
+        <w:tc>
+          <w:tcPr>
+            <w:tcW w:type="dxa" w:w="1354"/>
+            <w:tcBorders>
+              <w:top w:sz="4" w:val="single" w:color="000000"/>
+              <w:left w:sz="4" w:val="single" w:color="000000"/>
+              <w:bottom w:sz="4" w:val="single" w:color="000000"/>
+              <w:right w:sz="4" w:val="single" w:color="000000"/>
+            </w:tcBorders>
+          </w:tcPr>
+          <w:p>
+            <w:pPr>
+              <w:spacing w:line="360" w:lineRule="auto" w:before="0" w:after="0"/>
+            </w:pPr>
+            <w:r/>
+            <w:r>
+              <w:rPr>
+                <w:rFonts w:ascii="Times New Roman" w:hAnsi="Times New Roman" w:eastAsia="Times New Roman"/>
+                <w:b w:val="0"/>
+                <w:i w:val="0"/>
+                <w:sz w:val="20"/>
+              </w:rPr>
+              <w:t>Minim orkestrasi mitigasi, kanal human-in-the-loop, dan analisis AI</w:t>
+            </w:r>
+          </w:p>
+        </w:tc>
+        <w:tc>
+          <w:tcPr>
+            <w:tcW w:type="dxa" w:w="1469"/>
+            <w:tcBorders>
+              <w:top w:sz="4" w:val="single" w:color="000000"/>
+              <w:left w:sz="4" w:val="single" w:color="000000"/>
+              <w:bottom w:sz="4" w:val="single" w:color="000000"/>
+              <w:right w:sz="4" w:val="single" w:color="000000"/>
+            </w:tcBorders>
+          </w:tcPr>
+          <w:p>
+            <w:pPr>
+              <w:spacing w:line="360" w:lineRule="auto" w:before="0" w:after="0"/>
+            </w:pPr>
+            <w:r/>
+            <w:r>
+              <w:rPr>
+                <w:rFonts w:ascii="Times New Roman" w:hAnsi="Times New Roman" w:eastAsia="Times New Roman"/>
+                <w:b w:val="0"/>
+                <w:i w:val="0"/>
+                <w:sz w:val="20"/>
+              </w:rPr>
+              <w:t>Menambahkan lapisan orkestrasi SOAR (n8n) untuk mitigasi aktif dan analisis AI lokal</w:t>
+            </w:r>
+          </w:p>
+        </w:tc>
+      </w:tr>
+      <w:tr>
+        <w:trPr>
+          <w:cantSplit/>
+        </w:trPr>
+        <w:tc>
+          <w:tcPr>
+            <w:tcW w:type="dxa" w:w="1584"/>
+            <w:tcBorders>
+              <w:top w:sz="4" w:val="single" w:color="000000"/>
+              <w:left w:sz="4" w:val="single" w:color="000000"/>
+              <w:bottom w:sz="4" w:val="single" w:color="000000"/>
+              <w:right w:sz="4" w:val="single" w:color="000000"/>
+            </w:tcBorders>
+          </w:tcPr>
+          <w:p>
+            <w:pPr>
+              <w:spacing w:line="360" w:lineRule="auto" w:before="0" w:after="0"/>
+            </w:pPr>
+            <w:r/>
+            <w:r>
+              <w:rPr>
+                <w:rFonts w:ascii="Times New Roman" w:hAnsi="Times New Roman" w:eastAsia="Times New Roman"/>
+                <w:b w:val="0"/>
+                <w:i w:val="0"/>
+                <w:sz w:val="20"/>
+              </w:rPr>
+              <w:t>Raed (2025) — SOC bertenaga AI: Wazuh, n8n, Claude AI, dan MCP</w:t>
+            </w:r>
+          </w:p>
+        </w:tc>
+        <w:tc>
+          <w:tcPr>
+            <w:tcW w:type="dxa" w:w="1267"/>
+            <w:tcBorders>
+              <w:top w:sz="4" w:val="single" w:color="000000"/>
+              <w:left w:sz="4" w:val="single" w:color="000000"/>
+              <w:bottom w:sz="4" w:val="single" w:color="000000"/>
+              <w:right w:sz="4" w:val="single" w:color="000000"/>
+            </w:tcBorders>
+          </w:tcPr>
+          <w:p>
+            <w:pPr>
+              <w:spacing w:line="360" w:lineRule="auto" w:before="0" w:after="0"/>
+            </w:pPr>
+            <w:r/>
+            <w:r>
+              <w:rPr>
+                <w:rFonts w:ascii="Times New Roman" w:hAnsi="Times New Roman" w:eastAsia="Times New Roman"/>
+                <w:b w:val="0"/>
+                <w:i w:val="0"/>
+                <w:sz w:val="20"/>
+              </w:rPr>
+              <w:t>SOC end-to-end dari deteksi hingga respons dengan bantuan AI</w:t>
+            </w:r>
+          </w:p>
+        </w:tc>
+        <w:tc>
+          <w:tcPr>
+            <w:tcW w:type="dxa" w:w="1267"/>
+            <w:tcBorders>
+              <w:top w:sz="4" w:val="single" w:color="000000"/>
+              <w:left w:sz="4" w:val="single" w:color="000000"/>
+              <w:bottom w:sz="4" w:val="single" w:color="000000"/>
+              <w:right w:sz="4" w:val="single" w:color="000000"/>
+            </w:tcBorders>
+          </w:tcPr>
+          <w:p>
+            <w:pPr>
+              <w:spacing w:line="360" w:lineRule="auto" w:before="0" w:after="0"/>
+            </w:pPr>
+            <w:r/>
+            <w:r>
+              <w:rPr>
+                <w:rFonts w:ascii="Times New Roman" w:hAnsi="Times New Roman" w:eastAsia="Times New Roman"/>
+                <w:b w:val="0"/>
+                <w:i w:val="0"/>
+                <w:sz w:val="20"/>
+              </w:rPr>
+              <w:t>Orkestrasi n8n dengan LLM Claude berbasis cloud (via MCP)</w:t>
+            </w:r>
+          </w:p>
+        </w:tc>
+        <w:tc>
+          <w:tcPr>
+            <w:tcW w:type="dxa" w:w="1325"/>
+            <w:tcBorders>
+              <w:top w:sz="4" w:val="single" w:color="000000"/>
+              <w:left w:sz="4" w:val="single" w:color="000000"/>
+              <w:bottom w:sz="4" w:val="single" w:color="000000"/>
+              <w:right w:sz="4" w:val="single" w:color="000000"/>
+            </w:tcBorders>
+          </w:tcPr>
+          <w:p>
+            <w:pPr>
+              <w:spacing w:line="360" w:lineRule="auto" w:before="0" w:after="0"/>
+            </w:pPr>
+            <w:r/>
+            <w:r>
+              <w:rPr>
+                <w:rFonts w:ascii="Times New Roman" w:hAnsi="Times New Roman" w:eastAsia="Times New Roman"/>
+                <w:b w:val="0"/>
+                <w:i w:val="0"/>
+                <w:sz w:val="20"/>
+              </w:rPr>
+              <w:t>Respons dibantu AI; tanpa kanal keputusan dua arah</w:t>
+            </w:r>
+          </w:p>
+        </w:tc>
+        <w:tc>
+          <w:tcPr>
+            <w:tcW w:type="dxa" w:w="1354"/>
+            <w:tcBorders>
+              <w:top w:sz="4" w:val="single" w:color="000000"/>
+              <w:left w:sz="4" w:val="single" w:color="000000"/>
+              <w:bottom w:sz="4" w:val="single" w:color="000000"/>
+              <w:right w:sz="4" w:val="single" w:color="000000"/>
+            </w:tcBorders>
+          </w:tcPr>
+          <w:p>
+            <w:pPr>
+              <w:spacing w:line="360" w:lineRule="auto" w:before="0" w:after="0"/>
+            </w:pPr>
+            <w:r/>
+            <w:r>
+              <w:rPr>
+                <w:rFonts w:ascii="Times New Roman" w:hAnsi="Times New Roman" w:eastAsia="Times New Roman"/>
+                <w:b w:val="0"/>
+                <w:i w:val="0"/>
+                <w:sz w:val="20"/>
+              </w:rPr>
+              <w:t>AI berbasis cloud (risiko kedaulatan data dan biaya API); tanpa keputusan interaktif</w:t>
+            </w:r>
+          </w:p>
+        </w:tc>
+        <w:tc>
+          <w:tcPr>
+            <w:tcW w:type="dxa" w:w="1469"/>
+            <w:tcBorders>
+              <w:top w:sz="4" w:val="single" w:color="000000"/>
+              <w:left w:sz="4" w:val="single" w:color="000000"/>
+              <w:bottom w:sz="4" w:val="single" w:color="000000"/>
+              <w:right w:sz="4" w:val="single" w:color="000000"/>
+            </w:tcBorders>
+          </w:tcPr>
+          <w:p>
+            <w:pPr>
+              <w:spacing w:line="360" w:lineRule="auto" w:before="0" w:after="0"/>
+            </w:pPr>
+            <w:r/>
+            <w:r>
+              <w:rPr>
+                <w:rFonts w:ascii="Times New Roman" w:hAnsi="Times New Roman" w:eastAsia="Times New Roman"/>
+                <w:b w:val="0"/>
+                <w:i w:val="0"/>
+                <w:sz w:val="20"/>
+              </w:rPr>
+              <w:t>Analisis AI on-premise (Ollama) untuk kedaulatan data dan mitigasi human-in-the-loop dua arah</w:t>
+            </w:r>
+          </w:p>
+        </w:tc>
+      </w:tr>
+      <w:tr>
+        <w:trPr>
+          <w:cantSplit/>
+        </w:trPr>
+        <w:tc>
+          <w:tcPr>
+            <w:tcW w:type="dxa" w:w="1584"/>
+            <w:tcBorders>
+              <w:top w:sz="4" w:val="single" w:color="000000"/>
+              <w:left w:sz="4" w:val="single" w:color="000000"/>
+              <w:bottom w:sz="4" w:val="single" w:color="000000"/>
+              <w:right w:sz="4" w:val="single" w:color="000000"/>
+            </w:tcBorders>
+          </w:tcPr>
+          <w:p>
+            <w:pPr>
+              <w:spacing w:line="360" w:lineRule="auto" w:before="0" w:after="0"/>
+            </w:pPr>
+            <w:r/>
+            <w:r>
+              <w:rPr>
+                <w:rFonts w:ascii="Times New Roman" w:hAnsi="Times New Roman" w:eastAsia="Times New Roman"/>
+                <w:b w:val="0"/>
+                <w:i w:val="0"/>
+                <w:sz w:val="20"/>
+              </w:rPr>
+              <w:t>zhadyz (2025) — AI_SOC: SOC open-source berbasis LLM multi-agent (Ollama, Wazuh, TheHive, RAG)</w:t>
+            </w:r>
+          </w:p>
+        </w:tc>
+        <w:tc>
+          <w:tcPr>
+            <w:tcW w:type="dxa" w:w="1267"/>
+            <w:tcBorders>
+              <w:top w:sz="4" w:val="single" w:color="000000"/>
+              <w:left w:sz="4" w:val="single" w:color="000000"/>
+              <w:bottom w:sz="4" w:val="single" w:color="000000"/>
+              <w:right w:sz="4" w:val="single" w:color="000000"/>
+            </w:tcBorders>
+          </w:tcPr>
+          <w:p>
+            <w:pPr>
+              <w:spacing w:line="360" w:lineRule="auto" w:before="0" w:after="0"/>
+            </w:pPr>
+            <w:r/>
+            <w:r>
+              <w:rPr>
+                <w:rFonts w:ascii="Times New Roman" w:hAnsi="Times New Roman" w:eastAsia="Times New Roman"/>
+                <w:b w:val="0"/>
+                <w:i w:val="0"/>
+                <w:sz w:val="20"/>
+              </w:rPr>
+              <w:t>SOC open-source dengan LLM multi-agent dan AI lokal</w:t>
+            </w:r>
+          </w:p>
+        </w:tc>
+        <w:tc>
+          <w:tcPr>
+            <w:tcW w:type="dxa" w:w="1267"/>
+            <w:tcBorders>
+              <w:top w:sz="4" w:val="single" w:color="000000"/>
+              <w:left w:sz="4" w:val="single" w:color="000000"/>
+              <w:bottom w:sz="4" w:val="single" w:color="000000"/>
+              <w:right w:sz="4" w:val="single" w:color="000000"/>
+            </w:tcBorders>
+          </w:tcPr>
+          <w:p>
+            <w:pPr>
+              <w:spacing w:line="360" w:lineRule="auto" w:before="0" w:after="0"/>
+            </w:pPr>
+            <w:r/>
+            <w:r>
+              <w:rPr>
+                <w:rFonts w:ascii="Times New Roman" w:hAnsi="Times New Roman" w:eastAsia="Times New Roman"/>
+                <w:b w:val="0"/>
+                <w:i w:val="0"/>
+                <w:sz w:val="20"/>
+              </w:rPr>
+              <w:t>LLM multi-agent, Ollama, Wazuh, dan TheHive</w:t>
+            </w:r>
+          </w:p>
+        </w:tc>
+        <w:tc>
+          <w:tcPr>
+            <w:tcW w:type="dxa" w:w="1325"/>
+            <w:tcBorders>
+              <w:top w:sz="4" w:val="single" w:color="000000"/>
+              <w:left w:sz="4" w:val="single" w:color="000000"/>
+              <w:bottom w:sz="4" w:val="single" w:color="000000"/>
+              <w:right w:sz="4" w:val="single" w:color="000000"/>
+            </w:tcBorders>
+          </w:tcPr>
+          <w:p>
+            <w:pPr>
+              <w:spacing w:line="360" w:lineRule="auto" w:before="0" w:after="0"/>
+            </w:pPr>
+            <w:r/>
+            <w:r>
+              <w:rPr>
+                <w:rFonts w:ascii="Times New Roman" w:hAnsi="Times New Roman" w:eastAsia="Times New Roman"/>
+                <w:b w:val="0"/>
+                <w:i w:val="0"/>
+                <w:sz w:val="20"/>
+              </w:rPr>
+              <w:t>Triase berbasis TheHive; tanpa mitigasi dua arah via chat</w:t>
+            </w:r>
+          </w:p>
+        </w:tc>
+        <w:tc>
+          <w:tcPr>
+            <w:tcW w:type="dxa" w:w="1354"/>
+            <w:tcBorders>
+              <w:top w:sz="4" w:val="single" w:color="000000"/>
+              <w:left w:sz="4" w:val="single" w:color="000000"/>
+              <w:bottom w:sz="4" w:val="single" w:color="000000"/>
+              <w:right w:sz="4" w:val="single" w:color="000000"/>
+            </w:tcBorders>
+          </w:tcPr>
+          <w:p>
+            <w:pPr>
+              <w:spacing w:line="360" w:lineRule="auto" w:before="0" w:after="0"/>
+            </w:pPr>
+            <w:r/>
+            <w:r>
+              <w:rPr>
+                <w:rFonts w:ascii="Times New Roman" w:hAnsi="Times New Roman" w:eastAsia="Times New Roman"/>
+                <w:b w:val="0"/>
+                <w:i w:val="0"/>
+                <w:sz w:val="20"/>
+              </w:rPr>
+              <w:t>Tanpa mitigasi aktif human-in-the-loop dua arah; belum berjenjang multi-sumber; multi-agent bukan lintas-distribusi endpoint</w:t>
+            </w:r>
+          </w:p>
+        </w:tc>
+        <w:tc>
+          <w:tcPr>
+            <w:tcW w:type="dxa" w:w="1469"/>
+            <w:tcBorders>
+              <w:top w:sz="4" w:val="single" w:color="000000"/>
+              <w:left w:sz="4" w:val="single" w:color="000000"/>
+              <w:bottom w:sz="4" w:val="single" w:color="000000"/>
+              <w:right w:sz="4" w:val="single" w:color="000000"/>
+            </w:tcBorders>
+          </w:tcPr>
+          <w:p>
+            <w:pPr>
+              <w:spacing w:line="360" w:lineRule="auto" w:before="0" w:after="0"/>
+            </w:pPr>
+            <w:r/>
+            <w:r>
+              <w:rPr>
+                <w:rFonts w:ascii="Times New Roman" w:hAnsi="Times New Roman" w:eastAsia="Times New Roman"/>
+                <w:b w:val="0"/>
+                <w:i w:val="0"/>
+                <w:sz w:val="20"/>
+              </w:rPr>
+              <w:t>Mitigasi aktif dua arah via Telegram, respons berjenjang multi-sumber, dan multi-agent lintas-distribusi endpoint</w:t>
             </w:r>
           </w:p>
         </w:tc>
@@ -4963,7 +3492,7 @@
           <w:i w:val="0"/>
           <w:sz w:val="24"/>
         </w:rPr>
-        <w:t>Tabel 4 merupakan rangkuman posisi kebaruan usulan dibandingkan penelitian dan implementasi terdahulu pada lima aspek pembeda. Baris Usulan (2026) merupakan satu-satunya pendekatan yang memenuhi kelima aspek tersebut secara bersamaan, sedangkan pendekatan lain hanya memenuhinya sebagian atau belum sama sekali.</w:t>
+        <w:t>Sebagaimana terlihat pada kolom Proyek Saya di Tabel 3, setiap kesenjangan pada penelitian dan implementasi terdahulu ditutup oleh kontribusi yang diusulkan. Kombinasi kelima aspek pembeda tersebut belum ditemukan secara bersamaan pada karya sebelumnya sehingga menjadi kebaruan utama proyek ini.</w:t>
       </w:r>
     </w:p>
     <w:p>

</xml_diff>

<commit_message>
docs(proposal): pecah tabel perbandingan jadi 2 & hapus paragraf penutup
Tabel 6 kolom terasa sesak, dipecah agar lebih terbaca:
- Tabel 3: Sumber, Fokus Utama, Metode, Fitur Respons dan Alert
- Tabel 4: Sumber, Kesenjangan, Proyek Saya (kolom lebih lebar)
Hapus paragraf penutup 'Sebagaimana terlihat pada kolom Proyek Saya'.
</commit_message>
<xml_diff>
--- a/proposal/Usulan Ide_2305551076_Ravi Arnan Irianto.docx
+++ b/proposal/Usulan Ide_2305551076_Ravi Arnan Irianto.docx
@@ -1975,7 +1975,7 @@
           <w:i w:val="0"/>
           <w:sz w:val="24"/>
         </w:rPr>
-        <w:t>Dibandingkan penelitian maupun implementasi sejenis, kebaruan yang diusulkan bersifat integratif, yaitu menggabungkan (1) respons berjenjang berbasis keyakinan hasil verifikasi multi-sumber, (2) mitigasi aktif human-in-the-loop dua arah melalui satu kanal chat, (3) cakupan dua kelas ancaman sekaligus (malware dan phishing) dengan jenis Active Response berbeda, (4) analisis AI on-premise untuk menjaga kedaulatan data, dan (5) arsitektur multi-agent lintas distribusi Linux yang resilien terhadap perpindahan jaringan. Kombinasi kelima aspek tersebut belum ditemukan secara bersamaan pada penelitian maupun implementasi Wazuh berbasis SOAR yang ada saat ini (Thakker, More, &amp; Kumar, 2025; Nadig &amp; Vignesh, 2026; Alves, Loureiro, &amp; Pedrosa, 2026). Untuk memperjelas hal tersebut, Tabel 3 merangkum penelitian dan implementasi terdahulu, kesenjangan (gap) masing-masing, serta kontribusi yang ditawarkan proyek ini untuk menutup setiap kesenjangan tersebut.</w:t>
+        <w:t>Dibandingkan penelitian maupun implementasi sejenis, kebaruan yang diusulkan bersifat integratif, yaitu menggabungkan (1) respons berjenjang berbasis keyakinan hasil verifikasi multi-sumber, (2) mitigasi aktif human-in-the-loop dua arah melalui satu kanal chat, (3) cakupan dua kelas ancaman sekaligus (malware dan phishing) dengan jenis Active Response berbeda, (4) analisis AI on-premise untuk menjaga kedaulatan data, dan (5) arsitektur multi-agent lintas distribusi Linux yang resilien terhadap perpindahan jaringan. Kombinasi kelima aspek tersebut belum ditemukan secara bersamaan pada penelitian maupun implementasi Wazuh berbasis SOAR yang ada saat ini (Thakker, More, &amp; Kumar, 2025; Nadig &amp; Vignesh, 2026; Alves, Loureiro, &amp; Pedrosa, 2026). Untuk memperjelas hal tersebut, Tabel 3 merangkum fokus, metode, dan fitur respons penelitian serta implementasi terdahulu, sedangkan Tabel 4 memetakan kesenjangan (gap) masing-masing beserta kontribusi yang ditawarkan proyek ini untuk menutupnya.</w:t>
       </w:r>
     </w:p>
     <w:p>
@@ -1999,7 +1999,7 @@
           <w:i w:val="0"/>
           <w:sz w:val="20"/>
         </w:rPr>
-        <w:t>Perbandingan Penelitian Terdahulu, Kesenjangan, dan Kontribusi Proyek.</w:t>
+        <w:t>Ringkasan Penelitian dan Implementasi Terdahulu.</w:t>
       </w:r>
     </w:p>
     <w:tbl>
@@ -2010,12 +2010,10 @@
         <w:tblLook w:firstColumn="1" w:firstRow="1" w:lastColumn="0" w:lastRow="0" w:noHBand="0" w:noVBand="1" w:val="04A0"/>
       </w:tblPr>
       <w:tblGrid>
-        <w:gridCol w:w="1584"/>
-        <w:gridCol w:w="1267"/>
-        <w:gridCol w:w="1267"/>
-        <w:gridCol w:w="1324"/>
-        <w:gridCol w:w="1353"/>
-        <w:gridCol w:w="1468"/>
+        <w:gridCol w:w="2232"/>
+        <w:gridCol w:w="1944"/>
+        <w:gridCol w:w="1872"/>
+        <w:gridCol w:w="2217"/>
       </w:tblGrid>
       <w:tr>
         <w:trPr>
@@ -2024,7 +2022,7 @@
         </w:trPr>
         <w:tc>
           <w:tcPr>
-            <w:tcW w:type="dxa" w:w="1584"/>
+            <w:tcW w:type="dxa" w:w="2232"/>
             <w:tcBorders>
               <w:top w:sz="4" w:val="single" w:color="000000"/>
               <w:left w:sz="4" w:val="single" w:color="000000"/>
@@ -2051,7 +2049,7 @@
         </w:tc>
         <w:tc>
           <w:tcPr>
-            <w:tcW w:type="dxa" w:w="1267"/>
+            <w:tcW w:type="dxa" w:w="1944"/>
             <w:tcBorders>
               <w:top w:sz="4" w:val="single" w:color="000000"/>
               <w:left w:sz="4" w:val="single" w:color="000000"/>
@@ -2078,7 +2076,7 @@
         </w:tc>
         <w:tc>
           <w:tcPr>
-            <w:tcW w:type="dxa" w:w="1267"/>
+            <w:tcW w:type="dxa" w:w="1872"/>
             <w:tcBorders>
               <w:top w:sz="4" w:val="single" w:color="000000"/>
               <w:left w:sz="4" w:val="single" w:color="000000"/>
@@ -2105,7 +2103,7 @@
         </w:tc>
         <w:tc>
           <w:tcPr>
-            <w:tcW w:type="dxa" w:w="1325"/>
+            <w:tcW w:type="dxa" w:w="2218"/>
             <w:tcBorders>
               <w:top w:sz="4" w:val="single" w:color="000000"/>
               <w:left w:sz="4" w:val="single" w:color="000000"/>
@@ -2130,9 +2128,956 @@
             </w:r>
           </w:p>
         </w:tc>
+      </w:tr>
+      <w:tr>
+        <w:trPr>
+          <w:cantSplit/>
+        </w:trPr>
         <w:tc>
           <w:tcPr>
-            <w:tcW w:type="dxa" w:w="1354"/>
+            <w:tcW w:type="dxa" w:w="2232"/>
+            <w:tcBorders>
+              <w:top w:sz="4" w:val="single" w:color="000000"/>
+              <w:left w:sz="4" w:val="single" w:color="000000"/>
+              <w:bottom w:sz="4" w:val="single" w:color="000000"/>
+              <w:right w:sz="4" w:val="single" w:color="000000"/>
+            </w:tcBorders>
+          </w:tcPr>
+          <w:p>
+            <w:pPr>
+              <w:spacing w:line="360" w:lineRule="auto" w:before="0" w:after="0"/>
+            </w:pPr>
+            <w:r/>
+            <w:r>
+              <w:rPr>
+                <w:rFonts w:ascii="Times New Roman" w:hAnsi="Times New Roman" w:eastAsia="Times New Roman"/>
+                <w:b w:val="0"/>
+                <w:i w:val="0"/>
+                <w:sz w:val="20"/>
+              </w:rPr>
+              <w:t>Thakker dkk. (2025) — pertahanan otomatis serangan application-layer pada Windows (Wazuh dan Shuffle)</w:t>
+            </w:r>
+          </w:p>
+        </w:tc>
+        <w:tc>
+          <w:tcPr>
+            <w:tcW w:type="dxa" w:w="1944"/>
+            <w:tcBorders>
+              <w:top w:sz="4" w:val="single" w:color="000000"/>
+              <w:left w:sz="4" w:val="single" w:color="000000"/>
+              <w:bottom w:sz="4" w:val="single" w:color="000000"/>
+              <w:right w:sz="4" w:val="single" w:color="000000"/>
+            </w:tcBorders>
+          </w:tcPr>
+          <w:p>
+            <w:pPr>
+              <w:spacing w:line="360" w:lineRule="auto" w:before="0" w:after="0"/>
+            </w:pPr>
+            <w:r/>
+            <w:r>
+              <w:rPr>
+                <w:rFonts w:ascii="Times New Roman" w:hAnsi="Times New Roman" w:eastAsia="Times New Roman"/>
+                <w:b w:val="0"/>
+                <w:i w:val="0"/>
+                <w:sz w:val="20"/>
+              </w:rPr>
+              <w:t>Mitigasi otomatis serangan application-layer pada endpoint Windows</w:t>
+            </w:r>
+          </w:p>
+        </w:tc>
+        <w:tc>
+          <w:tcPr>
+            <w:tcW w:type="dxa" w:w="1872"/>
+            <w:tcBorders>
+              <w:top w:sz="4" w:val="single" w:color="000000"/>
+              <w:left w:sz="4" w:val="single" w:color="000000"/>
+              <w:bottom w:sz="4" w:val="single" w:color="000000"/>
+              <w:right w:sz="4" w:val="single" w:color="000000"/>
+            </w:tcBorders>
+          </w:tcPr>
+          <w:p>
+            <w:pPr>
+              <w:spacing w:line="360" w:lineRule="auto" w:before="0" w:after="0"/>
+            </w:pPr>
+            <w:r/>
+            <w:r>
+              <w:rPr>
+                <w:rFonts w:ascii="Times New Roman" w:hAnsi="Times New Roman" w:eastAsia="Times New Roman"/>
+                <w:b w:val="0"/>
+                <w:i w:val="0"/>
+                <w:sz w:val="20"/>
+              </w:rPr>
+              <w:t>Integrasi Wazuh dan Shuffle; pemblokiran otomatis berbasis aturan</w:t>
+            </w:r>
+          </w:p>
+        </w:tc>
+        <w:tc>
+          <w:tcPr>
+            <w:tcW w:type="dxa" w:w="2218"/>
+            <w:tcBorders>
+              <w:top w:sz="4" w:val="single" w:color="000000"/>
+              <w:left w:sz="4" w:val="single" w:color="000000"/>
+              <w:bottom w:sz="4" w:val="single" w:color="000000"/>
+              <w:right w:sz="4" w:val="single" w:color="000000"/>
+            </w:tcBorders>
+          </w:tcPr>
+          <w:p>
+            <w:pPr>
+              <w:spacing w:line="360" w:lineRule="auto" w:before="0" w:after="0"/>
+            </w:pPr>
+            <w:r/>
+            <w:r>
+              <w:rPr>
+                <w:rFonts w:ascii="Times New Roman" w:hAnsi="Times New Roman" w:eastAsia="Times New Roman"/>
+                <w:b w:val="0"/>
+                <w:i w:val="0"/>
+                <w:sz w:val="20"/>
+              </w:rPr>
+              <w:t>Active Response otomatis penuh; tanpa notifikasi interaktif</w:t>
+            </w:r>
+          </w:p>
+        </w:tc>
+      </w:tr>
+      <w:tr>
+        <w:trPr>
+          <w:cantSplit/>
+        </w:trPr>
+        <w:tc>
+          <w:tcPr>
+            <w:tcW w:type="dxa" w:w="2232"/>
+            <w:tcBorders>
+              <w:top w:sz="4" w:val="single" w:color="000000"/>
+              <w:left w:sz="4" w:val="single" w:color="000000"/>
+              <w:bottom w:sz="4" w:val="single" w:color="000000"/>
+              <w:right w:sz="4" w:val="single" w:color="000000"/>
+            </w:tcBorders>
+          </w:tcPr>
+          <w:p>
+            <w:pPr>
+              <w:spacing w:line="360" w:lineRule="auto" w:before="0" w:after="0"/>
+            </w:pPr>
+            <w:r/>
+            <w:r>
+              <w:rPr>
+                <w:rFonts w:ascii="Times New Roman" w:hAnsi="Times New Roman" w:eastAsia="Times New Roman"/>
+                <w:b w:val="0"/>
+                <w:i w:val="0"/>
+                <w:sz w:val="20"/>
+              </w:rPr>
+              <w:t>Farrel (2024) — SIEM Wazuh dengan Active Response dan notifikasi Telegram untuk brute force</w:t>
+            </w:r>
+          </w:p>
+        </w:tc>
+        <w:tc>
+          <w:tcPr>
+            <w:tcW w:type="dxa" w:w="1944"/>
+            <w:tcBorders>
+              <w:top w:sz="4" w:val="single" w:color="000000"/>
+              <w:left w:sz="4" w:val="single" w:color="000000"/>
+              <w:bottom w:sz="4" w:val="single" w:color="000000"/>
+              <w:right w:sz="4" w:val="single" w:color="000000"/>
+            </w:tcBorders>
+          </w:tcPr>
+          <w:p>
+            <w:pPr>
+              <w:spacing w:line="360" w:lineRule="auto" w:before="0" w:after="0"/>
+            </w:pPr>
+            <w:r/>
+            <w:r>
+              <w:rPr>
+                <w:rFonts w:ascii="Times New Roman" w:hAnsi="Times New Roman" w:eastAsia="Times New Roman"/>
+                <w:b w:val="0"/>
+                <w:i w:val="0"/>
+                <w:sz w:val="20"/>
+              </w:rPr>
+              <w:t>Mitigasi serangan brute force pada sistem informasi</w:t>
+            </w:r>
+          </w:p>
+        </w:tc>
+        <w:tc>
+          <w:tcPr>
+            <w:tcW w:type="dxa" w:w="1872"/>
+            <w:tcBorders>
+              <w:top w:sz="4" w:val="single" w:color="000000"/>
+              <w:left w:sz="4" w:val="single" w:color="000000"/>
+              <w:bottom w:sz="4" w:val="single" w:color="000000"/>
+              <w:right w:sz="4" w:val="single" w:color="000000"/>
+            </w:tcBorders>
+          </w:tcPr>
+          <w:p>
+            <w:pPr>
+              <w:spacing w:line="360" w:lineRule="auto" w:before="0" w:after="0"/>
+            </w:pPr>
+            <w:r/>
+            <w:r>
+              <w:rPr>
+                <w:rFonts w:ascii="Times New Roman" w:hAnsi="Times New Roman" w:eastAsia="Times New Roman"/>
+                <w:b w:val="0"/>
+                <w:i w:val="0"/>
+                <w:sz w:val="20"/>
+              </w:rPr>
+              <w:t>Wazuh Active Response dengan notifikasi Telegram</w:t>
+            </w:r>
+          </w:p>
+        </w:tc>
+        <w:tc>
+          <w:tcPr>
+            <w:tcW w:type="dxa" w:w="2218"/>
+            <w:tcBorders>
+              <w:top w:sz="4" w:val="single" w:color="000000"/>
+              <w:left w:sz="4" w:val="single" w:color="000000"/>
+              <w:bottom w:sz="4" w:val="single" w:color="000000"/>
+              <w:right w:sz="4" w:val="single" w:color="000000"/>
+            </w:tcBorders>
+          </w:tcPr>
+          <w:p>
+            <w:pPr>
+              <w:spacing w:line="360" w:lineRule="auto" w:before="0" w:after="0"/>
+            </w:pPr>
+            <w:r/>
+            <w:r>
+              <w:rPr>
+                <w:rFonts w:ascii="Times New Roman" w:hAnsi="Times New Roman" w:eastAsia="Times New Roman"/>
+                <w:b w:val="0"/>
+                <w:i w:val="0"/>
+                <w:sz w:val="20"/>
+              </w:rPr>
+              <w:t>Active Response otomatis; notifikasi Telegram satu arah</w:t>
+            </w:r>
+          </w:p>
+        </w:tc>
+      </w:tr>
+      <w:tr>
+        <w:trPr>
+          <w:cantSplit/>
+        </w:trPr>
+        <w:tc>
+          <w:tcPr>
+            <w:tcW w:type="dxa" w:w="2232"/>
+            <w:tcBorders>
+              <w:top w:sz="4" w:val="single" w:color="000000"/>
+              <w:left w:sz="4" w:val="single" w:color="000000"/>
+              <w:bottom w:sz="4" w:val="single" w:color="000000"/>
+              <w:right w:sz="4" w:val="single" w:color="000000"/>
+            </w:tcBorders>
+          </w:tcPr>
+          <w:p>
+            <w:pPr>
+              <w:spacing w:line="360" w:lineRule="auto" w:before="0" w:after="0"/>
+            </w:pPr>
+            <w:r/>
+            <w:r>
+              <w:rPr>
+                <w:rFonts w:ascii="Times New Roman" w:hAnsi="Times New Roman" w:eastAsia="Times New Roman"/>
+                <w:b w:val="0"/>
+                <w:i w:val="0"/>
+                <w:sz w:val="20"/>
+              </w:rPr>
+              <w:t>Sarker (2025) — otomasi SOC: Wazuh, n8n, VirusTotal, dan Gmail untuk deteksi file berbahaya</w:t>
+            </w:r>
+          </w:p>
+        </w:tc>
+        <w:tc>
+          <w:tcPr>
+            <w:tcW w:type="dxa" w:w="1944"/>
+            <w:tcBorders>
+              <w:top w:sz="4" w:val="single" w:color="000000"/>
+              <w:left w:sz="4" w:val="single" w:color="000000"/>
+              <w:bottom w:sz="4" w:val="single" w:color="000000"/>
+              <w:right w:sz="4" w:val="single" w:color="000000"/>
+            </w:tcBorders>
+          </w:tcPr>
+          <w:p>
+            <w:pPr>
+              <w:spacing w:line="360" w:lineRule="auto" w:before="0" w:after="0"/>
+            </w:pPr>
+            <w:r/>
+            <w:r>
+              <w:rPr>
+                <w:rFonts w:ascii="Times New Roman" w:hAnsi="Times New Roman" w:eastAsia="Times New Roman"/>
+                <w:b w:val="0"/>
+                <w:i w:val="0"/>
+                <w:sz w:val="20"/>
+              </w:rPr>
+              <w:t>Deteksi file berbahaya berbasis orkestrasi n8n</w:t>
+            </w:r>
+          </w:p>
+        </w:tc>
+        <w:tc>
+          <w:tcPr>
+            <w:tcW w:type="dxa" w:w="1872"/>
+            <w:tcBorders>
+              <w:top w:sz="4" w:val="single" w:color="000000"/>
+              <w:left w:sz="4" w:val="single" w:color="000000"/>
+              <w:bottom w:sz="4" w:val="single" w:color="000000"/>
+              <w:right w:sz="4" w:val="single" w:color="000000"/>
+            </w:tcBorders>
+          </w:tcPr>
+          <w:p>
+            <w:pPr>
+              <w:spacing w:line="360" w:lineRule="auto" w:before="0" w:after="0"/>
+            </w:pPr>
+            <w:r/>
+            <w:r>
+              <w:rPr>
+                <w:rFonts w:ascii="Times New Roman" w:hAnsi="Times New Roman" w:eastAsia="Times New Roman"/>
+                <w:b w:val="0"/>
+                <w:i w:val="0"/>
+                <w:sz w:val="20"/>
+              </w:rPr>
+              <w:t>Orkestrasi n8n dengan VirusTotal dan notifikasi Gmail</w:t>
+            </w:r>
+          </w:p>
+        </w:tc>
+        <w:tc>
+          <w:tcPr>
+            <w:tcW w:type="dxa" w:w="2218"/>
+            <w:tcBorders>
+              <w:top w:sz="4" w:val="single" w:color="000000"/>
+              <w:left w:sz="4" w:val="single" w:color="000000"/>
+              <w:bottom w:sz="4" w:val="single" w:color="000000"/>
+              <w:right w:sz="4" w:val="single" w:color="000000"/>
+            </w:tcBorders>
+          </w:tcPr>
+          <w:p>
+            <w:pPr>
+              <w:spacing w:line="360" w:lineRule="auto" w:before="0" w:after="0"/>
+            </w:pPr>
+            <w:r/>
+            <w:r>
+              <w:rPr>
+                <w:rFonts w:ascii="Times New Roman" w:hAnsi="Times New Roman" w:eastAsia="Times New Roman"/>
+                <w:b w:val="0"/>
+                <w:i w:val="0"/>
+                <w:sz w:val="20"/>
+              </w:rPr>
+              <w:t>Notifikasi email satu arah; tanpa mitigasi aktif</w:t>
+            </w:r>
+          </w:p>
+        </w:tc>
+      </w:tr>
+      <w:tr>
+        <w:trPr>
+          <w:cantSplit/>
+        </w:trPr>
+        <w:tc>
+          <w:tcPr>
+            <w:tcW w:type="dxa" w:w="2232"/>
+            <w:tcBorders>
+              <w:top w:sz="4" w:val="single" w:color="000000"/>
+              <w:left w:sz="4" w:val="single" w:color="000000"/>
+              <w:bottom w:sz="4" w:val="single" w:color="000000"/>
+              <w:right w:sz="4" w:val="single" w:color="000000"/>
+            </w:tcBorders>
+          </w:tcPr>
+          <w:p>
+            <w:pPr>
+              <w:spacing w:line="360" w:lineRule="auto" w:before="0" w:after="0"/>
+            </w:pPr>
+            <w:r/>
+            <w:r>
+              <w:rPr>
+                <w:rFonts w:ascii="Times New Roman" w:hAnsi="Times New Roman" w:eastAsia="Times New Roman"/>
+                <w:b w:val="0"/>
+                <w:i w:val="0"/>
+                <w:sz w:val="20"/>
+              </w:rPr>
+              <w:t>n8n (n.d.) — template workflow: Wazuh ke VirusTotal dengan alert Slack</w:t>
+            </w:r>
+          </w:p>
+        </w:tc>
+        <w:tc>
+          <w:tcPr>
+            <w:tcW w:type="dxa" w:w="1944"/>
+            <w:tcBorders>
+              <w:top w:sz="4" w:val="single" w:color="000000"/>
+              <w:left w:sz="4" w:val="single" w:color="000000"/>
+              <w:bottom w:sz="4" w:val="single" w:color="000000"/>
+              <w:right w:sz="4" w:val="single" w:color="000000"/>
+            </w:tcBorders>
+          </w:tcPr>
+          <w:p>
+            <w:pPr>
+              <w:spacing w:line="360" w:lineRule="auto" w:before="0" w:after="0"/>
+            </w:pPr>
+            <w:r/>
+            <w:r>
+              <w:rPr>
+                <w:rFonts w:ascii="Times New Roman" w:hAnsi="Times New Roman" w:eastAsia="Times New Roman"/>
+                <w:b w:val="0"/>
+                <w:i w:val="0"/>
+                <w:sz w:val="20"/>
+              </w:rPr>
+              <w:t>Notifikasi deteksi file berbahaya ke Slack</w:t>
+            </w:r>
+          </w:p>
+        </w:tc>
+        <w:tc>
+          <w:tcPr>
+            <w:tcW w:type="dxa" w:w="1872"/>
+            <w:tcBorders>
+              <w:top w:sz="4" w:val="single" w:color="000000"/>
+              <w:left w:sz="4" w:val="single" w:color="000000"/>
+              <w:bottom w:sz="4" w:val="single" w:color="000000"/>
+              <w:right w:sz="4" w:val="single" w:color="000000"/>
+            </w:tcBorders>
+          </w:tcPr>
+          <w:p>
+            <w:pPr>
+              <w:spacing w:line="360" w:lineRule="auto" w:before="0" w:after="0"/>
+            </w:pPr>
+            <w:r/>
+            <w:r>
+              <w:rPr>
+                <w:rFonts w:ascii="Times New Roman" w:hAnsi="Times New Roman" w:eastAsia="Times New Roman"/>
+                <w:b w:val="0"/>
+                <w:i w:val="0"/>
+                <w:sz w:val="20"/>
+              </w:rPr>
+              <w:t>Template workflow n8n dengan VirusTotal</w:t>
+            </w:r>
+          </w:p>
+        </w:tc>
+        <w:tc>
+          <w:tcPr>
+            <w:tcW w:type="dxa" w:w="2218"/>
+            <w:tcBorders>
+              <w:top w:sz="4" w:val="single" w:color="000000"/>
+              <w:left w:sz="4" w:val="single" w:color="000000"/>
+              <w:bottom w:sz="4" w:val="single" w:color="000000"/>
+              <w:right w:sz="4" w:val="single" w:color="000000"/>
+            </w:tcBorders>
+          </w:tcPr>
+          <w:p>
+            <w:pPr>
+              <w:spacing w:line="360" w:lineRule="auto" w:before="0" w:after="0"/>
+            </w:pPr>
+            <w:r/>
+            <w:r>
+              <w:rPr>
+                <w:rFonts w:ascii="Times New Roman" w:hAnsi="Times New Roman" w:eastAsia="Times New Roman"/>
+                <w:b w:val="0"/>
+                <w:i w:val="0"/>
+                <w:sz w:val="20"/>
+              </w:rPr>
+              <w:t>Notifikasi Slack satu arah; tanpa mitigasi</w:t>
+            </w:r>
+          </w:p>
+        </w:tc>
+      </w:tr>
+      <w:tr>
+        <w:trPr>
+          <w:cantSplit/>
+        </w:trPr>
+        <w:tc>
+          <w:tcPr>
+            <w:tcW w:type="dxa" w:w="2232"/>
+            <w:tcBorders>
+              <w:top w:sz="4" w:val="single" w:color="000000"/>
+              <w:left w:sz="4" w:val="single" w:color="000000"/>
+              <w:bottom w:sz="4" w:val="single" w:color="000000"/>
+              <w:right w:sz="4" w:val="single" w:color="000000"/>
+            </w:tcBorders>
+          </w:tcPr>
+          <w:p>
+            <w:pPr>
+              <w:spacing w:line="360" w:lineRule="auto" w:before="0" w:after="0"/>
+            </w:pPr>
+            <w:r/>
+            <w:r>
+              <w:rPr>
+                <w:rFonts w:ascii="Times New Roman" w:hAnsi="Times New Roman" w:eastAsia="Times New Roman"/>
+                <w:b w:val="0"/>
+                <w:i w:val="0"/>
+                <w:sz w:val="20"/>
+              </w:rPr>
+              <w:t>Nadig &amp; Vignesh (2026) — peningkatan Wazuh SIEM melalui integrasi SOAR untuk respons otomatis</w:t>
+            </w:r>
+          </w:p>
+        </w:tc>
+        <w:tc>
+          <w:tcPr>
+            <w:tcW w:type="dxa" w:w="1944"/>
+            <w:tcBorders>
+              <w:top w:sz="4" w:val="single" w:color="000000"/>
+              <w:left w:sz="4" w:val="single" w:color="000000"/>
+              <w:bottom w:sz="4" w:val="single" w:color="000000"/>
+              <w:right w:sz="4" w:val="single" w:color="000000"/>
+            </w:tcBorders>
+          </w:tcPr>
+          <w:p>
+            <w:pPr>
+              <w:spacing w:line="360" w:lineRule="auto" w:before="0" w:after="0"/>
+            </w:pPr>
+            <w:r/>
+            <w:r>
+              <w:rPr>
+                <w:rFonts w:ascii="Times New Roman" w:hAnsi="Times New Roman" w:eastAsia="Times New Roman"/>
+                <w:b w:val="0"/>
+                <w:i w:val="0"/>
+                <w:sz w:val="20"/>
+              </w:rPr>
+              <w:t>Respons ancaman otomatis melalui integrasi SOAR</w:t>
+            </w:r>
+          </w:p>
+        </w:tc>
+        <w:tc>
+          <w:tcPr>
+            <w:tcW w:type="dxa" w:w="1872"/>
+            <w:tcBorders>
+              <w:top w:sz="4" w:val="single" w:color="000000"/>
+              <w:left w:sz="4" w:val="single" w:color="000000"/>
+              <w:bottom w:sz="4" w:val="single" w:color="000000"/>
+              <w:right w:sz="4" w:val="single" w:color="000000"/>
+            </w:tcBorders>
+          </w:tcPr>
+          <w:p>
+            <w:pPr>
+              <w:spacing w:line="360" w:lineRule="auto" w:before="0" w:after="0"/>
+            </w:pPr>
+            <w:r/>
+            <w:r>
+              <w:rPr>
+                <w:rFonts w:ascii="Times New Roman" w:hAnsi="Times New Roman" w:eastAsia="Times New Roman"/>
+                <w:b w:val="0"/>
+                <w:i w:val="0"/>
+                <w:sz w:val="20"/>
+              </w:rPr>
+              <w:t>Integrasi Wazuh dengan SOAR; respons otomatis</w:t>
+            </w:r>
+          </w:p>
+        </w:tc>
+        <w:tc>
+          <w:tcPr>
+            <w:tcW w:type="dxa" w:w="2218"/>
+            <w:tcBorders>
+              <w:top w:sz="4" w:val="single" w:color="000000"/>
+              <w:left w:sz="4" w:val="single" w:color="000000"/>
+              <w:bottom w:sz="4" w:val="single" w:color="000000"/>
+              <w:right w:sz="4" w:val="single" w:color="000000"/>
+            </w:tcBorders>
+          </w:tcPr>
+          <w:p>
+            <w:pPr>
+              <w:spacing w:line="360" w:lineRule="auto" w:before="0" w:after="0"/>
+            </w:pPr>
+            <w:r/>
+            <w:r>
+              <w:rPr>
+                <w:rFonts w:ascii="Times New Roman" w:hAnsi="Times New Roman" w:eastAsia="Times New Roman"/>
+                <w:b w:val="0"/>
+                <w:i w:val="0"/>
+                <w:sz w:val="20"/>
+              </w:rPr>
+              <w:t>Respons otomatis; tanpa keterlibatan analis</w:t>
+            </w:r>
+          </w:p>
+        </w:tc>
+      </w:tr>
+      <w:tr>
+        <w:trPr>
+          <w:cantSplit/>
+        </w:trPr>
+        <w:tc>
+          <w:tcPr>
+            <w:tcW w:type="dxa" w:w="2232"/>
+            <w:tcBorders>
+              <w:top w:sz="4" w:val="single" w:color="000000"/>
+              <w:left w:sz="4" w:val="single" w:color="000000"/>
+              <w:bottom w:sz="4" w:val="single" w:color="000000"/>
+              <w:right w:sz="4" w:val="single" w:color="000000"/>
+            </w:tcBorders>
+          </w:tcPr>
+          <w:p>
+            <w:pPr>
+              <w:spacing w:line="360" w:lineRule="auto" w:before="0" w:after="0"/>
+            </w:pPr>
+            <w:r/>
+            <w:r>
+              <w:rPr>
+                <w:rFonts w:ascii="Times New Roman" w:hAnsi="Times New Roman" w:eastAsia="Times New Roman"/>
+                <w:b w:val="0"/>
+                <w:i w:val="0"/>
+                <w:sz w:val="20"/>
+              </w:rPr>
+              <w:t>Alves dkk. (2026) — Wazuh untuk deteksi insiden: perancangan dan implementasi</w:t>
+            </w:r>
+          </w:p>
+        </w:tc>
+        <w:tc>
+          <w:tcPr>
+            <w:tcW w:type="dxa" w:w="1944"/>
+            <w:tcBorders>
+              <w:top w:sz="4" w:val="single" w:color="000000"/>
+              <w:left w:sz="4" w:val="single" w:color="000000"/>
+              <w:bottom w:sz="4" w:val="single" w:color="000000"/>
+              <w:right w:sz="4" w:val="single" w:color="000000"/>
+            </w:tcBorders>
+          </w:tcPr>
+          <w:p>
+            <w:pPr>
+              <w:spacing w:line="360" w:lineRule="auto" w:before="0" w:after="0"/>
+            </w:pPr>
+            <w:r/>
+            <w:r>
+              <w:rPr>
+                <w:rFonts w:ascii="Times New Roman" w:hAnsi="Times New Roman" w:eastAsia="Times New Roman"/>
+                <w:b w:val="0"/>
+                <w:i w:val="0"/>
+                <w:sz w:val="20"/>
+              </w:rPr>
+              <w:t>Perancangan dan implementasi deteksi insiden berbasis Wazuh</w:t>
+            </w:r>
+          </w:p>
+        </w:tc>
+        <w:tc>
+          <w:tcPr>
+            <w:tcW w:type="dxa" w:w="1872"/>
+            <w:tcBorders>
+              <w:top w:sz="4" w:val="single" w:color="000000"/>
+              <w:left w:sz="4" w:val="single" w:color="000000"/>
+              <w:bottom w:sz="4" w:val="single" w:color="000000"/>
+              <w:right w:sz="4" w:val="single" w:color="000000"/>
+            </w:tcBorders>
+          </w:tcPr>
+          <w:p>
+            <w:pPr>
+              <w:spacing w:line="360" w:lineRule="auto" w:before="0" w:after="0"/>
+            </w:pPr>
+            <w:r/>
+            <w:r>
+              <w:rPr>
+                <w:rFonts w:ascii="Times New Roman" w:hAnsi="Times New Roman" w:eastAsia="Times New Roman"/>
+                <w:b w:val="0"/>
+                <w:i w:val="0"/>
+                <w:sz w:val="20"/>
+              </w:rPr>
+              <w:t>Deteksi dan korelasi insiden pada Wazuh</w:t>
+            </w:r>
+          </w:p>
+        </w:tc>
+        <w:tc>
+          <w:tcPr>
+            <w:tcW w:type="dxa" w:w="2218"/>
+            <w:tcBorders>
+              <w:top w:sz="4" w:val="single" w:color="000000"/>
+              <w:left w:sz="4" w:val="single" w:color="000000"/>
+              <w:bottom w:sz="4" w:val="single" w:color="000000"/>
+              <w:right w:sz="4" w:val="single" w:color="000000"/>
+            </w:tcBorders>
+          </w:tcPr>
+          <w:p>
+            <w:pPr>
+              <w:spacing w:line="360" w:lineRule="auto" w:before="0" w:after="0"/>
+            </w:pPr>
+            <w:r/>
+            <w:r>
+              <w:rPr>
+                <w:rFonts w:ascii="Times New Roman" w:hAnsi="Times New Roman" w:eastAsia="Times New Roman"/>
+                <w:b w:val="0"/>
+                <w:i w:val="0"/>
+                <w:sz w:val="20"/>
+              </w:rPr>
+              <w:t>Berorientasi deteksi; minim otomatisasi respons</w:t>
+            </w:r>
+          </w:p>
+        </w:tc>
+      </w:tr>
+      <w:tr>
+        <w:trPr>
+          <w:cantSplit/>
+        </w:trPr>
+        <w:tc>
+          <w:tcPr>
+            <w:tcW w:type="dxa" w:w="2232"/>
+            <w:tcBorders>
+              <w:top w:sz="4" w:val="single" w:color="000000"/>
+              <w:left w:sz="4" w:val="single" w:color="000000"/>
+              <w:bottom w:sz="4" w:val="single" w:color="000000"/>
+              <w:right w:sz="4" w:val="single" w:color="000000"/>
+            </w:tcBorders>
+          </w:tcPr>
+          <w:p>
+            <w:pPr>
+              <w:spacing w:line="360" w:lineRule="auto" w:before="0" w:after="0"/>
+            </w:pPr>
+            <w:r/>
+            <w:r>
+              <w:rPr>
+                <w:rFonts w:ascii="Times New Roman" w:hAnsi="Times New Roman" w:eastAsia="Times New Roman"/>
+                <w:b w:val="0"/>
+                <w:i w:val="0"/>
+                <w:sz w:val="20"/>
+              </w:rPr>
+              <w:t>Raed (2025) — SOC bertenaga AI: Wazuh, n8n, Claude AI, dan MCP</w:t>
+            </w:r>
+          </w:p>
+        </w:tc>
+        <w:tc>
+          <w:tcPr>
+            <w:tcW w:type="dxa" w:w="1944"/>
+            <w:tcBorders>
+              <w:top w:sz="4" w:val="single" w:color="000000"/>
+              <w:left w:sz="4" w:val="single" w:color="000000"/>
+              <w:bottom w:sz="4" w:val="single" w:color="000000"/>
+              <w:right w:sz="4" w:val="single" w:color="000000"/>
+            </w:tcBorders>
+          </w:tcPr>
+          <w:p>
+            <w:pPr>
+              <w:spacing w:line="360" w:lineRule="auto" w:before="0" w:after="0"/>
+            </w:pPr>
+            <w:r/>
+            <w:r>
+              <w:rPr>
+                <w:rFonts w:ascii="Times New Roman" w:hAnsi="Times New Roman" w:eastAsia="Times New Roman"/>
+                <w:b w:val="0"/>
+                <w:i w:val="0"/>
+                <w:sz w:val="20"/>
+              </w:rPr>
+              <w:t>SOC end-to-end dari deteksi hingga respons dengan bantuan AI</w:t>
+            </w:r>
+          </w:p>
+        </w:tc>
+        <w:tc>
+          <w:tcPr>
+            <w:tcW w:type="dxa" w:w="1872"/>
+            <w:tcBorders>
+              <w:top w:sz="4" w:val="single" w:color="000000"/>
+              <w:left w:sz="4" w:val="single" w:color="000000"/>
+              <w:bottom w:sz="4" w:val="single" w:color="000000"/>
+              <w:right w:sz="4" w:val="single" w:color="000000"/>
+            </w:tcBorders>
+          </w:tcPr>
+          <w:p>
+            <w:pPr>
+              <w:spacing w:line="360" w:lineRule="auto" w:before="0" w:after="0"/>
+            </w:pPr>
+            <w:r/>
+            <w:r>
+              <w:rPr>
+                <w:rFonts w:ascii="Times New Roman" w:hAnsi="Times New Roman" w:eastAsia="Times New Roman"/>
+                <w:b w:val="0"/>
+                <w:i w:val="0"/>
+                <w:sz w:val="20"/>
+              </w:rPr>
+              <w:t>Orkestrasi n8n dengan LLM Claude berbasis cloud (via MCP)</w:t>
+            </w:r>
+          </w:p>
+        </w:tc>
+        <w:tc>
+          <w:tcPr>
+            <w:tcW w:type="dxa" w:w="2218"/>
+            <w:tcBorders>
+              <w:top w:sz="4" w:val="single" w:color="000000"/>
+              <w:left w:sz="4" w:val="single" w:color="000000"/>
+              <w:bottom w:sz="4" w:val="single" w:color="000000"/>
+              <w:right w:sz="4" w:val="single" w:color="000000"/>
+            </w:tcBorders>
+          </w:tcPr>
+          <w:p>
+            <w:pPr>
+              <w:spacing w:line="360" w:lineRule="auto" w:before="0" w:after="0"/>
+            </w:pPr>
+            <w:r/>
+            <w:r>
+              <w:rPr>
+                <w:rFonts w:ascii="Times New Roman" w:hAnsi="Times New Roman" w:eastAsia="Times New Roman"/>
+                <w:b w:val="0"/>
+                <w:i w:val="0"/>
+                <w:sz w:val="20"/>
+              </w:rPr>
+              <w:t>Respons dibantu AI; tanpa kanal keputusan dua arah</w:t>
+            </w:r>
+          </w:p>
+        </w:tc>
+      </w:tr>
+      <w:tr>
+        <w:trPr>
+          <w:cantSplit/>
+        </w:trPr>
+        <w:tc>
+          <w:tcPr>
+            <w:tcW w:type="dxa" w:w="2232"/>
+            <w:tcBorders>
+              <w:top w:sz="4" w:val="single" w:color="000000"/>
+              <w:left w:sz="4" w:val="single" w:color="000000"/>
+              <w:bottom w:sz="4" w:val="single" w:color="000000"/>
+              <w:right w:sz="4" w:val="single" w:color="000000"/>
+            </w:tcBorders>
+          </w:tcPr>
+          <w:p>
+            <w:pPr>
+              <w:spacing w:line="360" w:lineRule="auto" w:before="0" w:after="0"/>
+            </w:pPr>
+            <w:r/>
+            <w:r>
+              <w:rPr>
+                <w:rFonts w:ascii="Times New Roman" w:hAnsi="Times New Roman" w:eastAsia="Times New Roman"/>
+                <w:b w:val="0"/>
+                <w:i w:val="0"/>
+                <w:sz w:val="20"/>
+              </w:rPr>
+              <w:t>zhadyz (2025) — AI_SOC: SOC open-source berbasis LLM multi-agent (Ollama, Wazuh, TheHive, RAG)</w:t>
+            </w:r>
+          </w:p>
+        </w:tc>
+        <w:tc>
+          <w:tcPr>
+            <w:tcW w:type="dxa" w:w="1944"/>
+            <w:tcBorders>
+              <w:top w:sz="4" w:val="single" w:color="000000"/>
+              <w:left w:sz="4" w:val="single" w:color="000000"/>
+              <w:bottom w:sz="4" w:val="single" w:color="000000"/>
+              <w:right w:sz="4" w:val="single" w:color="000000"/>
+            </w:tcBorders>
+          </w:tcPr>
+          <w:p>
+            <w:pPr>
+              <w:spacing w:line="360" w:lineRule="auto" w:before="0" w:after="0"/>
+            </w:pPr>
+            <w:r/>
+            <w:r>
+              <w:rPr>
+                <w:rFonts w:ascii="Times New Roman" w:hAnsi="Times New Roman" w:eastAsia="Times New Roman"/>
+                <w:b w:val="0"/>
+                <w:i w:val="0"/>
+                <w:sz w:val="20"/>
+              </w:rPr>
+              <w:t>SOC open-source dengan LLM multi-agent dan AI lokal</w:t>
+            </w:r>
+          </w:p>
+        </w:tc>
+        <w:tc>
+          <w:tcPr>
+            <w:tcW w:type="dxa" w:w="1872"/>
+            <w:tcBorders>
+              <w:top w:sz="4" w:val="single" w:color="000000"/>
+              <w:left w:sz="4" w:val="single" w:color="000000"/>
+              <w:bottom w:sz="4" w:val="single" w:color="000000"/>
+              <w:right w:sz="4" w:val="single" w:color="000000"/>
+            </w:tcBorders>
+          </w:tcPr>
+          <w:p>
+            <w:pPr>
+              <w:spacing w:line="360" w:lineRule="auto" w:before="0" w:after="0"/>
+            </w:pPr>
+            <w:r/>
+            <w:r>
+              <w:rPr>
+                <w:rFonts w:ascii="Times New Roman" w:hAnsi="Times New Roman" w:eastAsia="Times New Roman"/>
+                <w:b w:val="0"/>
+                <w:i w:val="0"/>
+                <w:sz w:val="20"/>
+              </w:rPr>
+              <w:t>LLM multi-agent, Ollama, Wazuh, dan TheHive</w:t>
+            </w:r>
+          </w:p>
+        </w:tc>
+        <w:tc>
+          <w:tcPr>
+            <w:tcW w:type="dxa" w:w="2218"/>
+            <w:tcBorders>
+              <w:top w:sz="4" w:val="single" w:color="000000"/>
+              <w:left w:sz="4" w:val="single" w:color="000000"/>
+              <w:bottom w:sz="4" w:val="single" w:color="000000"/>
+              <w:right w:sz="4" w:val="single" w:color="000000"/>
+            </w:tcBorders>
+          </w:tcPr>
+          <w:p>
+            <w:pPr>
+              <w:spacing w:line="360" w:lineRule="auto" w:before="0" w:after="0"/>
+            </w:pPr>
+            <w:r/>
+            <w:r>
+              <w:rPr>
+                <w:rFonts w:ascii="Times New Roman" w:hAnsi="Times New Roman" w:eastAsia="Times New Roman"/>
+                <w:b w:val="0"/>
+                <w:i w:val="0"/>
+                <w:sz w:val="20"/>
+              </w:rPr>
+              <w:t>Triase berbasis TheHive; tanpa mitigasi dua arah via chat</w:t>
+            </w:r>
+          </w:p>
+        </w:tc>
+      </w:tr>
+    </w:tbl>
+    <w:p>
+      <w:pPr>
+        <w:spacing w:after="240"/>
+      </w:pPr>
+    </w:p>
+    <w:p>
+      <w:pPr>
+        <w:keepNext/>
+        <w:spacing w:line="360" w:lineRule="auto" w:before="0" w:after="120"/>
+      </w:pPr>
+      <w:r>
+        <w:rPr>
+          <w:rFonts w:ascii="Times New Roman" w:hAnsi="Times New Roman" w:eastAsia="Times New Roman"/>
+          <w:b/>
+          <w:i w:val="0"/>
+          <w:sz w:val="20"/>
+        </w:rPr>
+        <w:t xml:space="preserve">Tabel 4 </w:t>
+      </w:r>
+      <w:r>
+        <w:rPr>
+          <w:rFonts w:ascii="Times New Roman" w:hAnsi="Times New Roman" w:eastAsia="Times New Roman"/>
+          <w:b w:val="0"/>
+          <w:i w:val="0"/>
+          <w:sz w:val="20"/>
+        </w:rPr>
+        <w:t>Kesenjangan Penelitian Terdahulu dan Kontribusi Proyek.</w:t>
+      </w:r>
+    </w:p>
+    <w:tbl>
+      <w:tblPr>
+        <w:tblW w:type="auto" w:w="0"/>
+        <w:jc w:val="center"/>
+        <w:tblLayout w:type="fixed"/>
+        <w:tblLook w:firstColumn="1" w:firstRow="1" w:lastColumn="0" w:lastRow="0" w:noHBand="0" w:noVBand="1" w:val="04A0"/>
+      </w:tblPr>
+      <w:tblGrid>
+        <w:gridCol w:w="1872"/>
+        <w:gridCol w:w="3196"/>
+        <w:gridCol w:w="3196"/>
+      </w:tblGrid>
+      <w:tr>
+        <w:trPr>
+          <w:cantSplit/>
+          <w:tblHeader w:val="true"/>
+        </w:trPr>
+        <w:tc>
+          <w:tcPr>
+            <w:tcW w:type="dxa" w:w="1872"/>
+            <w:tcBorders>
+              <w:top w:sz="4" w:val="single" w:color="000000"/>
+              <w:left w:sz="4" w:val="single" w:color="000000"/>
+              <w:bottom w:sz="4" w:val="single" w:color="000000"/>
+              <w:right w:sz="4" w:val="single" w:color="000000"/>
+            </w:tcBorders>
+          </w:tcPr>
+          <w:p>
+            <w:pPr>
+              <w:spacing w:line="360" w:lineRule="auto" w:before="0" w:after="0"/>
+              <w:jc w:val="center"/>
+            </w:pPr>
+            <w:r/>
+            <w:r>
+              <w:rPr>
+                <w:rFonts w:ascii="Times New Roman" w:hAnsi="Times New Roman" w:eastAsia="Times New Roman"/>
+                <w:b/>
+                <w:i w:val="0"/>
+                <w:sz w:val="20"/>
+              </w:rPr>
+              <w:t>Sumber</w:t>
+            </w:r>
+          </w:p>
+        </w:tc>
+        <w:tc>
+          <w:tcPr>
+            <w:tcW w:type="dxa" w:w="3197"/>
             <w:tcBorders>
               <w:top w:sz="4" w:val="single" w:color="000000"/>
               <w:left w:sz="4" w:val="single" w:color="000000"/>
@@ -2159,7 +3104,7 @@
         </w:tc>
         <w:tc>
           <w:tcPr>
-            <w:tcW w:type="dxa" w:w="1469"/>
+            <w:tcW w:type="dxa" w:w="3197"/>
             <w:tcBorders>
               <w:top w:sz="4" w:val="single" w:color="000000"/>
               <w:left w:sz="4" w:val="single" w:color="000000"/>
@@ -2191,7 +3136,7 @@
         </w:trPr>
         <w:tc>
           <w:tcPr>
-            <w:tcW w:type="dxa" w:w="1584"/>
+            <w:tcW w:type="dxa" w:w="1872"/>
             <w:tcBorders>
               <w:top w:sz="4" w:val="single" w:color="000000"/>
               <w:left w:sz="4" w:val="single" w:color="000000"/>
@@ -2211,91 +3156,13 @@
                 <w:i w:val="0"/>
                 <w:sz w:val="20"/>
               </w:rPr>
-              <w:t>Thakker dkk. (2025) — pertahanan otomatis serangan application-layer pada Windows (Wazuh dan Shuffle)</w:t>
+              <w:t>Thakker dkk. (2025)</w:t>
             </w:r>
           </w:p>
         </w:tc>
         <w:tc>
           <w:tcPr>
-            <w:tcW w:type="dxa" w:w="1267"/>
-            <w:tcBorders>
-              <w:top w:sz="4" w:val="single" w:color="000000"/>
-              <w:left w:sz="4" w:val="single" w:color="000000"/>
-              <w:bottom w:sz="4" w:val="single" w:color="000000"/>
-              <w:right w:sz="4" w:val="single" w:color="000000"/>
-            </w:tcBorders>
-          </w:tcPr>
-          <w:p>
-            <w:pPr>
-              <w:spacing w:line="360" w:lineRule="auto" w:before="0" w:after="0"/>
-            </w:pPr>
-            <w:r/>
-            <w:r>
-              <w:rPr>
-                <w:rFonts w:ascii="Times New Roman" w:hAnsi="Times New Roman" w:eastAsia="Times New Roman"/>
-                <w:b w:val="0"/>
-                <w:i w:val="0"/>
-                <w:sz w:val="20"/>
-              </w:rPr>
-              <w:t>Mitigasi otomatis serangan application-layer pada endpoint Windows</w:t>
-            </w:r>
-          </w:p>
-        </w:tc>
-        <w:tc>
-          <w:tcPr>
-            <w:tcW w:type="dxa" w:w="1267"/>
-            <w:tcBorders>
-              <w:top w:sz="4" w:val="single" w:color="000000"/>
-              <w:left w:sz="4" w:val="single" w:color="000000"/>
-              <w:bottom w:sz="4" w:val="single" w:color="000000"/>
-              <w:right w:sz="4" w:val="single" w:color="000000"/>
-            </w:tcBorders>
-          </w:tcPr>
-          <w:p>
-            <w:pPr>
-              <w:spacing w:line="360" w:lineRule="auto" w:before="0" w:after="0"/>
-            </w:pPr>
-            <w:r/>
-            <w:r>
-              <w:rPr>
-                <w:rFonts w:ascii="Times New Roman" w:hAnsi="Times New Roman" w:eastAsia="Times New Roman"/>
-                <w:b w:val="0"/>
-                <w:i w:val="0"/>
-                <w:sz w:val="20"/>
-              </w:rPr>
-              <w:t>Integrasi Wazuh dan Shuffle; pemblokiran otomatis berbasis aturan</w:t>
-            </w:r>
-          </w:p>
-        </w:tc>
-        <w:tc>
-          <w:tcPr>
-            <w:tcW w:type="dxa" w:w="1325"/>
-            <w:tcBorders>
-              <w:top w:sz="4" w:val="single" w:color="000000"/>
-              <w:left w:sz="4" w:val="single" w:color="000000"/>
-              <w:bottom w:sz="4" w:val="single" w:color="000000"/>
-              <w:right w:sz="4" w:val="single" w:color="000000"/>
-            </w:tcBorders>
-          </w:tcPr>
-          <w:p>
-            <w:pPr>
-              <w:spacing w:line="360" w:lineRule="auto" w:before="0" w:after="0"/>
-            </w:pPr>
-            <w:r/>
-            <w:r>
-              <w:rPr>
-                <w:rFonts w:ascii="Times New Roman" w:hAnsi="Times New Roman" w:eastAsia="Times New Roman"/>
-                <w:b w:val="0"/>
-                <w:i w:val="0"/>
-                <w:sz w:val="20"/>
-              </w:rPr>
-              <w:t>Active Response otomatis penuh; tanpa notifikasi interaktif</w:t>
-            </w:r>
-          </w:p>
-        </w:tc>
-        <w:tc>
-          <w:tcPr>
-            <w:tcW w:type="dxa" w:w="1354"/>
+            <w:tcW w:type="dxa" w:w="3197"/>
             <w:tcBorders>
               <w:top w:sz="4" w:val="single" w:color="000000"/>
               <w:left w:sz="4" w:val="single" w:color="000000"/>
@@ -2321,7 +3188,7 @@
         </w:tc>
         <w:tc>
           <w:tcPr>
-            <w:tcW w:type="dxa" w:w="1469"/>
+            <w:tcW w:type="dxa" w:w="3197"/>
             <w:tcBorders>
               <w:top w:sz="4" w:val="single" w:color="000000"/>
               <w:left w:sz="4" w:val="single" w:color="000000"/>
@@ -2352,7 +3219,7 @@
         </w:trPr>
         <w:tc>
           <w:tcPr>
-            <w:tcW w:type="dxa" w:w="1584"/>
+            <w:tcW w:type="dxa" w:w="1872"/>
             <w:tcBorders>
               <w:top w:sz="4" w:val="single" w:color="000000"/>
               <w:left w:sz="4" w:val="single" w:color="000000"/>
@@ -2372,91 +3239,13 @@
                 <w:i w:val="0"/>
                 <w:sz w:val="20"/>
               </w:rPr>
-              <w:t>Farrel (2024) — SIEM Wazuh dengan Active Response dan notifikasi Telegram untuk brute force</w:t>
+              <w:t>Farrel (2024)</w:t>
             </w:r>
           </w:p>
         </w:tc>
         <w:tc>
           <w:tcPr>
-            <w:tcW w:type="dxa" w:w="1267"/>
-            <w:tcBorders>
-              <w:top w:sz="4" w:val="single" w:color="000000"/>
-              <w:left w:sz="4" w:val="single" w:color="000000"/>
-              <w:bottom w:sz="4" w:val="single" w:color="000000"/>
-              <w:right w:sz="4" w:val="single" w:color="000000"/>
-            </w:tcBorders>
-          </w:tcPr>
-          <w:p>
-            <w:pPr>
-              <w:spacing w:line="360" w:lineRule="auto" w:before="0" w:after="0"/>
-            </w:pPr>
-            <w:r/>
-            <w:r>
-              <w:rPr>
-                <w:rFonts w:ascii="Times New Roman" w:hAnsi="Times New Roman" w:eastAsia="Times New Roman"/>
-                <w:b w:val="0"/>
-                <w:i w:val="0"/>
-                <w:sz w:val="20"/>
-              </w:rPr>
-              <w:t>Mitigasi serangan brute force pada sistem informasi</w:t>
-            </w:r>
-          </w:p>
-        </w:tc>
-        <w:tc>
-          <w:tcPr>
-            <w:tcW w:type="dxa" w:w="1267"/>
-            <w:tcBorders>
-              <w:top w:sz="4" w:val="single" w:color="000000"/>
-              <w:left w:sz="4" w:val="single" w:color="000000"/>
-              <w:bottom w:sz="4" w:val="single" w:color="000000"/>
-              <w:right w:sz="4" w:val="single" w:color="000000"/>
-            </w:tcBorders>
-          </w:tcPr>
-          <w:p>
-            <w:pPr>
-              <w:spacing w:line="360" w:lineRule="auto" w:before="0" w:after="0"/>
-            </w:pPr>
-            <w:r/>
-            <w:r>
-              <w:rPr>
-                <w:rFonts w:ascii="Times New Roman" w:hAnsi="Times New Roman" w:eastAsia="Times New Roman"/>
-                <w:b w:val="0"/>
-                <w:i w:val="0"/>
-                <w:sz w:val="20"/>
-              </w:rPr>
-              <w:t>Wazuh Active Response dengan notifikasi Telegram</w:t>
-            </w:r>
-          </w:p>
-        </w:tc>
-        <w:tc>
-          <w:tcPr>
-            <w:tcW w:type="dxa" w:w="1325"/>
-            <w:tcBorders>
-              <w:top w:sz="4" w:val="single" w:color="000000"/>
-              <w:left w:sz="4" w:val="single" w:color="000000"/>
-              <w:bottom w:sz="4" w:val="single" w:color="000000"/>
-              <w:right w:sz="4" w:val="single" w:color="000000"/>
-            </w:tcBorders>
-          </w:tcPr>
-          <w:p>
-            <w:pPr>
-              <w:spacing w:line="360" w:lineRule="auto" w:before="0" w:after="0"/>
-            </w:pPr>
-            <w:r/>
-            <w:r>
-              <w:rPr>
-                <w:rFonts w:ascii="Times New Roman" w:hAnsi="Times New Roman" w:eastAsia="Times New Roman"/>
-                <w:b w:val="0"/>
-                <w:i w:val="0"/>
-                <w:sz w:val="20"/>
-              </w:rPr>
-              <w:t>Active Response otomatis; notifikasi Telegram satu arah</w:t>
-            </w:r>
-          </w:p>
-        </w:tc>
-        <w:tc>
-          <w:tcPr>
-            <w:tcW w:type="dxa" w:w="1354"/>
+            <w:tcW w:type="dxa" w:w="3197"/>
             <w:tcBorders>
               <w:top w:sz="4" w:val="single" w:color="000000"/>
               <w:left w:sz="4" w:val="single" w:color="000000"/>
@@ -2482,7 +3271,7 @@
         </w:tc>
         <w:tc>
           <w:tcPr>
-            <w:tcW w:type="dxa" w:w="1469"/>
+            <w:tcW w:type="dxa" w:w="3197"/>
             <w:tcBorders>
               <w:top w:sz="4" w:val="single" w:color="000000"/>
               <w:left w:sz="4" w:val="single" w:color="000000"/>
@@ -2513,7 +3302,7 @@
         </w:trPr>
         <w:tc>
           <w:tcPr>
-            <w:tcW w:type="dxa" w:w="1584"/>
+            <w:tcW w:type="dxa" w:w="1872"/>
             <w:tcBorders>
               <w:top w:sz="4" w:val="single" w:color="000000"/>
               <w:left w:sz="4" w:val="single" w:color="000000"/>
@@ -2533,91 +3322,13 @@
                 <w:i w:val="0"/>
                 <w:sz w:val="20"/>
               </w:rPr>
-              <w:t>Sarker (2025) — otomasi SOC: Wazuh, n8n, VirusTotal, dan Gmail untuk deteksi file berbahaya</w:t>
+              <w:t>Sarker (2025)</w:t>
             </w:r>
           </w:p>
         </w:tc>
         <w:tc>
           <w:tcPr>
-            <w:tcW w:type="dxa" w:w="1267"/>
-            <w:tcBorders>
-              <w:top w:sz="4" w:val="single" w:color="000000"/>
-              <w:left w:sz="4" w:val="single" w:color="000000"/>
-              <w:bottom w:sz="4" w:val="single" w:color="000000"/>
-              <w:right w:sz="4" w:val="single" w:color="000000"/>
-            </w:tcBorders>
-          </w:tcPr>
-          <w:p>
-            <w:pPr>
-              <w:spacing w:line="360" w:lineRule="auto" w:before="0" w:after="0"/>
-            </w:pPr>
-            <w:r/>
-            <w:r>
-              <w:rPr>
-                <w:rFonts w:ascii="Times New Roman" w:hAnsi="Times New Roman" w:eastAsia="Times New Roman"/>
-                <w:b w:val="0"/>
-                <w:i w:val="0"/>
-                <w:sz w:val="20"/>
-              </w:rPr>
-              <w:t>Deteksi file berbahaya berbasis orkestrasi n8n</w:t>
-            </w:r>
-          </w:p>
-        </w:tc>
-        <w:tc>
-          <w:tcPr>
-            <w:tcW w:type="dxa" w:w="1267"/>
-            <w:tcBorders>
-              <w:top w:sz="4" w:val="single" w:color="000000"/>
-              <w:left w:sz="4" w:val="single" w:color="000000"/>
-              <w:bottom w:sz="4" w:val="single" w:color="000000"/>
-              <w:right w:sz="4" w:val="single" w:color="000000"/>
-            </w:tcBorders>
-          </w:tcPr>
-          <w:p>
-            <w:pPr>
-              <w:spacing w:line="360" w:lineRule="auto" w:before="0" w:after="0"/>
-            </w:pPr>
-            <w:r/>
-            <w:r>
-              <w:rPr>
-                <w:rFonts w:ascii="Times New Roman" w:hAnsi="Times New Roman" w:eastAsia="Times New Roman"/>
-                <w:b w:val="0"/>
-                <w:i w:val="0"/>
-                <w:sz w:val="20"/>
-              </w:rPr>
-              <w:t>Orkestrasi n8n dengan VirusTotal dan notifikasi Gmail</w:t>
-            </w:r>
-          </w:p>
-        </w:tc>
-        <w:tc>
-          <w:tcPr>
-            <w:tcW w:type="dxa" w:w="1325"/>
-            <w:tcBorders>
-              <w:top w:sz="4" w:val="single" w:color="000000"/>
-              <w:left w:sz="4" w:val="single" w:color="000000"/>
-              <w:bottom w:sz="4" w:val="single" w:color="000000"/>
-              <w:right w:sz="4" w:val="single" w:color="000000"/>
-            </w:tcBorders>
-          </w:tcPr>
-          <w:p>
-            <w:pPr>
-              <w:spacing w:line="360" w:lineRule="auto" w:before="0" w:after="0"/>
-            </w:pPr>
-            <w:r/>
-            <w:r>
-              <w:rPr>
-                <w:rFonts w:ascii="Times New Roman" w:hAnsi="Times New Roman" w:eastAsia="Times New Roman"/>
-                <w:b w:val="0"/>
-                <w:i w:val="0"/>
-                <w:sz w:val="20"/>
-              </w:rPr>
-              <w:t>Notifikasi email satu arah; tanpa mitigasi aktif</w:t>
-            </w:r>
-          </w:p>
-        </w:tc>
-        <w:tc>
-          <w:tcPr>
-            <w:tcW w:type="dxa" w:w="1354"/>
+            <w:tcW w:type="dxa" w:w="3197"/>
             <w:tcBorders>
               <w:top w:sz="4" w:val="single" w:color="000000"/>
               <w:left w:sz="4" w:val="single" w:color="000000"/>
@@ -2643,7 +3354,7 @@
         </w:tc>
         <w:tc>
           <w:tcPr>
-            <w:tcW w:type="dxa" w:w="1469"/>
+            <w:tcW w:type="dxa" w:w="3197"/>
             <w:tcBorders>
               <w:top w:sz="4" w:val="single" w:color="000000"/>
               <w:left w:sz="4" w:val="single" w:color="000000"/>
@@ -2674,7 +3385,7 @@
         </w:trPr>
         <w:tc>
           <w:tcPr>
-            <w:tcW w:type="dxa" w:w="1584"/>
+            <w:tcW w:type="dxa" w:w="1872"/>
             <w:tcBorders>
               <w:top w:sz="4" w:val="single" w:color="000000"/>
               <w:left w:sz="4" w:val="single" w:color="000000"/>
@@ -2694,91 +3405,13 @@
                 <w:i w:val="0"/>
                 <w:sz w:val="20"/>
               </w:rPr>
-              <w:t>n8n (n.d.) — template workflow: Wazuh ke VirusTotal dengan alert Slack</w:t>
+              <w:t>n8n (n.d.)</w:t>
             </w:r>
           </w:p>
         </w:tc>
         <w:tc>
           <w:tcPr>
-            <w:tcW w:type="dxa" w:w="1267"/>
-            <w:tcBorders>
-              <w:top w:sz="4" w:val="single" w:color="000000"/>
-              <w:left w:sz="4" w:val="single" w:color="000000"/>
-              <w:bottom w:sz="4" w:val="single" w:color="000000"/>
-              <w:right w:sz="4" w:val="single" w:color="000000"/>
-            </w:tcBorders>
-          </w:tcPr>
-          <w:p>
-            <w:pPr>
-              <w:spacing w:line="360" w:lineRule="auto" w:before="0" w:after="0"/>
-            </w:pPr>
-            <w:r/>
-            <w:r>
-              <w:rPr>
-                <w:rFonts w:ascii="Times New Roman" w:hAnsi="Times New Roman" w:eastAsia="Times New Roman"/>
-                <w:b w:val="0"/>
-                <w:i w:val="0"/>
-                <w:sz w:val="20"/>
-              </w:rPr>
-              <w:t>Notifikasi deteksi file berbahaya ke Slack</w:t>
-            </w:r>
-          </w:p>
-        </w:tc>
-        <w:tc>
-          <w:tcPr>
-            <w:tcW w:type="dxa" w:w="1267"/>
-            <w:tcBorders>
-              <w:top w:sz="4" w:val="single" w:color="000000"/>
-              <w:left w:sz="4" w:val="single" w:color="000000"/>
-              <w:bottom w:sz="4" w:val="single" w:color="000000"/>
-              <w:right w:sz="4" w:val="single" w:color="000000"/>
-            </w:tcBorders>
-          </w:tcPr>
-          <w:p>
-            <w:pPr>
-              <w:spacing w:line="360" w:lineRule="auto" w:before="0" w:after="0"/>
-            </w:pPr>
-            <w:r/>
-            <w:r>
-              <w:rPr>
-                <w:rFonts w:ascii="Times New Roman" w:hAnsi="Times New Roman" w:eastAsia="Times New Roman"/>
-                <w:b w:val="0"/>
-                <w:i w:val="0"/>
-                <w:sz w:val="20"/>
-              </w:rPr>
-              <w:t>Template workflow n8n dengan VirusTotal</w:t>
-            </w:r>
-          </w:p>
-        </w:tc>
-        <w:tc>
-          <w:tcPr>
-            <w:tcW w:type="dxa" w:w="1325"/>
-            <w:tcBorders>
-              <w:top w:sz="4" w:val="single" w:color="000000"/>
-              <w:left w:sz="4" w:val="single" w:color="000000"/>
-              <w:bottom w:sz="4" w:val="single" w:color="000000"/>
-              <w:right w:sz="4" w:val="single" w:color="000000"/>
-            </w:tcBorders>
-          </w:tcPr>
-          <w:p>
-            <w:pPr>
-              <w:spacing w:line="360" w:lineRule="auto" w:before="0" w:after="0"/>
-            </w:pPr>
-            <w:r/>
-            <w:r>
-              <w:rPr>
-                <w:rFonts w:ascii="Times New Roman" w:hAnsi="Times New Roman" w:eastAsia="Times New Roman"/>
-                <w:b w:val="0"/>
-                <w:i w:val="0"/>
-                <w:sz w:val="20"/>
-              </w:rPr>
-              <w:t>Notifikasi Slack satu arah; tanpa mitigasi</w:t>
-            </w:r>
-          </w:p>
-        </w:tc>
-        <w:tc>
-          <w:tcPr>
-            <w:tcW w:type="dxa" w:w="1354"/>
+            <w:tcW w:type="dxa" w:w="3197"/>
             <w:tcBorders>
               <w:top w:sz="4" w:val="single" w:color="000000"/>
               <w:left w:sz="4" w:val="single" w:color="000000"/>
@@ -2804,7 +3437,7 @@
         </w:tc>
         <w:tc>
           <w:tcPr>
-            <w:tcW w:type="dxa" w:w="1469"/>
+            <w:tcW w:type="dxa" w:w="3197"/>
             <w:tcBorders>
               <w:top w:sz="4" w:val="single" w:color="000000"/>
               <w:left w:sz="4" w:val="single" w:color="000000"/>
@@ -2835,7 +3468,7 @@
         </w:trPr>
         <w:tc>
           <w:tcPr>
-            <w:tcW w:type="dxa" w:w="1584"/>
+            <w:tcW w:type="dxa" w:w="1872"/>
             <w:tcBorders>
               <w:top w:sz="4" w:val="single" w:color="000000"/>
               <w:left w:sz="4" w:val="single" w:color="000000"/>
@@ -2855,91 +3488,13 @@
                 <w:i w:val="0"/>
                 <w:sz w:val="20"/>
               </w:rPr>
-              <w:t>Nadig &amp; Vignesh (2026) — peningkatan Wazuh SIEM melalui integrasi SOAR untuk respons otomatis</w:t>
+              <w:t>Nadig &amp; Vignesh (2026)</w:t>
             </w:r>
           </w:p>
         </w:tc>
         <w:tc>
           <w:tcPr>
-            <w:tcW w:type="dxa" w:w="1267"/>
-            <w:tcBorders>
-              <w:top w:sz="4" w:val="single" w:color="000000"/>
-              <w:left w:sz="4" w:val="single" w:color="000000"/>
-              <w:bottom w:sz="4" w:val="single" w:color="000000"/>
-              <w:right w:sz="4" w:val="single" w:color="000000"/>
-            </w:tcBorders>
-          </w:tcPr>
-          <w:p>
-            <w:pPr>
-              <w:spacing w:line="360" w:lineRule="auto" w:before="0" w:after="0"/>
-            </w:pPr>
-            <w:r/>
-            <w:r>
-              <w:rPr>
-                <w:rFonts w:ascii="Times New Roman" w:hAnsi="Times New Roman" w:eastAsia="Times New Roman"/>
-                <w:b w:val="0"/>
-                <w:i w:val="0"/>
-                <w:sz w:val="20"/>
-              </w:rPr>
-              <w:t>Respons ancaman otomatis melalui integrasi SOAR</w:t>
-            </w:r>
-          </w:p>
-        </w:tc>
-        <w:tc>
-          <w:tcPr>
-            <w:tcW w:type="dxa" w:w="1267"/>
-            <w:tcBorders>
-              <w:top w:sz="4" w:val="single" w:color="000000"/>
-              <w:left w:sz="4" w:val="single" w:color="000000"/>
-              <w:bottom w:sz="4" w:val="single" w:color="000000"/>
-              <w:right w:sz="4" w:val="single" w:color="000000"/>
-            </w:tcBorders>
-          </w:tcPr>
-          <w:p>
-            <w:pPr>
-              <w:spacing w:line="360" w:lineRule="auto" w:before="0" w:after="0"/>
-            </w:pPr>
-            <w:r/>
-            <w:r>
-              <w:rPr>
-                <w:rFonts w:ascii="Times New Roman" w:hAnsi="Times New Roman" w:eastAsia="Times New Roman"/>
-                <w:b w:val="0"/>
-                <w:i w:val="0"/>
-                <w:sz w:val="20"/>
-              </w:rPr>
-              <w:t>Integrasi Wazuh dengan SOAR; respons otomatis</w:t>
-            </w:r>
-          </w:p>
-        </w:tc>
-        <w:tc>
-          <w:tcPr>
-            <w:tcW w:type="dxa" w:w="1325"/>
-            <w:tcBorders>
-              <w:top w:sz="4" w:val="single" w:color="000000"/>
-              <w:left w:sz="4" w:val="single" w:color="000000"/>
-              <w:bottom w:sz="4" w:val="single" w:color="000000"/>
-              <w:right w:sz="4" w:val="single" w:color="000000"/>
-            </w:tcBorders>
-          </w:tcPr>
-          <w:p>
-            <w:pPr>
-              <w:spacing w:line="360" w:lineRule="auto" w:before="0" w:after="0"/>
-            </w:pPr>
-            <w:r/>
-            <w:r>
-              <w:rPr>
-                <w:rFonts w:ascii="Times New Roman" w:hAnsi="Times New Roman" w:eastAsia="Times New Roman"/>
-                <w:b w:val="0"/>
-                <w:i w:val="0"/>
-                <w:sz w:val="20"/>
-              </w:rPr>
-              <w:t>Respons otomatis; tanpa keterlibatan analis</w:t>
-            </w:r>
-          </w:p>
-        </w:tc>
-        <w:tc>
-          <w:tcPr>
-            <w:tcW w:type="dxa" w:w="1354"/>
+            <w:tcW w:type="dxa" w:w="3197"/>
             <w:tcBorders>
               <w:top w:sz="4" w:val="single" w:color="000000"/>
               <w:left w:sz="4" w:val="single" w:color="000000"/>
@@ -2965,7 +3520,7 @@
         </w:tc>
         <w:tc>
           <w:tcPr>
-            <w:tcW w:type="dxa" w:w="1469"/>
+            <w:tcW w:type="dxa" w:w="3197"/>
             <w:tcBorders>
               <w:top w:sz="4" w:val="single" w:color="000000"/>
               <w:left w:sz="4" w:val="single" w:color="000000"/>
@@ -2996,7 +3551,7 @@
         </w:trPr>
         <w:tc>
           <w:tcPr>
-            <w:tcW w:type="dxa" w:w="1584"/>
+            <w:tcW w:type="dxa" w:w="1872"/>
             <w:tcBorders>
               <w:top w:sz="4" w:val="single" w:color="000000"/>
               <w:left w:sz="4" w:val="single" w:color="000000"/>
@@ -3016,91 +3571,13 @@
                 <w:i w:val="0"/>
                 <w:sz w:val="20"/>
               </w:rPr>
-              <w:t>Alves dkk. (2026) — Wazuh untuk deteksi insiden: perancangan dan implementasi</w:t>
+              <w:t>Alves dkk. (2026)</w:t>
             </w:r>
           </w:p>
         </w:tc>
         <w:tc>
           <w:tcPr>
-            <w:tcW w:type="dxa" w:w="1267"/>
-            <w:tcBorders>
-              <w:top w:sz="4" w:val="single" w:color="000000"/>
-              <w:left w:sz="4" w:val="single" w:color="000000"/>
-              <w:bottom w:sz="4" w:val="single" w:color="000000"/>
-              <w:right w:sz="4" w:val="single" w:color="000000"/>
-            </w:tcBorders>
-          </w:tcPr>
-          <w:p>
-            <w:pPr>
-              <w:spacing w:line="360" w:lineRule="auto" w:before="0" w:after="0"/>
-            </w:pPr>
-            <w:r/>
-            <w:r>
-              <w:rPr>
-                <w:rFonts w:ascii="Times New Roman" w:hAnsi="Times New Roman" w:eastAsia="Times New Roman"/>
-                <w:b w:val="0"/>
-                <w:i w:val="0"/>
-                <w:sz w:val="20"/>
-              </w:rPr>
-              <w:t>Perancangan dan implementasi deteksi insiden berbasis Wazuh</w:t>
-            </w:r>
-          </w:p>
-        </w:tc>
-        <w:tc>
-          <w:tcPr>
-            <w:tcW w:type="dxa" w:w="1267"/>
-            <w:tcBorders>
-              <w:top w:sz="4" w:val="single" w:color="000000"/>
-              <w:left w:sz="4" w:val="single" w:color="000000"/>
-              <w:bottom w:sz="4" w:val="single" w:color="000000"/>
-              <w:right w:sz="4" w:val="single" w:color="000000"/>
-            </w:tcBorders>
-          </w:tcPr>
-          <w:p>
-            <w:pPr>
-              <w:spacing w:line="360" w:lineRule="auto" w:before="0" w:after="0"/>
-            </w:pPr>
-            <w:r/>
-            <w:r>
-              <w:rPr>
-                <w:rFonts w:ascii="Times New Roman" w:hAnsi="Times New Roman" w:eastAsia="Times New Roman"/>
-                <w:b w:val="0"/>
-                <w:i w:val="0"/>
-                <w:sz w:val="20"/>
-              </w:rPr>
-              <w:t>Deteksi dan korelasi insiden pada Wazuh</w:t>
-            </w:r>
-          </w:p>
-        </w:tc>
-        <w:tc>
-          <w:tcPr>
-            <w:tcW w:type="dxa" w:w="1325"/>
-            <w:tcBorders>
-              <w:top w:sz="4" w:val="single" w:color="000000"/>
-              <w:left w:sz="4" w:val="single" w:color="000000"/>
-              <w:bottom w:sz="4" w:val="single" w:color="000000"/>
-              <w:right w:sz="4" w:val="single" w:color="000000"/>
-            </w:tcBorders>
-          </w:tcPr>
-          <w:p>
-            <w:pPr>
-              <w:spacing w:line="360" w:lineRule="auto" w:before="0" w:after="0"/>
-            </w:pPr>
-            <w:r/>
-            <w:r>
-              <w:rPr>
-                <w:rFonts w:ascii="Times New Roman" w:hAnsi="Times New Roman" w:eastAsia="Times New Roman"/>
-                <w:b w:val="0"/>
-                <w:i w:val="0"/>
-                <w:sz w:val="20"/>
-              </w:rPr>
-              <w:t>Berorientasi deteksi; minim otomatisasi respons</w:t>
-            </w:r>
-          </w:p>
-        </w:tc>
-        <w:tc>
-          <w:tcPr>
-            <w:tcW w:type="dxa" w:w="1354"/>
+            <w:tcW w:type="dxa" w:w="3197"/>
             <w:tcBorders>
               <w:top w:sz="4" w:val="single" w:color="000000"/>
               <w:left w:sz="4" w:val="single" w:color="000000"/>
@@ -3126,7 +3603,7 @@
         </w:tc>
         <w:tc>
           <w:tcPr>
-            <w:tcW w:type="dxa" w:w="1469"/>
+            <w:tcW w:type="dxa" w:w="3197"/>
             <w:tcBorders>
               <w:top w:sz="4" w:val="single" w:color="000000"/>
               <w:left w:sz="4" w:val="single" w:color="000000"/>
@@ -3157,7 +3634,7 @@
         </w:trPr>
         <w:tc>
           <w:tcPr>
-            <w:tcW w:type="dxa" w:w="1584"/>
+            <w:tcW w:type="dxa" w:w="1872"/>
             <w:tcBorders>
               <w:top w:sz="4" w:val="single" w:color="000000"/>
               <w:left w:sz="4" w:val="single" w:color="000000"/>
@@ -3177,91 +3654,13 @@
                 <w:i w:val="0"/>
                 <w:sz w:val="20"/>
               </w:rPr>
-              <w:t>Raed (2025) — SOC bertenaga AI: Wazuh, n8n, Claude AI, dan MCP</w:t>
+              <w:t>Raed (2025)</w:t>
             </w:r>
           </w:p>
         </w:tc>
         <w:tc>
           <w:tcPr>
-            <w:tcW w:type="dxa" w:w="1267"/>
-            <w:tcBorders>
-              <w:top w:sz="4" w:val="single" w:color="000000"/>
-              <w:left w:sz="4" w:val="single" w:color="000000"/>
-              <w:bottom w:sz="4" w:val="single" w:color="000000"/>
-              <w:right w:sz="4" w:val="single" w:color="000000"/>
-            </w:tcBorders>
-          </w:tcPr>
-          <w:p>
-            <w:pPr>
-              <w:spacing w:line="360" w:lineRule="auto" w:before="0" w:after="0"/>
-            </w:pPr>
-            <w:r/>
-            <w:r>
-              <w:rPr>
-                <w:rFonts w:ascii="Times New Roman" w:hAnsi="Times New Roman" w:eastAsia="Times New Roman"/>
-                <w:b w:val="0"/>
-                <w:i w:val="0"/>
-                <w:sz w:val="20"/>
-              </w:rPr>
-              <w:t>SOC end-to-end dari deteksi hingga respons dengan bantuan AI</w:t>
-            </w:r>
-          </w:p>
-        </w:tc>
-        <w:tc>
-          <w:tcPr>
-            <w:tcW w:type="dxa" w:w="1267"/>
-            <w:tcBorders>
-              <w:top w:sz="4" w:val="single" w:color="000000"/>
-              <w:left w:sz="4" w:val="single" w:color="000000"/>
-              <w:bottom w:sz="4" w:val="single" w:color="000000"/>
-              <w:right w:sz="4" w:val="single" w:color="000000"/>
-            </w:tcBorders>
-          </w:tcPr>
-          <w:p>
-            <w:pPr>
-              <w:spacing w:line="360" w:lineRule="auto" w:before="0" w:after="0"/>
-            </w:pPr>
-            <w:r/>
-            <w:r>
-              <w:rPr>
-                <w:rFonts w:ascii="Times New Roman" w:hAnsi="Times New Roman" w:eastAsia="Times New Roman"/>
-                <w:b w:val="0"/>
-                <w:i w:val="0"/>
-                <w:sz w:val="20"/>
-              </w:rPr>
-              <w:t>Orkestrasi n8n dengan LLM Claude berbasis cloud (via MCP)</w:t>
-            </w:r>
-          </w:p>
-        </w:tc>
-        <w:tc>
-          <w:tcPr>
-            <w:tcW w:type="dxa" w:w="1325"/>
-            <w:tcBorders>
-              <w:top w:sz="4" w:val="single" w:color="000000"/>
-              <w:left w:sz="4" w:val="single" w:color="000000"/>
-              <w:bottom w:sz="4" w:val="single" w:color="000000"/>
-              <w:right w:sz="4" w:val="single" w:color="000000"/>
-            </w:tcBorders>
-          </w:tcPr>
-          <w:p>
-            <w:pPr>
-              <w:spacing w:line="360" w:lineRule="auto" w:before="0" w:after="0"/>
-            </w:pPr>
-            <w:r/>
-            <w:r>
-              <w:rPr>
-                <w:rFonts w:ascii="Times New Roman" w:hAnsi="Times New Roman" w:eastAsia="Times New Roman"/>
-                <w:b w:val="0"/>
-                <w:i w:val="0"/>
-                <w:sz w:val="20"/>
-              </w:rPr>
-              <w:t>Respons dibantu AI; tanpa kanal keputusan dua arah</w:t>
-            </w:r>
-          </w:p>
-        </w:tc>
-        <w:tc>
-          <w:tcPr>
-            <w:tcW w:type="dxa" w:w="1354"/>
+            <w:tcW w:type="dxa" w:w="3197"/>
             <w:tcBorders>
               <w:top w:sz="4" w:val="single" w:color="000000"/>
               <w:left w:sz="4" w:val="single" w:color="000000"/>
@@ -3287,7 +3686,7 @@
         </w:tc>
         <w:tc>
           <w:tcPr>
-            <w:tcW w:type="dxa" w:w="1469"/>
+            <w:tcW w:type="dxa" w:w="3197"/>
             <w:tcBorders>
               <w:top w:sz="4" w:val="single" w:color="000000"/>
               <w:left w:sz="4" w:val="single" w:color="000000"/>
@@ -3318,7 +3717,7 @@
         </w:trPr>
         <w:tc>
           <w:tcPr>
-            <w:tcW w:type="dxa" w:w="1584"/>
+            <w:tcW w:type="dxa" w:w="1872"/>
             <w:tcBorders>
               <w:top w:sz="4" w:val="single" w:color="000000"/>
               <w:left w:sz="4" w:val="single" w:color="000000"/>
@@ -3338,91 +3737,13 @@
                 <w:i w:val="0"/>
                 <w:sz w:val="20"/>
               </w:rPr>
-              <w:t>zhadyz (2025) — AI_SOC: SOC open-source berbasis LLM multi-agent (Ollama, Wazuh, TheHive, RAG)</w:t>
+              <w:t>zhadyz (2025)</w:t>
             </w:r>
           </w:p>
         </w:tc>
         <w:tc>
           <w:tcPr>
-            <w:tcW w:type="dxa" w:w="1267"/>
-            <w:tcBorders>
-              <w:top w:sz="4" w:val="single" w:color="000000"/>
-              <w:left w:sz="4" w:val="single" w:color="000000"/>
-              <w:bottom w:sz="4" w:val="single" w:color="000000"/>
-              <w:right w:sz="4" w:val="single" w:color="000000"/>
-            </w:tcBorders>
-          </w:tcPr>
-          <w:p>
-            <w:pPr>
-              <w:spacing w:line="360" w:lineRule="auto" w:before="0" w:after="0"/>
-            </w:pPr>
-            <w:r/>
-            <w:r>
-              <w:rPr>
-                <w:rFonts w:ascii="Times New Roman" w:hAnsi="Times New Roman" w:eastAsia="Times New Roman"/>
-                <w:b w:val="0"/>
-                <w:i w:val="0"/>
-                <w:sz w:val="20"/>
-              </w:rPr>
-              <w:t>SOC open-source dengan LLM multi-agent dan AI lokal</w:t>
-            </w:r>
-          </w:p>
-        </w:tc>
-        <w:tc>
-          <w:tcPr>
-            <w:tcW w:type="dxa" w:w="1267"/>
-            <w:tcBorders>
-              <w:top w:sz="4" w:val="single" w:color="000000"/>
-              <w:left w:sz="4" w:val="single" w:color="000000"/>
-              <w:bottom w:sz="4" w:val="single" w:color="000000"/>
-              <w:right w:sz="4" w:val="single" w:color="000000"/>
-            </w:tcBorders>
-          </w:tcPr>
-          <w:p>
-            <w:pPr>
-              <w:spacing w:line="360" w:lineRule="auto" w:before="0" w:after="0"/>
-            </w:pPr>
-            <w:r/>
-            <w:r>
-              <w:rPr>
-                <w:rFonts w:ascii="Times New Roman" w:hAnsi="Times New Roman" w:eastAsia="Times New Roman"/>
-                <w:b w:val="0"/>
-                <w:i w:val="0"/>
-                <w:sz w:val="20"/>
-              </w:rPr>
-              <w:t>LLM multi-agent, Ollama, Wazuh, dan TheHive</w:t>
-            </w:r>
-          </w:p>
-        </w:tc>
-        <w:tc>
-          <w:tcPr>
-            <w:tcW w:type="dxa" w:w="1325"/>
-            <w:tcBorders>
-              <w:top w:sz="4" w:val="single" w:color="000000"/>
-              <w:left w:sz="4" w:val="single" w:color="000000"/>
-              <w:bottom w:sz="4" w:val="single" w:color="000000"/>
-              <w:right w:sz="4" w:val="single" w:color="000000"/>
-            </w:tcBorders>
-          </w:tcPr>
-          <w:p>
-            <w:pPr>
-              <w:spacing w:line="360" w:lineRule="auto" w:before="0" w:after="0"/>
-            </w:pPr>
-            <w:r/>
-            <w:r>
-              <w:rPr>
-                <w:rFonts w:ascii="Times New Roman" w:hAnsi="Times New Roman" w:eastAsia="Times New Roman"/>
-                <w:b w:val="0"/>
-                <w:i w:val="0"/>
-                <w:sz w:val="20"/>
-              </w:rPr>
-              <w:t>Triase berbasis TheHive; tanpa mitigasi dua arah via chat</w:t>
-            </w:r>
-          </w:p>
-        </w:tc>
-        <w:tc>
-          <w:tcPr>
-            <w:tcW w:type="dxa" w:w="1354"/>
+            <w:tcW w:type="dxa" w:w="3197"/>
             <w:tcBorders>
               <w:top w:sz="4" w:val="single" w:color="000000"/>
               <w:left w:sz="4" w:val="single" w:color="000000"/>
@@ -3448,7 +3769,7 @@
         </w:tc>
         <w:tc>
           <w:tcPr>
-            <w:tcW w:type="dxa" w:w="1469"/>
+            <w:tcW w:type="dxa" w:w="3197"/>
             <w:tcBorders>
               <w:top w:sz="4" w:val="single" w:color="000000"/>
               <w:left w:sz="4" w:val="single" w:color="000000"/>
@@ -3474,27 +3795,6 @@
         </w:tc>
       </w:tr>
     </w:tbl>
-    <w:p>
-      <w:pPr>
-        <w:spacing w:after="120"/>
-      </w:pPr>
-    </w:p>
-    <w:p>
-      <w:pPr>
-        <w:spacing w:line="360" w:lineRule="auto" w:before="0" w:after="0"/>
-        <w:ind w:firstLine="850"/>
-        <w:jc w:val="both"/>
-      </w:pPr>
-      <w:r>
-        <w:rPr>
-          <w:rFonts w:ascii="Times New Roman" w:hAnsi="Times New Roman" w:eastAsia="Times New Roman"/>
-          <w:b w:val="0"/>
-          <w:i w:val="0"/>
-          <w:sz w:val="24"/>
-        </w:rPr>
-        <w:t>Sebagaimana terlihat pada kolom Proyek Saya di Tabel 3, setiap kesenjangan pada penelitian dan implementasi terdahulu ditutup oleh kontribusi yang diusulkan. Kombinasi kelima aspek pembeda tersebut belum ditemukan secara bersamaan pada karya sebelumnya sehingga menjadi kebaruan utama proyek ini.</w:t>
-      </w:r>
-    </w:p>
     <w:p>
       <w:pPr>
         <w:spacing w:after="0"/>

</xml_diff>

<commit_message>
docs(proposal): hindari em dash, ganti pemisah kolom Sumber jadi titik dua
</commit_message>
<xml_diff>
--- a/proposal/Usulan Ide_2305551076_Ravi Arnan Irianto.docx
+++ b/proposal/Usulan Ide_2305551076_Ravi Arnan Irianto.docx
@@ -2155,7 +2155,7 @@
                 <w:i w:val="0"/>
                 <w:sz w:val="20"/>
               </w:rPr>
-              <w:t>Thakker dkk. (2025) — pertahanan otomatis serangan application-layer pada Windows (Wazuh dan Shuffle)</w:t>
+              <w:t>Thakker dkk. (2025): pertahanan otomatis serangan application-layer pada Windows (Wazuh dan Shuffle)</w:t>
             </w:r>
           </w:p>
         </w:tc>
@@ -2264,7 +2264,7 @@
                 <w:i w:val="0"/>
                 <w:sz w:val="20"/>
               </w:rPr>
-              <w:t>Farrel (2024) — SIEM Wazuh dengan Active Response dan notifikasi Telegram untuk brute force</w:t>
+              <w:t>Farrel (2024): SIEM Wazuh dengan Active Response dan notifikasi Telegram untuk brute force</w:t>
             </w:r>
           </w:p>
         </w:tc>
@@ -2373,7 +2373,7 @@
                 <w:i w:val="0"/>
                 <w:sz w:val="20"/>
               </w:rPr>
-              <w:t>Sarker (2025) — otomasi SOC: Wazuh, n8n, VirusTotal, dan Gmail untuk deteksi file berbahaya</w:t>
+              <w:t>Sarker (2025): otomasi SOC: Wazuh, n8n, VirusTotal, dan Gmail untuk deteksi file berbahaya</w:t>
             </w:r>
           </w:p>
         </w:tc>
@@ -2482,7 +2482,7 @@
                 <w:i w:val="0"/>
                 <w:sz w:val="20"/>
               </w:rPr>
-              <w:t>n8n (n.d.) — template workflow: Wazuh ke VirusTotal dengan alert Slack</w:t>
+              <w:t>n8n (n.d.): template workflow: Wazuh ke VirusTotal dengan alert Slack</w:t>
             </w:r>
           </w:p>
         </w:tc>
@@ -2591,7 +2591,7 @@
                 <w:i w:val="0"/>
                 <w:sz w:val="20"/>
               </w:rPr>
-              <w:t>Nadig &amp; Vignesh (2026) — peningkatan Wazuh SIEM melalui integrasi SOAR untuk respons otomatis</w:t>
+              <w:t>Nadig &amp; Vignesh (2026): peningkatan Wazuh SIEM melalui integrasi SOAR untuk respons otomatis</w:t>
             </w:r>
           </w:p>
         </w:tc>
@@ -2700,7 +2700,7 @@
                 <w:i w:val="0"/>
                 <w:sz w:val="20"/>
               </w:rPr>
-              <w:t>Alves dkk. (2026) — Wazuh untuk deteksi insiden: perancangan dan implementasi</w:t>
+              <w:t>Alves dkk. (2026): Wazuh untuk deteksi insiden: perancangan dan implementasi</w:t>
             </w:r>
           </w:p>
         </w:tc>
@@ -2809,7 +2809,7 @@
                 <w:i w:val="0"/>
                 <w:sz w:val="20"/>
               </w:rPr>
-              <w:t>Raed (2025) — SOC bertenaga AI: Wazuh, n8n, Claude AI, dan MCP</w:t>
+              <w:t>Raed (2025): SOC bertenaga AI: Wazuh, n8n, Claude AI, dan MCP</w:t>
             </w:r>
           </w:p>
         </w:tc>
@@ -2918,7 +2918,7 @@
                 <w:i w:val="0"/>
                 <w:sz w:val="20"/>
               </w:rPr>
-              <w:t>zhadyz (2025) — AI_SOC: SOC open-source berbasis LLM multi-agent (Ollama, Wazuh, TheHive, RAG)</w:t>
+              <w:t>zhadyz (2025): AI_SOC: SOC open-source berbasis LLM multi-agent (Ollama, Wazuh, TheHive, RAG)</w:t>
             </w:r>
           </w:p>
         </w:tc>

</xml_diff>

<commit_message>
feat(deploy): hardened compose stack, ansible play, and health monitor
Add deploy/hardened (Caddy in front of the n8n editor with basic auth and
internal-CA TLS) and deploy/ansible for the integration rollout.
scripts/health-monitor.py polls n8n, Wazuh, and Ollama and alerts over
Telegram.

.env.example documents every secret the stack reads so nothing is hardcoded
in source or compose. Regenerates the proposal PDF and DOCX.
</commit_message>
<xml_diff>
--- a/proposal/Usulan Ide_2305551076_Ravi Arnan Irianto.docx
+++ b/proposal/Usulan Ide_2305551076_Ravi Arnan Irianto.docx
@@ -354,6 +354,18 @@
                 <w:sz w:val="24"/>
               </w:rPr>
               <w:t>1. Ir. I Nyoman Piarsa, ST., MT., IPM.</w:t>
+            </w:r>
+            <w:r>
+              <w:br/>
+            </w:r>
+            <w:r>
+              <w:rPr>
+                <w:rFonts w:ascii="Times New Roman" w:hAnsi="Times New Roman" w:eastAsia="Times New Roman"/>
+                <w:b w:val="0"/>
+                <w:i w:val="0"/>
+                <w:sz w:val="24"/>
+              </w:rPr>
+              <w:t>2. A.A. Kt Agung Cahyawan Wiranatha, S.T., M.T.</w:t>
             </w:r>
           </w:p>
         </w:tc>
@@ -3854,6 +3866,64 @@
       </w:r>
     </w:p>
     <w:p>
+      <w:pPr>
+        <w:spacing w:after="0"/>
+      </w:pPr>
+    </w:p>
+    <w:p>
+      <w:pPr>
+        <w:spacing w:after="0"/>
+      </w:pPr>
+    </w:p>
+    <w:p>
+      <w:pPr>
+        <w:spacing w:line="360" w:lineRule="auto" w:before="0" w:after="0"/>
+      </w:pPr>
+      <w:r>
+        <w:rPr>
+          <w:rFonts w:ascii="Times New Roman" w:hAnsi="Times New Roman" w:eastAsia="Times New Roman"/>
+          <w:b w:val="0"/>
+          <w:i w:val="0"/>
+          <w:sz w:val="24"/>
+        </w:rPr>
+        <w:t>Calon Pembimbing 2,</w:t>
+      </w:r>
+    </w:p>
+    <w:p>
+      <w:pPr>
+        <w:spacing w:after="0"/>
+      </w:pPr>
+    </w:p>
+    <w:p>
+      <w:pPr>
+        <w:spacing w:after="0"/>
+      </w:pPr>
+    </w:p>
+    <w:p>
+      <w:pPr>
+        <w:spacing w:after="0"/>
+      </w:pPr>
+    </w:p>
+    <w:p>
+      <w:pPr>
+        <w:spacing w:after="0"/>
+      </w:pPr>
+    </w:p>
+    <w:p>
+      <w:pPr>
+        <w:spacing w:line="360" w:lineRule="auto" w:before="0" w:after="0"/>
+      </w:pPr>
+      <w:r>
+        <w:rPr>
+          <w:rFonts w:ascii="Times New Roman" w:hAnsi="Times New Roman" w:eastAsia="Times New Roman"/>
+          <w:b w:val="0"/>
+          <w:i w:val="0"/>
+          <w:sz w:val="24"/>
+        </w:rPr>
+        <w:t>(A.A. Kt Agung Cahyawan Wiranatha, S.T., M.T.)</w:t>
+      </w:r>
+    </w:p>
+    <w:p>
       <w:r>
         <w:br w:type="page"/>
       </w:r>

</xml_diff>